<commit_message>
doc: added pdf file of Chapter 01
</commit_message>
<xml_diff>
--- a/documentation/srs/1-introduction/srs_ch1_introduction.docx
+++ b/documentation/srs/1-introduction/srs_ch1_introduction.docx
@@ -169,7 +169,7 @@
         <w:rPr>
           <w:sz w:val="24"/>
         </w:rPr>
-        <w:t>June</w:t>
+        <w:t>OCT</w:t>
       </w:r>
       <w:r>
         <w:rPr>
@@ -300,7 +300,37 @@
         <w:rPr>
           <w:sz w:val="24"/>
         </w:rPr>
-        <w:t>Ehtisham Fahad Khan Muhammad Abbas</w:t>
+        <w:t xml:space="preserve">Ehtisham </w:t>
+      </w:r>
+    </w:p>
+    <w:p>
+      <w:pPr>
+        <w:ind w:left="3872" w:right="4231" w:firstLine="2"/>
+        <w:jc w:val="center"/>
+        <w:rPr>
+          <w:sz w:val="24"/>
+        </w:rPr>
+      </w:pPr>
+      <w:r>
+        <w:rPr>
+          <w:sz w:val="24"/>
+        </w:rPr>
+        <w:t>Muhammad Abbas</w:t>
+      </w:r>
+    </w:p>
+    <w:p>
+      <w:pPr>
+        <w:ind w:left="3872" w:right="4231" w:firstLine="2"/>
+        <w:jc w:val="center"/>
+        <w:rPr>
+          <w:sz w:val="24"/>
+        </w:rPr>
+      </w:pPr>
+      <w:r>
+        <w:rPr>
+          <w:sz w:val="24"/>
+        </w:rPr>
+        <w:t xml:space="preserve">Fahad Khan </w:t>
       </w:r>
     </w:p>
     <w:p>
@@ -1923,15 +1953,7 @@
         <w:t xml:space="preserve"> </w:t>
       </w:r>
       <w:r>
-        <w:t xml:space="preserve">environments like elephants, lions, wolves, dogs etc. These animals are very important because they </w:t>
-      </w:r>
-      <w:proofErr w:type="gramStart"/>
-      <w:r>
-        <w:t>helps</w:t>
-      </w:r>
-      <w:proofErr w:type="gramEnd"/>
-      <w:r>
-        <w:t xml:space="preserve"> to maintain the</w:t>
+        <w:t>environments like elephants, lions, wolves, dogs etc. These animals are very important because they helps to maintain the</w:t>
       </w:r>
       <w:r>
         <w:rPr>
@@ -2911,15 +2933,7 @@
         <w:jc w:val="both"/>
       </w:pPr>
       <w:r>
-        <w:t xml:space="preserve">No Standard Format: Data is stored in different formats like Excel files, PDF reports, handwritten notes etc. </w:t>
-      </w:r>
-      <w:proofErr w:type="gramStart"/>
-      <w:r>
-        <w:t>we</w:t>
-      </w:r>
-      <w:proofErr w:type="gramEnd"/>
-      <w:r>
-        <w:t xml:space="preserve"> are making it impossible to combine or compare across </w:t>
+        <w:t xml:space="preserve">No Standard Format: Data is stored in different formats like Excel files, PDF reports, handwritten notes etc. we are making it impossible to combine or compare across </w:t>
       </w:r>
       <w:r>
         <w:rPr>
@@ -3177,15 +3191,7 @@
         <w:t xml:space="preserve"> </w:t>
       </w:r>
       <w:r>
-        <w:t xml:space="preserve">data independently because they do not know it already exists elsewhere. Which </w:t>
-      </w:r>
-      <w:proofErr w:type="gramStart"/>
-      <w:r>
-        <w:t>waste</w:t>
-      </w:r>
-      <w:proofErr w:type="gramEnd"/>
-      <w:r>
-        <w:t xml:space="preserve"> their </w:t>
+        <w:t xml:space="preserve">data independently because they do not know it already exists elsewhere. Which waste their </w:t>
       </w:r>
       <w:r>
         <w:rPr>
@@ -3365,15 +3371,7 @@
         <w:t xml:space="preserve"> </w:t>
       </w:r>
       <w:r>
-        <w:t xml:space="preserve">problems Researchers may collect same data repeatedly because they don’t know it already exists. </w:t>
-      </w:r>
-      <w:proofErr w:type="gramStart"/>
-      <w:r>
-        <w:t>And also</w:t>
-      </w:r>
-      <w:proofErr w:type="gramEnd"/>
-      <w:r>
-        <w:t>, the most important information can be missed, and govt agencies may take decisions without complete or accurate data.</w:t>
+        <w:t>problems Researchers may collect same data repeatedly because they don’t know it already exists. And also, the most important information can be missed, and govt agencies may take decisions without complete or accurate data.</w:t>
       </w:r>
     </w:p>
     <w:p>
@@ -3481,11 +3479,9 @@
         </w:rPr>
         <w:t xml:space="preserve"> </w:t>
       </w:r>
-      <w:proofErr w:type="gramStart"/>
       <w:r>
         <w:t>API</w:t>
       </w:r>
-      <w:proofErr w:type="gramEnd"/>
       <w:r>
         <w:rPr>
           <w:spacing w:val="-6"/>
@@ -3875,11 +3871,9 @@
         </w:rPr>
         <w:t xml:space="preserve"> </w:t>
       </w:r>
-      <w:proofErr w:type="gramStart"/>
       <w:r>
         <w:t>manages</w:t>
       </w:r>
-      <w:proofErr w:type="gramEnd"/>
       <w:r>
         <w:rPr>
           <w:spacing w:val="-3"/>
@@ -4708,15 +4702,7 @@
         <w:t xml:space="preserve"> </w:t>
       </w:r>
       <w:r>
-        <w:t xml:space="preserve">animal movements. But this may be </w:t>
-      </w:r>
-      <w:proofErr w:type="gramStart"/>
-      <w:r>
-        <w:t>a future plan</w:t>
-      </w:r>
-      <w:proofErr w:type="gramEnd"/>
-      <w:r>
-        <w:t xml:space="preserve"> in version 2.0 extension</w:t>
+        <w:t>animal movements. But this may be a future plan in version 2.0 extension</w:t>
       </w:r>
     </w:p>
     <w:p>
@@ -4965,11 +4951,9 @@
         </w:rPr>
         <w:t xml:space="preserve"> </w:t>
       </w:r>
-      <w:proofErr w:type="gramStart"/>
       <w:r>
         <w:t>animal</w:t>
       </w:r>
-      <w:proofErr w:type="gramEnd"/>
       <w:r>
         <w:rPr>
           <w:spacing w:val="19"/>
@@ -5298,13 +5282,8 @@
         </w:rPr>
         <w:t xml:space="preserve"> </w:t>
       </w:r>
-      <w:proofErr w:type="gramStart"/>
-      <w:r>
-        <w:t>It’s</w:t>
-      </w:r>
-      <w:proofErr w:type="gramEnd"/>
-      <w:r>
-        <w:t xml:space="preserve"> mainly focuses on ecological and animal data.</w:t>
+      <w:r>
+        <w:t>It’s mainly focuses on ecological and animal data.</w:t>
       </w:r>
     </w:p>
     <w:p>
@@ -7620,21 +7599,12 @@
               </w:rPr>
               <w:t xml:space="preserve"> </w:t>
             </w:r>
-            <w:proofErr w:type="spellStart"/>
             <w:r>
               <w:rPr>
                 <w:spacing w:val="-2"/>
                 <w:sz w:val="20"/>
               </w:rPr>
-              <w:t>DigitalOcean</w:t>
-            </w:r>
-            <w:proofErr w:type="spellEnd"/>
-            <w:r>
-              <w:rPr>
-                <w:spacing w:val="-2"/>
-                <w:sz w:val="20"/>
-              </w:rPr>
-              <w:t>)</w:t>
+              <w:t>DigitalOcean)</w:t>
             </w:r>
           </w:p>
         </w:tc>
@@ -8935,7 +8905,6 @@
           <w:b/>
         </w:rPr>
       </w:pPr>
-      <w:proofErr w:type="gramStart"/>
       <w:r>
         <w:rPr>
           <w:rFonts w:ascii="Arial"/>
@@ -8957,16 +8926,7 @@
           <w:b/>
           <w:spacing w:val="-5"/>
         </w:rPr>
-        <w:t>Do</w:t>
-      </w:r>
-      <w:proofErr w:type="gramEnd"/>
-      <w:r>
-        <w:rPr>
-          <w:rFonts w:ascii="Arial"/>
-          <w:b/>
-          <w:spacing w:val="-5"/>
-        </w:rPr>
-        <w:t>:</w:t>
+        <w:t>Do:</w:t>
       </w:r>
       <w:r>
         <w:rPr>
@@ -9481,7 +9441,7 @@
         </mc:Choice>
         <mc:Fallback>
           <w:pict>
-            <v:shape w14:anchorId="0D029E45" id="Graphic 3" o:spid="_x0000_s1026" style="position:absolute;margin-left:70.6pt;margin-top:744.35pt;width:470.95pt;height:.5pt;z-index:-15900672;visibility:visible;mso-wrap-style:square;mso-wrap-distance-left:0;mso-wrap-distance-top:0;mso-wrap-distance-right:0;mso-wrap-distance-bottom:0;mso-position-horizontal:absolute;mso-position-horizontal-relative:page;mso-position-vertical:absolute;mso-position-vertical-relative:page;v-text-anchor:top" coordsize="5981065,6350" o:gfxdata="UEsDBBQABgAIAAAAIQC2gziS/gAAAOEBAAATAAAAW0NvbnRlbnRfVHlwZXNdLnhtbJSRQU7DMBBF&#10;90jcwfIWJU67QAgl6YK0S0CoHGBkTxKLZGx5TGhvj5O2G0SRWNoz/78nu9wcxkFMGNg6quQqL6RA&#10;0s5Y6ir5vt9lD1JwBDIwOMJKHpHlpr69KfdHjyxSmriSfYz+USnWPY7AufNIadK6MEJMx9ApD/oD&#10;OlTrorhX2lFEilmcO2RdNtjC5xDF9pCuTyYBB5bi6bQ4syoJ3g9WQ0ymaiLzg5KdCXlKLjvcW893&#10;SUOqXwnz5DrgnHtJTxOsQfEKIT7DmDSUCaxw7Rqn8787ZsmRM9e2VmPeBN4uqYvTtW7jvijg9N/y&#10;JsXecLq0q+WD6m8AAAD//wMAUEsDBBQABgAIAAAAIQA4/SH/1gAAAJQBAAALAAAAX3JlbHMvLnJl&#10;bHOkkMFqwzAMhu+DvYPRfXGawxijTi+j0GvpHsDYimMaW0Yy2fr2M4PBMnrbUb/Q94l/f/hMi1qR&#10;JVI2sOt6UJgd+ZiDgffL8ekFlFSbvV0oo4EbChzGx4f9GRdb25HMsYhqlCwG5lrLq9biZkxWOiqY&#10;22YiTra2kYMu1l1tQD30/bPm3wwYN0x18gb45AdQl1tp5j/sFB2T0FQ7R0nTNEV3j6o9feQzro1i&#10;OWA14Fm+Q8a1a8+Bvu/d/dMb2JY5uiPbhG/ktn4cqGU/er3pcvwCAAD//wMAUEsDBBQABgAIAAAA&#10;IQC9X+9CIgIAAL0EAAAOAAAAZHJzL2Uyb0RvYy54bWysVMFu2zAMvQ/YPwi6L3YyJGuNOMXWoMOA&#10;oivQDDsrshwbk01NVGLn70fJlmtspw27SJT5RD0+kt7e9Y1mF2Wxhjbny0XKmWolFHV7yvm3w8O7&#10;G87QibYQGlqV86tCfrd7+2bbmUytoAJdKMsoSItZZ3JeOWeyJEFZqUbgAoxqyVmCbYSjoz0lhRUd&#10;RW90skrTTdKBLYwFqRDp635w8l2IX5ZKuq9licoxnXPi5sJqw3r0a7LbiuxkhalqOdIQ/8CiEXVL&#10;j06h9sIJdrb1H6GaWlpAKN1CQpNAWdZShRwom2X6WzYvlTAq5ELioJlkwv8XVj5dXsyz9dTRPIL8&#10;gaRI0hnMJo8/4IjpS9t4LBFnfVDxOqmoesckfVzf3izTzZozSb7N+3UQORFZvCvP6D4rCHHE5RHd&#10;UIMiWqKKluzbaFqqpK+hDjV0nFENLWdUw+NQQyOcv+fJeZN1MyLVyMM7G7ioAwSY8ylMbGMixPQV&#10;o9s5lhpohoq+uJsQb8Bs0tu150XBojvuA2z+7F+Bo5oxnNSAanjJ5x2enLSg5+dqI+i6eKi19umj&#10;PR3vtWUXQbKu9h/WnzYj4xksdMJQfN8GRyiuz5Z1NC85x59nYRVn+ktLDemHKxo2GsdoWKfvIYxg&#10;UN6iO/TfhTXMkJlzR73zBLHdRRbbgvh7wID1N1v4eHZQ1r5nAreB0XigGQn5j/Psh3B+DqjXv87u&#10;FwAAAP//AwBQSwMEFAAGAAgAAAAhAMebASLhAAAADgEAAA8AAABkcnMvZG93bnJldi54bWxMj0FP&#10;wzAMhe9I/IfISFzQlrZjWylNJ4Q0TRwZ48DNbU1T0Tilybbu35NygZuf/fT8vXwzmk6caHCtZQXx&#10;PAJBXNm65UbB4W07S0E4j1xjZ5kUXMjBpri+yjGr7Zlf6bT3jQgh7DJUoL3vMyldpcmgm9ueONw+&#10;7WDQBzk0sh7wHMJNJ5MoWkmDLYcPGnt61lR97Y9GwWr7TZfFsryzS53gzo4ffvf+otTtzfj0CMLT&#10;6P/MMOEHdCgCU2mPXDvRBX0fJ8E6DWm6BjFZonQRgyh/dw9rkEUu/9cofgAAAP//AwBQSwECLQAU&#10;AAYACAAAACEAtoM4kv4AAADhAQAAEwAAAAAAAAAAAAAAAAAAAAAAW0NvbnRlbnRfVHlwZXNdLnht&#10;bFBLAQItABQABgAIAAAAIQA4/SH/1gAAAJQBAAALAAAAAAAAAAAAAAAAAC8BAABfcmVscy8ucmVs&#10;c1BLAQItABQABgAIAAAAIQC9X+9CIgIAAL0EAAAOAAAAAAAAAAAAAAAAAC4CAABkcnMvZTJvRG9j&#10;LnhtbFBLAQItABQABgAIAAAAIQDHmwEi4QAAAA4BAAAPAAAAAAAAAAAAAAAAAHwEAABkcnMvZG93&#10;bnJldi54bWxQSwUGAAAAAAQABADzAAAAigUAAAAA&#10;" path="m5981065,l,,,6095r5981065,l5981065,xe" fillcolor="#2d75b6" stroked="f">
+            <v:shape w14:anchorId="21AEC590" id="Graphic 3" o:spid="_x0000_s1026" style="position:absolute;margin-left:70.6pt;margin-top:744.35pt;width:470.95pt;height:.5pt;z-index:-15900672;visibility:visible;mso-wrap-style:square;mso-wrap-distance-left:0;mso-wrap-distance-top:0;mso-wrap-distance-right:0;mso-wrap-distance-bottom:0;mso-position-horizontal:absolute;mso-position-horizontal-relative:page;mso-position-vertical:absolute;mso-position-vertical-relative:page;v-text-anchor:top" coordsize="5981065,6350" o:gfxdata="UEsDBBQABgAIAAAAIQC2gziS/gAAAOEBAAATAAAAW0NvbnRlbnRfVHlwZXNdLnhtbJSRQU7DMBBF&#10;90jcwfIWJU67QAgl6YK0S0CoHGBkTxKLZGx5TGhvj5O2G0SRWNoz/78nu9wcxkFMGNg6quQqL6RA&#10;0s5Y6ir5vt9lD1JwBDIwOMJKHpHlpr69KfdHjyxSmriSfYz+USnWPY7AufNIadK6MEJMx9ApD/oD&#10;OlTrorhX2lFEilmcO2RdNtjC5xDF9pCuTyYBB5bi6bQ4syoJ3g9WQ0ymaiLzg5KdCXlKLjvcW893&#10;SUOqXwnz5DrgnHtJTxOsQfEKIT7DmDSUCaxw7Rqn8787ZsmRM9e2VmPeBN4uqYvTtW7jvijg9N/y&#10;JsXecLq0q+WD6m8AAAD//wMAUEsDBBQABgAIAAAAIQA4/SH/1gAAAJQBAAALAAAAX3JlbHMvLnJl&#10;bHOkkMFqwzAMhu+DvYPRfXGawxijTi+j0GvpHsDYimMaW0Yy2fr2M4PBMnrbUb/Q94l/f/hMi1qR&#10;JVI2sOt6UJgd+ZiDgffL8ekFlFSbvV0oo4EbChzGx4f9GRdb25HMsYhqlCwG5lrLq9biZkxWOiqY&#10;22YiTra2kYMu1l1tQD30/bPm3wwYN0x18gb45AdQl1tp5j/sFB2T0FQ7R0nTNEV3j6o9feQzro1i&#10;OWA14Fm+Q8a1a8+Bvu/d/dMb2JY5uiPbhG/ktn4cqGU/er3pcvwCAAD//wMAUEsDBBQABgAIAAAA&#10;IQC9X+9CIgIAAL0EAAAOAAAAZHJzL2Uyb0RvYy54bWysVMFu2zAMvQ/YPwi6L3YyJGuNOMXWoMOA&#10;oivQDDsrshwbk01NVGLn70fJlmtspw27SJT5RD0+kt7e9Y1mF2Wxhjbny0XKmWolFHV7yvm3w8O7&#10;G87QibYQGlqV86tCfrd7+2bbmUytoAJdKMsoSItZZ3JeOWeyJEFZqUbgAoxqyVmCbYSjoz0lhRUd&#10;RW90skrTTdKBLYwFqRDp635w8l2IX5ZKuq9licoxnXPi5sJqw3r0a7LbiuxkhalqOdIQ/8CiEXVL&#10;j06h9sIJdrb1H6GaWlpAKN1CQpNAWdZShRwom2X6WzYvlTAq5ELioJlkwv8XVj5dXsyz9dTRPIL8&#10;gaRI0hnMJo8/4IjpS9t4LBFnfVDxOqmoesckfVzf3izTzZozSb7N+3UQORFZvCvP6D4rCHHE5RHd&#10;UIMiWqKKluzbaFqqpK+hDjV0nFENLWdUw+NQQyOcv+fJeZN1MyLVyMM7G7ioAwSY8ylMbGMixPQV&#10;o9s5lhpohoq+uJsQb8Bs0tu150XBojvuA2z+7F+Bo5oxnNSAanjJ5x2enLSg5+dqI+i6eKi19umj&#10;PR3vtWUXQbKu9h/WnzYj4xksdMJQfN8GRyiuz5Z1NC85x59nYRVn+ktLDemHKxo2GsdoWKfvIYxg&#10;UN6iO/TfhTXMkJlzR73zBLHdRRbbgvh7wID1N1v4eHZQ1r5nAreB0XigGQn5j/Psh3B+DqjXv87u&#10;FwAAAP//AwBQSwMEFAAGAAgAAAAhAMebASLhAAAADgEAAA8AAABkcnMvZG93bnJldi54bWxMj0FP&#10;wzAMhe9I/IfISFzQlrZjWylNJ4Q0TRwZ48DNbU1T0Tilybbu35NygZuf/fT8vXwzmk6caHCtZQXx&#10;PAJBXNm65UbB4W07S0E4j1xjZ5kUXMjBpri+yjGr7Zlf6bT3jQgh7DJUoL3vMyldpcmgm9ueONw+&#10;7WDQBzk0sh7wHMJNJ5MoWkmDLYcPGnt61lR97Y9GwWr7TZfFsryzS53gzo4ffvf+otTtzfj0CMLT&#10;6P/MMOEHdCgCU2mPXDvRBX0fJ8E6DWm6BjFZonQRgyh/dw9rkEUu/9cofgAAAP//AwBQSwECLQAU&#10;AAYACAAAACEAtoM4kv4AAADhAQAAEwAAAAAAAAAAAAAAAAAAAAAAW0NvbnRlbnRfVHlwZXNdLnht&#10;bFBLAQItABQABgAIAAAAIQA4/SH/1gAAAJQBAAALAAAAAAAAAAAAAAAAAC8BAABfcmVscy8ucmVs&#10;c1BLAQItABQABgAIAAAAIQC9X+9CIgIAAL0EAAAOAAAAAAAAAAAAAAAAAC4CAABkcnMvZTJvRG9j&#10;LnhtbFBLAQItABQABgAIAAAAIQDHmwEi4QAAAA4BAAAPAAAAAAAAAAAAAAAAAHwEAABkcnMvZG93&#10;bnJldi54bWxQSwUGAAAAAAQABADzAAAAigUAAAAA&#10;" path="m5981065,l,,,6095r5981065,l5981065,xe" fillcolor="#2d75b6" stroked="f">
               <v:path arrowok="t"/>
               <w10:wrap anchorx="page" anchory="page"/>
             </v:shape>
@@ -9817,7 +9777,7 @@
         </mc:Choice>
         <mc:Fallback>
           <w:pict>
-            <v:shape w14:anchorId="0132E9BD" id="Graphic 1" o:spid="_x0000_s1026" style="position:absolute;margin-left:70.6pt;margin-top:47.3pt;width:470.95pt;height:.5pt;z-index:-15901696;visibility:visible;mso-wrap-style:square;mso-wrap-distance-left:0;mso-wrap-distance-top:0;mso-wrap-distance-right:0;mso-wrap-distance-bottom:0;mso-position-horizontal:absolute;mso-position-horizontal-relative:page;mso-position-vertical:absolute;mso-position-vertical-relative:page;v-text-anchor:top" coordsize="5981065,6350" o:gfxdata="UEsDBBQABgAIAAAAIQC2gziS/gAAAOEBAAATAAAAW0NvbnRlbnRfVHlwZXNdLnhtbJSRQU7DMBBF&#10;90jcwfIWJU67QAgl6YK0S0CoHGBkTxKLZGx5TGhvj5O2G0SRWNoz/78nu9wcxkFMGNg6quQqL6RA&#10;0s5Y6ir5vt9lD1JwBDIwOMJKHpHlpr69KfdHjyxSmriSfYz+USnWPY7AufNIadK6MEJMx9ApD/oD&#10;OlTrorhX2lFEilmcO2RdNtjC5xDF9pCuTyYBB5bi6bQ4syoJ3g9WQ0ymaiLzg5KdCXlKLjvcW893&#10;SUOqXwnz5DrgnHtJTxOsQfEKIT7DmDSUCaxw7Rqn8787ZsmRM9e2VmPeBN4uqYvTtW7jvijg9N/y&#10;JsXecLq0q+WD6m8AAAD//wMAUEsDBBQABgAIAAAAIQA4/SH/1gAAAJQBAAALAAAAX3JlbHMvLnJl&#10;bHOkkMFqwzAMhu+DvYPRfXGawxijTi+j0GvpHsDYimMaW0Yy2fr2M4PBMnrbUb/Q94l/f/hMi1qR&#10;JVI2sOt6UJgd+ZiDgffL8ekFlFSbvV0oo4EbChzGx4f9GRdb25HMsYhqlCwG5lrLq9biZkxWOiqY&#10;22YiTra2kYMu1l1tQD30/bPm3wwYN0x18gb45AdQl1tp5j/sFB2T0FQ7R0nTNEV3j6o9feQzro1i&#10;OWA14Fm+Q8a1a8+Bvu/d/dMb2JY5uiPbhG/ktn4cqGU/er3pcvwCAAD//wMAUEsDBBQABgAIAAAA&#10;IQDzb1bbIAIAAL0EAAAOAAAAZHJzL2Uyb0RvYy54bWysVMFu2zAMvQ/YPwi6L3YyJGuNOMXWoMOA&#10;oivQDDsrshwbk0VNVOLk70fJkWtspw27SJT5RD0+kl7fnTvNTsphC6bk81nOmTISqtYcSv5t9/Du&#10;hjP0wlRCg1Elvyjkd5u3b9a9LdQCGtCVcoyCGCx6W/LGe1tkGcpGdQJnYJUhZw2uE56O7pBVTvQU&#10;vdPZIs9XWQ+usg6kQqSv28HJNzF+XSvpv9Y1Ks90yYmbj6uL6z6s2WYtioMTtmnllYb4BxadaA09&#10;OobaCi/Y0bV/hOpa6QCh9jMJXQZ13UoVc6Bs5vlv2bw0wqqYC4mDdpQJ/19Y+XR6sc8uUEf7CPIH&#10;kiJZb7EYPeGAV8y5dl3AEnF2jipeRhXV2TNJH5e3N/N8teRMkm/1fhlFzkSR7soj+s8KYhxxekQ/&#10;1KBKlmiSJc8mmY4qGWqoYw09Z1RDxxnVcD/U0Aof7gVywWT9hEhz5RGcHZzUDiLMhxRGtikRYvqK&#10;0WaKpQaaoJIv7TbGGzCr/HYVeFGw5E77AJs++1fgpGYKJzWgGl4KeccnRy3o+anaCLqtHlqtQ/ro&#10;Dvt77dhJkKyL7Yflp8R4AoudMBQ/tMEeqsuzYz3NS8nx51E4xZn+Yqghw3AlwyVjnwzn9T3EEYzK&#10;O/S783fhLLNkltxT7zxBandRpLYg/gEwYMNNAx+PHuo29EzkNjC6HmhGYv7XeQ5DOD1H1OtfZ/ML&#10;AAD//wMAUEsDBBQABgAIAAAAIQD8N6R73gAAAAoBAAAPAAAAZHJzL2Rvd25yZXYueG1sTI/BTsMw&#10;DIbvSLxDZCQuiKXt1mqUphNCmiaODDhwSxvTVDROabKte3u8Exx/+9Pvz9VmdoM44hR6TwrSRQIC&#10;qfWmp07B+9v2fg0iRE1GD55QwRkDbOrrq0qXxp/oFY/72AkuoVBqBTbGsZQytBadDgs/IvHuy09O&#10;R45TJ82kT1zuBpklSSGd7okvWD3is8X2e39wCortD56XeXPnc5vpnZ8/4+7jRanbm/npEUTEOf7B&#10;cNFndajZqfEHMkEMnFdpxqiCh1UB4gIk62UKouFJXoCsK/n/hfoXAAD//wMAUEsBAi0AFAAGAAgA&#10;AAAhALaDOJL+AAAA4QEAABMAAAAAAAAAAAAAAAAAAAAAAFtDb250ZW50X1R5cGVzXS54bWxQSwEC&#10;LQAUAAYACAAAACEAOP0h/9YAAACUAQAACwAAAAAAAAAAAAAAAAAvAQAAX3JlbHMvLnJlbHNQSwEC&#10;LQAUAAYACAAAACEA829W2yACAAC9BAAADgAAAAAAAAAAAAAAAAAuAgAAZHJzL2Uyb0RvYy54bWxQ&#10;SwECLQAUAAYACAAAACEA/Deke94AAAAKAQAADwAAAAAAAAAAAAAAAAB6BAAAZHJzL2Rvd25yZXYu&#10;eG1sUEsFBgAAAAAEAAQA8wAAAIUFAAAAAA==&#10;" path="m5981065,l,,,6096r5981065,l5981065,xe" fillcolor="#2d75b6" stroked="f">
+            <v:shape w14:anchorId="60BE0610" id="Graphic 1" o:spid="_x0000_s1026" style="position:absolute;margin-left:70.6pt;margin-top:47.3pt;width:470.95pt;height:.5pt;z-index:-15901696;visibility:visible;mso-wrap-style:square;mso-wrap-distance-left:0;mso-wrap-distance-top:0;mso-wrap-distance-right:0;mso-wrap-distance-bottom:0;mso-position-horizontal:absolute;mso-position-horizontal-relative:page;mso-position-vertical:absolute;mso-position-vertical-relative:page;v-text-anchor:top" coordsize="5981065,6350" o:gfxdata="UEsDBBQABgAIAAAAIQC2gziS/gAAAOEBAAATAAAAW0NvbnRlbnRfVHlwZXNdLnhtbJSRQU7DMBBF&#10;90jcwfIWJU67QAgl6YK0S0CoHGBkTxKLZGx5TGhvj5O2G0SRWNoz/78nu9wcxkFMGNg6quQqL6RA&#10;0s5Y6ir5vt9lD1JwBDIwOMJKHpHlpr69KfdHjyxSmriSfYz+USnWPY7AufNIadK6MEJMx9ApD/oD&#10;OlTrorhX2lFEilmcO2RdNtjC5xDF9pCuTyYBB5bi6bQ4syoJ3g9WQ0ymaiLzg5KdCXlKLjvcW893&#10;SUOqXwnz5DrgnHtJTxOsQfEKIT7DmDSUCaxw7Rqn8787ZsmRM9e2VmPeBN4uqYvTtW7jvijg9N/y&#10;JsXecLq0q+WD6m8AAAD//wMAUEsDBBQABgAIAAAAIQA4/SH/1gAAAJQBAAALAAAAX3JlbHMvLnJl&#10;bHOkkMFqwzAMhu+DvYPRfXGawxijTi+j0GvpHsDYimMaW0Yy2fr2M4PBMnrbUb/Q94l/f/hMi1qR&#10;JVI2sOt6UJgd+ZiDgffL8ekFlFSbvV0oo4EbChzGx4f9GRdb25HMsYhqlCwG5lrLq9biZkxWOiqY&#10;22YiTra2kYMu1l1tQD30/bPm3wwYN0x18gb45AdQl1tp5j/sFB2T0FQ7R0nTNEV3j6o9feQzro1i&#10;OWA14Fm+Q8a1a8+Bvu/d/dMb2JY5uiPbhG/ktn4cqGU/er3pcvwCAAD//wMAUEsDBBQABgAIAAAA&#10;IQDzb1bbIAIAAL0EAAAOAAAAZHJzL2Uyb0RvYy54bWysVMFu2zAMvQ/YPwi6L3YyJGuNOMXWoMOA&#10;oivQDDsrshwbk0VNVOLk70fJkWtspw27SJT5RD0+kl7fnTvNTsphC6bk81nOmTISqtYcSv5t9/Du&#10;hjP0wlRCg1Elvyjkd5u3b9a9LdQCGtCVcoyCGCx6W/LGe1tkGcpGdQJnYJUhZw2uE56O7pBVTvQU&#10;vdPZIs9XWQ+usg6kQqSv28HJNzF+XSvpv9Y1Ks90yYmbj6uL6z6s2WYtioMTtmnllYb4BxadaA09&#10;OobaCi/Y0bV/hOpa6QCh9jMJXQZ13UoVc6Bs5vlv2bw0wqqYC4mDdpQJ/19Y+XR6sc8uUEf7CPIH&#10;kiJZb7EYPeGAV8y5dl3AEnF2jipeRhXV2TNJH5e3N/N8teRMkm/1fhlFzkSR7soj+s8KYhxxekQ/&#10;1KBKlmiSJc8mmY4qGWqoYw09Z1RDxxnVcD/U0Aof7gVywWT9hEhz5RGcHZzUDiLMhxRGtikRYvqK&#10;0WaKpQaaoJIv7TbGGzCr/HYVeFGw5E77AJs++1fgpGYKJzWgGl4KeccnRy3o+anaCLqtHlqtQ/ro&#10;Dvt77dhJkKyL7Yflp8R4AoudMBQ/tMEeqsuzYz3NS8nx51E4xZn+Yqghw3AlwyVjnwzn9T3EEYzK&#10;O/S783fhLLNkltxT7zxBandRpLYg/gEwYMNNAx+PHuo29EzkNjC6HmhGYv7XeQ5DOD1H1OtfZ/ML&#10;AAD//wMAUEsDBBQABgAIAAAAIQD8N6R73gAAAAoBAAAPAAAAZHJzL2Rvd25yZXYueG1sTI/BTsMw&#10;DIbvSLxDZCQuiKXt1mqUphNCmiaODDhwSxvTVDROabKte3u8Exx/+9Pvz9VmdoM44hR6TwrSRQIC&#10;qfWmp07B+9v2fg0iRE1GD55QwRkDbOrrq0qXxp/oFY/72AkuoVBqBTbGsZQytBadDgs/IvHuy09O&#10;R45TJ82kT1zuBpklSSGd7okvWD3is8X2e39wCortD56XeXPnc5vpnZ8/4+7jRanbm/npEUTEOf7B&#10;cNFndajZqfEHMkEMnFdpxqiCh1UB4gIk62UKouFJXoCsK/n/hfoXAAD//wMAUEsBAi0AFAAGAAgA&#10;AAAhALaDOJL+AAAA4QEAABMAAAAAAAAAAAAAAAAAAAAAAFtDb250ZW50X1R5cGVzXS54bWxQSwEC&#10;LQAUAAYACAAAACEAOP0h/9YAAACUAQAACwAAAAAAAAAAAAAAAAAvAQAAX3JlbHMvLnJlbHNQSwEC&#10;LQAUAAYACAAAACEA829W2yACAAC9BAAADgAAAAAAAAAAAAAAAAAuAgAAZHJzL2Uyb0RvYy54bWxQ&#10;SwECLQAUAAYACAAAACEA/Deke94AAAAKAQAADwAAAAAAAAAAAAAAAAB6BAAAZHJzL2Rvd25yZXYu&#10;eG1sUEsFBgAAAAAEAAQA8wAAAIUFAAAAAA==&#10;" path="m5981065,l,,,6096r5981065,l5981065,xe" fillcolor="#2d75b6" stroked="f">
               <v:path arrowok="t"/>
               <w10:wrap anchorx="page" anchory="page"/>
             </v:shape>

</xml_diff>

<commit_message>
docs: Added new file chapter 1
</commit_message>
<xml_diff>
--- a/documentation/srs/1-introduction/srs_ch1_introduction.docx
+++ b/documentation/srs/1-introduction/srs_ch1_introduction.docx
@@ -532,7 +532,7 @@
               <w:t xml:space="preserve"> </w:t>
             </w:r>
             <w:r>
-              <w:t>&amp;</w:t>
+              <w:t>and</w:t>
             </w:r>
             <w:r>
               <w:rPr>
@@ -877,7 +877,7 @@
             <w:t xml:space="preserve"> </w:t>
           </w:r>
           <w:r>
-            <w:t>REQUIREMENTS</w:t>
+            <w:t>REQUIREMENT</w:t>
           </w:r>
           <w:r>
             <w:rPr>
@@ -889,10 +889,13 @@
             <w:rPr>
               <w:spacing w:val="-2"/>
             </w:rPr>
-            <w:t>SPECIFICATION</w:t>
-          </w:r>
-          <w:r>
-            <w:tab/>
+            <w:t>SPECIFICATIO</w:t>
+          </w:r>
+          <w:r>
+            <w:rPr>
+              <w:spacing w:val="-2"/>
+            </w:rPr>
+            <w:t>N…….</w:t>
           </w:r>
           <w:r>
             <w:rPr>
@@ -1077,9 +1080,17 @@
             <w:spacing w:before="1"/>
             <w:ind w:left="1807" w:hanging="367"/>
           </w:pPr>
-          <w:r>
-            <w:t>Non-Functional</w:t>
-          </w:r>
+          <w:proofErr w:type="gramStart"/>
+          <w:r>
+            <w:t>Non</w:t>
+          </w:r>
+          <w:r>
+            <w:t xml:space="preserve"> </w:t>
+          </w:r>
+          <w:r>
+            <w:t>Functional</w:t>
+          </w:r>
+          <w:proofErr w:type="gramEnd"/>
           <w:r>
             <w:rPr>
               <w:spacing w:val="-15"/>
@@ -1853,9 +1864,11 @@
         </w:rPr>
         <w:t xml:space="preserve"> </w:t>
       </w:r>
-      <w:r>
-        <w:t>animals</w:t>
-      </w:r>
+      <w:proofErr w:type="gramStart"/>
+      <w:r>
+        <w:t>animal</w:t>
+      </w:r>
+      <w:proofErr w:type="gramEnd"/>
       <w:r>
         <w:rPr>
           <w:spacing w:val="-14"/>
@@ -1875,6 +1888,9 @@
         <w:t>live</w:t>
       </w:r>
       <w:r>
+        <w:t>s</w:t>
+      </w:r>
+      <w:r>
         <w:rPr>
           <w:spacing w:val="-15"/>
         </w:rPr>
@@ -1920,6 +1936,9 @@
         <w:t>deserts</w:t>
       </w:r>
       <w:r>
+        <w:t>, local forms</w:t>
+      </w:r>
+      <w:r>
         <w:rPr>
           <w:spacing w:val="-14"/>
         </w:rPr>
@@ -1952,8 +1971,41 @@
         </w:rPr>
         <w:t xml:space="preserve"> </w:t>
       </w:r>
-      <w:r>
-        <w:t>environments like elephants, lions, wolves, dogs etc. These animals are very important because they helps to maintain the</w:t>
+      <w:proofErr w:type="gramStart"/>
+      <w:r>
+        <w:t>environment</w:t>
+      </w:r>
+      <w:proofErr w:type="gramEnd"/>
+      <w:r>
+        <w:t xml:space="preserve"> like elephants, lions, wolves, </w:t>
+      </w:r>
+      <w:proofErr w:type="gramStart"/>
+      <w:r>
+        <w:t>dogs</w:t>
+      </w:r>
+      <w:proofErr w:type="gramEnd"/>
+      <w:r>
+        <w:t xml:space="preserve"> </w:t>
+      </w:r>
+      <w:r>
+        <w:t>cows etc</w:t>
+      </w:r>
+      <w:r>
+        <w:t>. These animals are very important because they help to</w:t>
+      </w:r>
+      <w:r>
+        <w:t xml:space="preserve"> </w:t>
+      </w:r>
+      <w:proofErr w:type="gramStart"/>
+      <w:r>
+        <w:t>the</w:t>
+      </w:r>
+      <w:r>
+        <w:t xml:space="preserve"> maintain</w:t>
+      </w:r>
+      <w:proofErr w:type="gramEnd"/>
+      <w:r>
+        <w:t xml:space="preserve"> the</w:t>
       </w:r>
       <w:r>
         <w:rPr>
@@ -1980,12 +2032,14 @@
         <w:t xml:space="preserve"> </w:t>
       </w:r>
       <w:r>
-        <w:t>example: predators</w:t>
-      </w:r>
-      <w:r>
-        <w:rPr>
-          <w:spacing w:val="-1"/>
-        </w:rPr>
+        <w:t xml:space="preserve">example: </w:t>
+      </w:r>
+      <w:proofErr w:type="gramStart"/>
+      <w:r>
+        <w:t>predator</w:t>
+      </w:r>
+      <w:proofErr w:type="gramEnd"/>
+      <w:r>
         <w:t xml:space="preserve"> </w:t>
       </w:r>
       <w:r>
@@ -2142,7 +2196,31 @@
         <w:t xml:space="preserve"> </w:t>
       </w:r>
       <w:r>
-        <w:t>Now, much information about wildlife is collected around the world. This information includes Animal, population number, Movement and migration routes, Animal behavior, DNA and genetic information, Health and disease records. However, the data is stored in many different places. Different organizations, universities, researchers, and government departments collect data separately.</w:t>
+        <w:t>Now, much information about wildlife is collected around the world. This information includes Animal, population number, Movement</w:t>
+      </w:r>
+      <w:r>
+        <w:t>s</w:t>
+      </w:r>
+      <w:r>
+        <w:t xml:space="preserve"> and migration</w:t>
+      </w:r>
+      <w:r>
+        <w:t>s</w:t>
+      </w:r>
+      <w:r>
+        <w:t xml:space="preserve"> routes, Animal</w:t>
+      </w:r>
+      <w:r>
+        <w:t>’s</w:t>
+      </w:r>
+      <w:r>
+        <w:t xml:space="preserve"> behavior, DNA and genetic information, Health and disease records. However,</w:t>
+      </w:r>
+      <w:r>
+        <w:t xml:space="preserve"> and There will be real time simulations real time movements its health notification etc.</w:t>
+      </w:r>
+      <w:r>
+        <w:t xml:space="preserve"> the data is stored in many different places. Different organizations, universities, researchers, and government departments collect data separately.</w:t>
       </w:r>
       <w:r>
         <w:rPr>
@@ -2289,6 +2367,17 @@
       </w:pPr>
       <w:r>
         <w:t>To solve this problem, Our System the Wildlife Information System (WIS) is proposed. WIS is a centralized system that stores all wildlife data in one organized database. Users can easily access and share information through an API, making wildlife research and conservation more efficient.</w:t>
+      </w:r>
+      <w:r>
+        <w:t xml:space="preserve"> And shows the real time simulation of animals and health records. </w:t>
+      </w:r>
+      <w:proofErr w:type="gramStart"/>
+      <w:r>
+        <w:t>So</w:t>
+      </w:r>
+      <w:proofErr w:type="gramEnd"/>
+      <w:r>
+        <w:t xml:space="preserve"> Owner can quickly take step. </w:t>
       </w:r>
     </w:p>
     <w:p>
@@ -2345,12 +2434,14 @@
         <w:ind w:left="360"/>
       </w:pPr>
       <w:r>
-        <w:t>Currently,</w:t>
-      </w:r>
-      <w:r>
-        <w:rPr>
-          <w:spacing w:val="-3"/>
-        </w:rPr>
+        <w:t xml:space="preserve">Currently, the data </w:t>
+      </w:r>
+      <w:proofErr w:type="gramStart"/>
+      <w:r>
+        <w:t>of</w:t>
+      </w:r>
+      <w:proofErr w:type="gramEnd"/>
+      <w:r>
         <w:t xml:space="preserve"> </w:t>
       </w:r>
       <w:r>
@@ -2358,16 +2449,52 @@
       </w:r>
       <w:r>
         <w:rPr>
+          <w:spacing w:val="-7"/>
+        </w:rPr>
+        <w:t xml:space="preserve"> </w:t>
+      </w:r>
+      <w:r>
+        <w:t>in</w:t>
+      </w:r>
+      <w:r>
+        <w:rPr>
           <w:spacing w:val="-4"/>
         </w:rPr>
         <w:t xml:space="preserve"> </w:t>
       </w:r>
       <w:r>
-        <w:t>data</w:t>
-      </w:r>
-      <w:r>
-        <w:rPr>
-          <w:spacing w:val="-7"/>
+        <w:t>most</w:t>
+      </w:r>
+      <w:r>
+        <w:rPr>
+          <w:spacing w:val="-6"/>
+        </w:rPr>
+        <w:t xml:space="preserve"> </w:t>
+      </w:r>
+      <w:r>
+        <w:t>countries</w:t>
+      </w:r>
+      <w:r>
+        <w:rPr>
+          <w:spacing w:val="-4"/>
+        </w:rPr>
+        <w:t xml:space="preserve"> </w:t>
+      </w:r>
+      <w:r>
+        <w:t>is</w:t>
+      </w:r>
+      <w:r>
+        <w:rPr>
+          <w:spacing w:val="-6"/>
+        </w:rPr>
+        <w:t xml:space="preserve"> </w:t>
+      </w:r>
+      <w:r>
+        <w:t>managed</w:t>
+      </w:r>
+      <w:r>
+        <w:rPr>
+          <w:spacing w:val="-5"/>
         </w:rPr>
         <w:t xml:space="preserve"> </w:t>
       </w:r>
@@ -2380,8 +2507,12 @@
         </w:rPr>
         <w:t xml:space="preserve"> </w:t>
       </w:r>
-      <w:r>
-        <w:t>most</w:t>
+      <w:proofErr w:type="gramStart"/>
+      <w:r>
+        <w:rPr>
+          <w:spacing w:val="-4"/>
+        </w:rPr>
+        <w:t>these</w:t>
       </w:r>
       <w:r>
         <w:rPr>
@@ -2390,62 +2521,9 @@
         <w:t xml:space="preserve"> </w:t>
       </w:r>
       <w:r>
-        <w:t>countries</w:t>
-      </w:r>
-      <w:r>
-        <w:rPr>
-          <w:spacing w:val="-4"/>
-        </w:rPr>
-        <w:t xml:space="preserve"> </w:t>
-      </w:r>
-      <w:r>
-        <w:t>is</w:t>
-      </w:r>
-      <w:r>
-        <w:rPr>
-          <w:spacing w:val="-6"/>
-        </w:rPr>
-        <w:t xml:space="preserve"> </w:t>
-      </w:r>
-      <w:r>
-        <w:t>managed</w:t>
-      </w:r>
-      <w:r>
-        <w:rPr>
-          <w:spacing w:val="-5"/>
-        </w:rPr>
-        <w:t xml:space="preserve"> </w:t>
-      </w:r>
-      <w:r>
-        <w:t>in</w:t>
-      </w:r>
-      <w:r>
-        <w:rPr>
-          <w:spacing w:val="-4"/>
-        </w:rPr>
-        <w:t xml:space="preserve"> </w:t>
-      </w:r>
-      <w:r>
-        <w:t>one</w:t>
-      </w:r>
-      <w:r>
-        <w:rPr>
-          <w:spacing w:val="-4"/>
-        </w:rPr>
-        <w:t xml:space="preserve"> </w:t>
-      </w:r>
-      <w:r>
-        <w:t>of</w:t>
-      </w:r>
-      <w:r>
-        <w:rPr>
-          <w:spacing w:val="-6"/>
-        </w:rPr>
-        <w:t xml:space="preserve"> </w:t>
-      </w:r>
-      <w:r>
         <w:t>the</w:t>
       </w:r>
+      <w:proofErr w:type="gramEnd"/>
       <w:r>
         <w:rPr>
           <w:spacing w:val="-6"/>
@@ -2491,7 +2569,13 @@
         <w:t xml:space="preserve"> </w:t>
       </w:r>
       <w:r>
-        <w:t>maintain their own paper base or basic spreadsheet or excel file records of wildlife populations and incidents.</w:t>
+        <w:t>maintain their own paper base or basic spreadsheet</w:t>
+      </w:r>
+      <w:r>
+        <w:t xml:space="preserve">s </w:t>
+      </w:r>
+      <w:r>
+        <w:t>or excel file records of wildlife populations and incidents.</w:t>
       </w:r>
     </w:p>
     <w:p>
@@ -2631,21 +2715,15 @@
         <w:pStyle w:val="BodyText"/>
         <w:spacing w:before="80" w:line="244" w:lineRule="auto"/>
         <w:ind w:left="360" w:right="826"/>
-      </w:pPr>
-      <w:r>
-        <w:t>The major weakness of all these approaches is that they do not talk to each other. There is no standard system that collects, organizes, and shares wildlife data openly.</w:t>
-      </w:r>
-    </w:p>
-    <w:p>
-      <w:pPr>
-        <w:pStyle w:val="BodyText"/>
-        <w:spacing w:line="244" w:lineRule="auto"/>
         <w:sectPr>
           <w:pgSz w:w="12240" w:h="15840"/>
           <w:pgMar w:top="1340" w:right="720" w:bottom="860" w:left="1080" w:header="485" w:footer="633" w:gutter="0"/>
           <w:cols w:space="720"/>
         </w:sectPr>
       </w:pPr>
+      <w:r>
+        <w:t>The major weakness of all these approaches is that they do not talk to each other. There is no standard system that collects, organizes, and shares wildlife data openly.</w:t>
+      </w:r>
     </w:p>
     <w:p>
       <w:pPr>
@@ -2933,7 +3011,15 @@
         <w:jc w:val="both"/>
       </w:pPr>
       <w:r>
-        <w:t xml:space="preserve">No Standard Format: Data is stored in different formats like Excel files, PDF reports, handwritten notes etc. we are making it impossible to combine or compare across </w:t>
+        <w:t xml:space="preserve">No Standard Format: Data is stored in different formats like Excel files, PDF reports, handwritten notes etc. </w:t>
+      </w:r>
+      <w:proofErr w:type="gramStart"/>
+      <w:r>
+        <w:t>we</w:t>
+      </w:r>
+      <w:proofErr w:type="gramEnd"/>
+      <w:r>
+        <w:t xml:space="preserve"> are making it impossible to combine or compare across </w:t>
       </w:r>
       <w:r>
         <w:rPr>
@@ -3191,7 +3277,15 @@
         <w:t xml:space="preserve"> </w:t>
       </w:r>
       <w:r>
-        <w:t xml:space="preserve">data independently because they do not know it already exists elsewhere. Which waste their </w:t>
+        <w:t xml:space="preserve">data independently because they do not know it already exists elsewhere. Which </w:t>
+      </w:r>
+      <w:proofErr w:type="gramStart"/>
+      <w:r>
+        <w:t>waste</w:t>
+      </w:r>
+      <w:proofErr w:type="gramEnd"/>
+      <w:r>
+        <w:t xml:space="preserve"> their </w:t>
       </w:r>
       <w:r>
         <w:rPr>
@@ -3371,7 +3465,15 @@
         <w:t xml:space="preserve"> </w:t>
       </w:r>
       <w:r>
-        <w:t>problems Researchers may collect same data repeatedly because they don’t know it already exists. And also, the most important information can be missed, and govt agencies may take decisions without complete or accurate data.</w:t>
+        <w:t xml:space="preserve">problems Researchers may collect same data repeatedly because they don’t know it already exists. </w:t>
+      </w:r>
+      <w:proofErr w:type="gramStart"/>
+      <w:r>
+        <w:t>And also</w:t>
+      </w:r>
+      <w:proofErr w:type="gramEnd"/>
+      <w:r>
+        <w:t>, the most important information can be missed, and govt agencies may take decisions without complete or accurate data.</w:t>
       </w:r>
     </w:p>
     <w:p>
@@ -3479,9 +3581,11 @@
         </w:rPr>
         <w:t xml:space="preserve"> </w:t>
       </w:r>
+      <w:proofErr w:type="gramStart"/>
       <w:r>
         <w:t>API</w:t>
       </w:r>
+      <w:proofErr w:type="gramEnd"/>
       <w:r>
         <w:rPr>
           <w:spacing w:val="-6"/>
@@ -3871,9 +3975,11 @@
         </w:rPr>
         <w:t xml:space="preserve"> </w:t>
       </w:r>
+      <w:proofErr w:type="gramStart"/>
       <w:r>
         <w:t>manages</w:t>
       </w:r>
+      <w:proofErr w:type="gramEnd"/>
       <w:r>
         <w:rPr>
           <w:spacing w:val="-3"/>
@@ -4702,7 +4808,15 @@
         <w:t xml:space="preserve"> </w:t>
       </w:r>
       <w:r>
-        <w:t>animal movements. But this may be a future plan in version 2.0 extension</w:t>
+        <w:t xml:space="preserve">animal movements. But this may be </w:t>
+      </w:r>
+      <w:proofErr w:type="gramStart"/>
+      <w:r>
+        <w:t>a future plan</w:t>
+      </w:r>
+      <w:proofErr w:type="gramEnd"/>
+      <w:r>
+        <w:t xml:space="preserve"> in version 2.0 extension</w:t>
       </w:r>
     </w:p>
     <w:p>
@@ -4951,9 +5065,11 @@
         </w:rPr>
         <w:t xml:space="preserve"> </w:t>
       </w:r>
+      <w:proofErr w:type="gramStart"/>
       <w:r>
         <w:t>animal</w:t>
       </w:r>
+      <w:proofErr w:type="gramEnd"/>
       <w:r>
         <w:rPr>
           <w:spacing w:val="19"/>
@@ -5282,8 +5398,13 @@
         </w:rPr>
         <w:t xml:space="preserve"> </w:t>
       </w:r>
-      <w:r>
-        <w:t>It’s mainly focuses on ecological and animal data.</w:t>
+      <w:proofErr w:type="gramStart"/>
+      <w:r>
+        <w:t>It’s</w:t>
+      </w:r>
+      <w:proofErr w:type="gramEnd"/>
+      <w:r>
+        <w:t xml:space="preserve"> mainly focuses on ecological and animal data.</w:t>
       </w:r>
     </w:p>
     <w:p>
@@ -6687,12 +6808,14 @@
         <w:t xml:space="preserve"> </w:t>
       </w:r>
       <w:r>
-        <w:t>Discord</w:t>
-      </w:r>
-      <w:r>
-        <w:rPr>
-          <w:spacing w:val="-5"/>
-        </w:rPr>
+        <w:t xml:space="preserve">Physical </w:t>
+      </w:r>
+      <w:proofErr w:type="gramStart"/>
+      <w:r>
+        <w:t>meeting</w:t>
+      </w:r>
+      <w:proofErr w:type="gramEnd"/>
+      <w:r>
         <w:t xml:space="preserve"> </w:t>
       </w:r>
       <w:r>
@@ -7377,7 +7500,33 @@
               <w:rPr>
                 <w:sz w:val="20"/>
               </w:rPr>
-              <w:t>CSS,</w:t>
+              <w:t>CSS</w:t>
+            </w:r>
+            <w:r>
+              <w:rPr>
+                <w:sz w:val="20"/>
+              </w:rPr>
+              <w:t>(</w:t>
+            </w:r>
+            <w:proofErr w:type="spellStart"/>
+            <w:r>
+              <w:rPr>
+                <w:sz w:val="20"/>
+              </w:rPr>
+              <w:t>Tailwindcss</w:t>
+            </w:r>
+            <w:proofErr w:type="spellEnd"/>
+            <w:r>
+              <w:rPr>
+                <w:sz w:val="20"/>
+              </w:rPr>
+              <w:t>)</w:t>
+            </w:r>
+            <w:r>
+              <w:rPr>
+                <w:sz w:val="20"/>
+              </w:rPr>
+              <w:t>,</w:t>
             </w:r>
             <w:r>
               <w:rPr>
@@ -7393,6 +7542,22 @@
               </w:rPr>
               <w:t>JavaScript</w:t>
             </w:r>
+            <w:r>
+              <w:rPr>
+                <w:spacing w:val="-2"/>
+                <w:sz w:val="20"/>
+              </w:rPr>
+              <w:t xml:space="preserve">, </w:t>
+            </w:r>
+            <w:proofErr w:type="spellStart"/>
+            <w:r>
+              <w:rPr>
+                <w:spacing w:val="-2"/>
+                <w:sz w:val="20"/>
+              </w:rPr>
+              <w:t>Reactjs</w:t>
+            </w:r>
+            <w:proofErr w:type="spellEnd"/>
           </w:p>
         </w:tc>
       </w:tr>
@@ -7599,12 +7764,21 @@
               </w:rPr>
               <w:t xml:space="preserve"> </w:t>
             </w:r>
+            <w:proofErr w:type="spellStart"/>
             <w:r>
               <w:rPr>
                 <w:spacing w:val="-2"/>
                 <w:sz w:val="20"/>
               </w:rPr>
-              <w:t>DigitalOcean)</w:t>
+              <w:t>DigitalOcean</w:t>
+            </w:r>
+            <w:proofErr w:type="spellEnd"/>
+            <w:r>
+              <w:rPr>
+                <w:spacing w:val="-2"/>
+                <w:sz w:val="20"/>
+              </w:rPr>
+              <w:t>)</w:t>
             </w:r>
           </w:p>
         </w:tc>
@@ -7903,8 +8077,16 @@
         </w:rPr>
         <w:t xml:space="preserve"> </w:t>
       </w:r>
+      <w:proofErr w:type="gramStart"/>
       <w:r>
         <w:t>accurate,</w:t>
+      </w:r>
+      <w:r>
+        <w:t xml:space="preserve"> and</w:t>
+      </w:r>
+      <w:proofErr w:type="gramEnd"/>
+      <w:r>
+        <w:t xml:space="preserve"> do simulation to view real time movements and health status,</w:t>
       </w:r>
       <w:r>
         <w:rPr>
@@ -8308,10 +8490,47 @@
         <w:tab/>
       </w:r>
       <w:r>
-        <w:t>This project will follow an Agile development model. Agile is an iterative and incremental approach in which the system is developed through short development cycles called sprints. In each sprint, a specific set of features is planned, developed, tested, and reviewed. Feedback from each sprint can be used to improve the system and adjust the requirements for the next sprint</w:t>
-      </w:r>
-      <w:r>
-        <w:t>.</w:t>
+        <w:t>In this Project we will use DevOps practices for development, testing, integration and deployment. DevOps combines development and Operations to improve collaboration, automation</w:t>
+      </w:r>
+      <w:proofErr w:type="gramStart"/>
+      <w:r>
+        <w:t>, repetitive</w:t>
+      </w:r>
+      <w:proofErr w:type="gramEnd"/>
+      <w:r>
+        <w:t xml:space="preserve"> tasks. And maintain software quality and ensure system reliability, Version control, automated testing, continuous integration and deployment practices will be used. To manage code </w:t>
+      </w:r>
+      <w:proofErr w:type="gramStart"/>
+      <w:r>
+        <w:t>changes</w:t>
+      </w:r>
+      <w:proofErr w:type="gramEnd"/>
+      <w:r>
+        <w:t xml:space="preserve"> maintain stability. And We will use Model-View-Controller (MVC) architectural pattern to organize. </w:t>
+      </w:r>
+      <w:proofErr w:type="gramStart"/>
+      <w:r>
+        <w:t>Model</w:t>
+      </w:r>
+      <w:proofErr w:type="gramEnd"/>
+      <w:r>
+        <w:t xml:space="preserve"> manage app data and business logic. The View will provide UI where user Interact. And the controller will handle user </w:t>
+      </w:r>
+      <w:proofErr w:type="gramStart"/>
+      <w:r>
+        <w:t>request</w:t>
+      </w:r>
+      <w:proofErr w:type="gramEnd"/>
+      <w:r>
+        <w:t xml:space="preserve"> and coordinate communication between the model and view. </w:t>
+      </w:r>
+      <w:proofErr w:type="gramStart"/>
+      <w:r>
+        <w:t>The separate</w:t>
+      </w:r>
+      <w:proofErr w:type="gramEnd"/>
+      <w:r>
+        <w:t xml:space="preserve"> parts will make the system easier to develop, testing, and maintain and scaling/extend.</w:t>
       </w:r>
     </w:p>
     <w:p>
@@ -8321,376 +8540,6 @@
         </w:tabs>
         <w:spacing w:before="40"/>
       </w:pPr>
-    </w:p>
-    <w:tbl>
-      <w:tblPr>
-        <w:tblW w:w="0" w:type="auto"/>
-        <w:tblCellSpacing w:w="15" w:type="dxa"/>
-        <w:tblCellMar>
-          <w:top w:w="15" w:type="dxa"/>
-          <w:left w:w="15" w:type="dxa"/>
-          <w:bottom w:w="15" w:type="dxa"/>
-          <w:right w:w="15" w:type="dxa"/>
-        </w:tblCellMar>
-        <w:tblLook w:val="04A0" w:firstRow="1" w:lastRow="0" w:firstColumn="1" w:lastColumn="0" w:noHBand="0" w:noVBand="1"/>
-      </w:tblPr>
-      <w:tblGrid>
-        <w:gridCol w:w="1395"/>
-        <w:gridCol w:w="5020"/>
-        <w:gridCol w:w="4115"/>
-      </w:tblGrid>
-      <w:tr>
-        <w:trPr>
-          <w:tblHeader/>
-          <w:tblCellSpacing w:w="15" w:type="dxa"/>
-        </w:trPr>
-        <w:tc>
-          <w:tcPr>
-            <w:tcW w:w="1350" w:type="dxa"/>
-            <w:vAlign w:val="center"/>
-            <w:hideMark/>
-          </w:tcPr>
-          <w:p>
-            <w:pPr>
-              <w:tabs>
-                <w:tab w:val="left" w:pos="1404"/>
-              </w:tabs>
-              <w:spacing w:before="40"/>
-              <w:rPr>
-                <w:b/>
-                <w:bCs/>
-              </w:rPr>
-            </w:pPr>
-            <w:r>
-              <w:rPr>
-                <w:b/>
-                <w:bCs/>
-              </w:rPr>
-              <w:t>Sprint</w:t>
-            </w:r>
-          </w:p>
-        </w:tc>
-        <w:tc>
-          <w:tcPr>
-            <w:tcW w:w="4990" w:type="dxa"/>
-            <w:vAlign w:val="center"/>
-            <w:hideMark/>
-          </w:tcPr>
-          <w:p>
-            <w:pPr>
-              <w:tabs>
-                <w:tab w:val="left" w:pos="1404"/>
-              </w:tabs>
-              <w:spacing w:before="40"/>
-              <w:rPr>
-                <w:b/>
-                <w:bCs/>
-              </w:rPr>
-            </w:pPr>
-            <w:r>
-              <w:rPr>
-                <w:b/>
-                <w:bCs/>
-              </w:rPr>
-              <w:t>Main Activities</w:t>
-            </w:r>
-          </w:p>
-        </w:tc>
-        <w:tc>
-          <w:tcPr>
-            <w:tcW w:w="0" w:type="auto"/>
-            <w:vAlign w:val="center"/>
-            <w:hideMark/>
-          </w:tcPr>
-          <w:p>
-            <w:pPr>
-              <w:tabs>
-                <w:tab w:val="left" w:pos="1404"/>
-              </w:tabs>
-              <w:spacing w:before="40"/>
-              <w:rPr>
-                <w:b/>
-                <w:bCs/>
-              </w:rPr>
-            </w:pPr>
-            <w:r>
-              <w:rPr>
-                <w:b/>
-                <w:bCs/>
-              </w:rPr>
-              <w:t>Expected Result</w:t>
-            </w:r>
-          </w:p>
-        </w:tc>
-      </w:tr>
-      <w:tr>
-        <w:trPr>
-          <w:tblCellSpacing w:w="15" w:type="dxa"/>
-        </w:trPr>
-        <w:tc>
-          <w:tcPr>
-            <w:tcW w:w="1350" w:type="dxa"/>
-            <w:vAlign w:val="center"/>
-            <w:hideMark/>
-          </w:tcPr>
-          <w:p>
-            <w:pPr>
-              <w:tabs>
-                <w:tab w:val="left" w:pos="1404"/>
-              </w:tabs>
-              <w:spacing w:before="40"/>
-            </w:pPr>
-            <w:r>
-              <w:rPr>
-                <w:b/>
-                <w:bCs/>
-              </w:rPr>
-              <w:t>Sprint 1</w:t>
-            </w:r>
-          </w:p>
-        </w:tc>
-        <w:tc>
-          <w:tcPr>
-            <w:tcW w:w="4990" w:type="dxa"/>
-            <w:vAlign w:val="center"/>
-            <w:hideMark/>
-          </w:tcPr>
-          <w:p>
-            <w:pPr>
-              <w:tabs>
-                <w:tab w:val="left" w:pos="1404"/>
-              </w:tabs>
-              <w:spacing w:before="40"/>
-            </w:pPr>
-            <w:r>
-              <w:t>Database design, database implementation, and basic data entry</w:t>
-            </w:r>
-          </w:p>
-        </w:tc>
-        <w:tc>
-          <w:tcPr>
-            <w:tcW w:w="0" w:type="auto"/>
-            <w:vAlign w:val="center"/>
-            <w:hideMark/>
-          </w:tcPr>
-          <w:p>
-            <w:pPr>
-              <w:tabs>
-                <w:tab w:val="left" w:pos="1404"/>
-              </w:tabs>
-              <w:spacing w:before="40"/>
-            </w:pPr>
-            <w:r>
-              <w:t>Working database and basic data management</w:t>
-            </w:r>
-          </w:p>
-        </w:tc>
-      </w:tr>
-      <w:tr>
-        <w:trPr>
-          <w:tblCellSpacing w:w="15" w:type="dxa"/>
-        </w:trPr>
-        <w:tc>
-          <w:tcPr>
-            <w:tcW w:w="1350" w:type="dxa"/>
-            <w:vAlign w:val="center"/>
-            <w:hideMark/>
-          </w:tcPr>
-          <w:p>
-            <w:pPr>
-              <w:tabs>
-                <w:tab w:val="left" w:pos="1404"/>
-              </w:tabs>
-              <w:spacing w:before="40"/>
-            </w:pPr>
-            <w:r>
-              <w:rPr>
-                <w:b/>
-                <w:bCs/>
-              </w:rPr>
-              <w:t>Sprint 2</w:t>
-            </w:r>
-          </w:p>
-        </w:tc>
-        <w:tc>
-          <w:tcPr>
-            <w:tcW w:w="4990" w:type="dxa"/>
-            <w:vAlign w:val="center"/>
-            <w:hideMark/>
-          </w:tcPr>
-          <w:p>
-            <w:pPr>
-              <w:tabs>
-                <w:tab w:val="left" w:pos="1404"/>
-              </w:tabs>
-              <w:spacing w:before="40"/>
-            </w:pPr>
-            <w:r>
-              <w:t>API development and user authentication</w:t>
-            </w:r>
-          </w:p>
-        </w:tc>
-        <w:tc>
-          <w:tcPr>
-            <w:tcW w:w="0" w:type="auto"/>
-            <w:vAlign w:val="center"/>
-            <w:hideMark/>
-          </w:tcPr>
-          <w:p>
-            <w:pPr>
-              <w:tabs>
-                <w:tab w:val="left" w:pos="1404"/>
-              </w:tabs>
-              <w:spacing w:before="40"/>
-            </w:pPr>
-            <w:r>
-              <w:t>Working APIs with secure user authentication</w:t>
-            </w:r>
-          </w:p>
-        </w:tc>
-      </w:tr>
-      <w:tr>
-        <w:trPr>
-          <w:tblCellSpacing w:w="15" w:type="dxa"/>
-        </w:trPr>
-        <w:tc>
-          <w:tcPr>
-            <w:tcW w:w="1350" w:type="dxa"/>
-            <w:vAlign w:val="center"/>
-            <w:hideMark/>
-          </w:tcPr>
-          <w:p>
-            <w:pPr>
-              <w:tabs>
-                <w:tab w:val="left" w:pos="1404"/>
-              </w:tabs>
-              <w:spacing w:before="40"/>
-            </w:pPr>
-            <w:r>
-              <w:rPr>
-                <w:b/>
-                <w:bCs/>
-              </w:rPr>
-              <w:t>Sprint 3</w:t>
-            </w:r>
-          </w:p>
-        </w:tc>
-        <w:tc>
-          <w:tcPr>
-            <w:tcW w:w="4990" w:type="dxa"/>
-            <w:vAlign w:val="center"/>
-            <w:hideMark/>
-          </w:tcPr>
-          <w:p>
-            <w:pPr>
-              <w:tabs>
-                <w:tab w:val="left" w:pos="1404"/>
-              </w:tabs>
-              <w:spacing w:before="40"/>
-            </w:pPr>
-            <w:r>
-              <w:t>Search, filtering, and export functionality</w:t>
-            </w:r>
-          </w:p>
-        </w:tc>
-        <w:tc>
-          <w:tcPr>
-            <w:tcW w:w="0" w:type="auto"/>
-            <w:vAlign w:val="center"/>
-            <w:hideMark/>
-          </w:tcPr>
-          <w:p>
-            <w:pPr>
-              <w:tabs>
-                <w:tab w:val="left" w:pos="1404"/>
-              </w:tabs>
-              <w:spacing w:before="40"/>
-            </w:pPr>
-            <w:r>
-              <w:t>Complete core functionality</w:t>
-            </w:r>
-          </w:p>
-        </w:tc>
-      </w:tr>
-      <w:tr>
-        <w:trPr>
-          <w:tblCellSpacing w:w="15" w:type="dxa"/>
-        </w:trPr>
-        <w:tc>
-          <w:tcPr>
-            <w:tcW w:w="1350" w:type="dxa"/>
-            <w:vAlign w:val="center"/>
-            <w:hideMark/>
-          </w:tcPr>
-          <w:p>
-            <w:pPr>
-              <w:tabs>
-                <w:tab w:val="left" w:pos="1404"/>
-              </w:tabs>
-              <w:spacing w:before="40"/>
-            </w:pPr>
-            <w:r>
-              <w:rPr>
-                <w:b/>
-                <w:bCs/>
-              </w:rPr>
-              <w:t>Sprint 4</w:t>
-            </w:r>
-          </w:p>
-        </w:tc>
-        <w:tc>
-          <w:tcPr>
-            <w:tcW w:w="4990" w:type="dxa"/>
-            <w:vAlign w:val="center"/>
-            <w:hideMark/>
-          </w:tcPr>
-          <w:p>
-            <w:pPr>
-              <w:tabs>
-                <w:tab w:val="left" w:pos="1404"/>
-              </w:tabs>
-              <w:spacing w:before="40"/>
-            </w:pPr>
-            <w:r>
-              <w:t>Testing, bug fixing, UI improvements, and final integration</w:t>
-            </w:r>
-          </w:p>
-        </w:tc>
-        <w:tc>
-          <w:tcPr>
-            <w:tcW w:w="0" w:type="auto"/>
-            <w:vAlign w:val="center"/>
-            <w:hideMark/>
-          </w:tcPr>
-          <w:p>
-            <w:pPr>
-              <w:tabs>
-                <w:tab w:val="left" w:pos="1404"/>
-              </w:tabs>
-              <w:spacing w:before="40"/>
-            </w:pPr>
-            <w:r>
-              <w:t>Tested and finalized system</w:t>
-            </w:r>
-          </w:p>
-        </w:tc>
-      </w:tr>
-    </w:tbl>
-    <w:p>
-      <w:pPr>
-        <w:tabs>
-          <w:tab w:val="left" w:pos="1404"/>
-        </w:tabs>
-        <w:spacing w:before="40"/>
-        <w:sectPr>
-          <w:pgSz w:w="12240" w:h="15840"/>
-          <w:pgMar w:top="1340" w:right="720" w:bottom="860" w:left="1080" w:header="485" w:footer="633" w:gutter="0"/>
-          <w:cols w:space="720"/>
-        </w:sectPr>
-      </w:pPr>
-      <w:r>
-        <w:t xml:space="preserve"> </w:t>
-      </w:r>
     </w:p>
     <w:p>
       <w:pPr>
@@ -8710,7 +8559,6 @@
         <w:rPr>
           <w:color w:val="1A4D79"/>
         </w:rPr>
-        <w:lastRenderedPageBreak/>
         <w:t>Project</w:t>
       </w:r>
       <w:r>
@@ -8905,6 +8753,7 @@
           <w:b/>
         </w:rPr>
       </w:pPr>
+      <w:proofErr w:type="gramStart"/>
       <w:r>
         <w:rPr>
           <w:rFonts w:ascii="Arial"/>
@@ -8926,7 +8775,16 @@
           <w:b/>
           <w:spacing w:val="-5"/>
         </w:rPr>
-        <w:t>Do:</w:t>
+        <w:t>Do</w:t>
+      </w:r>
+      <w:proofErr w:type="gramEnd"/>
+      <w:r>
+        <w:rPr>
+          <w:rFonts w:ascii="Arial"/>
+          <w:b/>
+          <w:spacing w:val="-5"/>
+        </w:rPr>
+        <w:t>:</w:t>
       </w:r>
       <w:r>
         <w:rPr>
@@ -9322,6 +9180,9 @@
       </w:r>
       <w:r>
         <w:t>will help us in tracking progress and make sure every task is completed on Time.</w:t>
+      </w:r>
+      <w:r>
+        <w:t xml:space="preserve"> And later then discuss what each member did.</w:t>
       </w:r>
     </w:p>
     <w:sectPr>
@@ -9441,7 +9302,7 @@
         </mc:Choice>
         <mc:Fallback>
           <w:pict>
-            <v:shape w14:anchorId="21AEC590" id="Graphic 3" o:spid="_x0000_s1026" style="position:absolute;margin-left:70.6pt;margin-top:744.35pt;width:470.95pt;height:.5pt;z-index:-15900672;visibility:visible;mso-wrap-style:square;mso-wrap-distance-left:0;mso-wrap-distance-top:0;mso-wrap-distance-right:0;mso-wrap-distance-bottom:0;mso-position-horizontal:absolute;mso-position-horizontal-relative:page;mso-position-vertical:absolute;mso-position-vertical-relative:page;v-text-anchor:top" coordsize="5981065,6350" o:gfxdata="UEsDBBQABgAIAAAAIQC2gziS/gAAAOEBAAATAAAAW0NvbnRlbnRfVHlwZXNdLnhtbJSRQU7DMBBF&#10;90jcwfIWJU67QAgl6YK0S0CoHGBkTxKLZGx5TGhvj5O2G0SRWNoz/78nu9wcxkFMGNg6quQqL6RA&#10;0s5Y6ir5vt9lD1JwBDIwOMJKHpHlpr69KfdHjyxSmriSfYz+USnWPY7AufNIadK6MEJMx9ApD/oD&#10;OlTrorhX2lFEilmcO2RdNtjC5xDF9pCuTyYBB5bi6bQ4syoJ3g9WQ0ymaiLzg5KdCXlKLjvcW893&#10;SUOqXwnz5DrgnHtJTxOsQfEKIT7DmDSUCaxw7Rqn8787ZsmRM9e2VmPeBN4uqYvTtW7jvijg9N/y&#10;JsXecLq0q+WD6m8AAAD//wMAUEsDBBQABgAIAAAAIQA4/SH/1gAAAJQBAAALAAAAX3JlbHMvLnJl&#10;bHOkkMFqwzAMhu+DvYPRfXGawxijTi+j0GvpHsDYimMaW0Yy2fr2M4PBMnrbUb/Q94l/f/hMi1qR&#10;JVI2sOt6UJgd+ZiDgffL8ekFlFSbvV0oo4EbChzGx4f9GRdb25HMsYhqlCwG5lrLq9biZkxWOiqY&#10;22YiTra2kYMu1l1tQD30/bPm3wwYN0x18gb45AdQl1tp5j/sFB2T0FQ7R0nTNEV3j6o9feQzro1i&#10;OWA14Fm+Q8a1a8+Bvu/d/dMb2JY5uiPbhG/ktn4cqGU/er3pcvwCAAD//wMAUEsDBBQABgAIAAAA&#10;IQC9X+9CIgIAAL0EAAAOAAAAZHJzL2Uyb0RvYy54bWysVMFu2zAMvQ/YPwi6L3YyJGuNOMXWoMOA&#10;oivQDDsrshwbk01NVGLn70fJlmtspw27SJT5RD0+kt7e9Y1mF2Wxhjbny0XKmWolFHV7yvm3w8O7&#10;G87QibYQGlqV86tCfrd7+2bbmUytoAJdKMsoSItZZ3JeOWeyJEFZqUbgAoxqyVmCbYSjoz0lhRUd&#10;RW90skrTTdKBLYwFqRDp635w8l2IX5ZKuq9licoxnXPi5sJqw3r0a7LbiuxkhalqOdIQ/8CiEXVL&#10;j06h9sIJdrb1H6GaWlpAKN1CQpNAWdZShRwom2X6WzYvlTAq5ELioJlkwv8XVj5dXsyz9dTRPIL8&#10;gaRI0hnMJo8/4IjpS9t4LBFnfVDxOqmoesckfVzf3izTzZozSb7N+3UQORFZvCvP6D4rCHHE5RHd&#10;UIMiWqKKluzbaFqqpK+hDjV0nFENLWdUw+NQQyOcv+fJeZN1MyLVyMM7G7ioAwSY8ylMbGMixPQV&#10;o9s5lhpohoq+uJsQb8Bs0tu150XBojvuA2z+7F+Bo5oxnNSAanjJ5x2enLSg5+dqI+i6eKi19umj&#10;PR3vtWUXQbKu9h/WnzYj4xksdMJQfN8GRyiuz5Z1NC85x59nYRVn+ktLDemHKxo2GsdoWKfvIYxg&#10;UN6iO/TfhTXMkJlzR73zBLHdRRbbgvh7wID1N1v4eHZQ1r5nAreB0XigGQn5j/Psh3B+DqjXv87u&#10;FwAAAP//AwBQSwMEFAAGAAgAAAAhAMebASLhAAAADgEAAA8AAABkcnMvZG93bnJldi54bWxMj0FP&#10;wzAMhe9I/IfISFzQlrZjWylNJ4Q0TRwZ48DNbU1T0Tilybbu35NygZuf/fT8vXwzmk6caHCtZQXx&#10;PAJBXNm65UbB4W07S0E4j1xjZ5kUXMjBpri+yjGr7Zlf6bT3jQgh7DJUoL3vMyldpcmgm9ueONw+&#10;7WDQBzk0sh7wHMJNJ5MoWkmDLYcPGnt61lR97Y9GwWr7TZfFsryzS53gzo4ffvf+otTtzfj0CMLT&#10;6P/MMOEHdCgCU2mPXDvRBX0fJ8E6DWm6BjFZonQRgyh/dw9rkEUu/9cofgAAAP//AwBQSwECLQAU&#10;AAYACAAAACEAtoM4kv4AAADhAQAAEwAAAAAAAAAAAAAAAAAAAAAAW0NvbnRlbnRfVHlwZXNdLnht&#10;bFBLAQItABQABgAIAAAAIQA4/SH/1gAAAJQBAAALAAAAAAAAAAAAAAAAAC8BAABfcmVscy8ucmVs&#10;c1BLAQItABQABgAIAAAAIQC9X+9CIgIAAL0EAAAOAAAAAAAAAAAAAAAAAC4CAABkcnMvZTJvRG9j&#10;LnhtbFBLAQItABQABgAIAAAAIQDHmwEi4QAAAA4BAAAPAAAAAAAAAAAAAAAAAHwEAABkcnMvZG93&#10;bnJldi54bWxQSwUGAAAAAAQABADzAAAAigUAAAAA&#10;" path="m5981065,l,,,6095r5981065,l5981065,xe" fillcolor="#2d75b6" stroked="f">
+            <v:shape w14:anchorId="2B8B5074" id="Graphic 3" o:spid="_x0000_s1026" style="position:absolute;margin-left:70.6pt;margin-top:744.35pt;width:470.95pt;height:.5pt;z-index:-15900672;visibility:visible;mso-wrap-style:square;mso-wrap-distance-left:0;mso-wrap-distance-top:0;mso-wrap-distance-right:0;mso-wrap-distance-bottom:0;mso-position-horizontal:absolute;mso-position-horizontal-relative:page;mso-position-vertical:absolute;mso-position-vertical-relative:page;v-text-anchor:top" coordsize="5981065,6350" o:gfxdata="UEsDBBQABgAIAAAAIQC2gziS/gAAAOEBAAATAAAAW0NvbnRlbnRfVHlwZXNdLnhtbJSRQU7DMBBF&#10;90jcwfIWJU67QAgl6YK0S0CoHGBkTxKLZGx5TGhvj5O2G0SRWNoz/78nu9wcxkFMGNg6quQqL6RA&#10;0s5Y6ir5vt9lD1JwBDIwOMJKHpHlpr69KfdHjyxSmriSfYz+USnWPY7AufNIadK6MEJMx9ApD/oD&#10;OlTrorhX2lFEilmcO2RdNtjC5xDF9pCuTyYBB5bi6bQ4syoJ3g9WQ0ymaiLzg5KdCXlKLjvcW893&#10;SUOqXwnz5DrgnHtJTxOsQfEKIT7DmDSUCaxw7Rqn8787ZsmRM9e2VmPeBN4uqYvTtW7jvijg9N/y&#10;JsXecLq0q+WD6m8AAAD//wMAUEsDBBQABgAIAAAAIQA4/SH/1gAAAJQBAAALAAAAX3JlbHMvLnJl&#10;bHOkkMFqwzAMhu+DvYPRfXGawxijTi+j0GvpHsDYimMaW0Yy2fr2M4PBMnrbUb/Q94l/f/hMi1qR&#10;JVI2sOt6UJgd+ZiDgffL8ekFlFSbvV0oo4EbChzGx4f9GRdb25HMsYhqlCwG5lrLq9biZkxWOiqY&#10;22YiTra2kYMu1l1tQD30/bPm3wwYN0x18gb45AdQl1tp5j/sFB2T0FQ7R0nTNEV3j6o9feQzro1i&#10;OWA14Fm+Q8a1a8+Bvu/d/dMb2JY5uiPbhG/ktn4cqGU/er3pcvwCAAD//wMAUEsDBBQABgAIAAAA&#10;IQC9X+9CIgIAAL0EAAAOAAAAZHJzL2Uyb0RvYy54bWysVMFu2zAMvQ/YPwi6L3YyJGuNOMXWoMOA&#10;oivQDDsrshwbk01NVGLn70fJlmtspw27SJT5RD0+kt7e9Y1mF2Wxhjbny0XKmWolFHV7yvm3w8O7&#10;G87QibYQGlqV86tCfrd7+2bbmUytoAJdKMsoSItZZ3JeOWeyJEFZqUbgAoxqyVmCbYSjoz0lhRUd&#10;RW90skrTTdKBLYwFqRDp635w8l2IX5ZKuq9licoxnXPi5sJqw3r0a7LbiuxkhalqOdIQ/8CiEXVL&#10;j06h9sIJdrb1H6GaWlpAKN1CQpNAWdZShRwom2X6WzYvlTAq5ELioJlkwv8XVj5dXsyz9dTRPIL8&#10;gaRI0hnMJo8/4IjpS9t4LBFnfVDxOqmoesckfVzf3izTzZozSb7N+3UQORFZvCvP6D4rCHHE5RHd&#10;UIMiWqKKluzbaFqqpK+hDjV0nFENLWdUw+NQQyOcv+fJeZN1MyLVyMM7G7ioAwSY8ylMbGMixPQV&#10;o9s5lhpohoq+uJsQb8Bs0tu150XBojvuA2z+7F+Bo5oxnNSAanjJ5x2enLSg5+dqI+i6eKi19umj&#10;PR3vtWUXQbKu9h/WnzYj4xksdMJQfN8GRyiuz5Z1NC85x59nYRVn+ktLDemHKxo2GsdoWKfvIYxg&#10;UN6iO/TfhTXMkJlzR73zBLHdRRbbgvh7wID1N1v4eHZQ1r5nAreB0XigGQn5j/Psh3B+DqjXv87u&#10;FwAAAP//AwBQSwMEFAAGAAgAAAAhAMebASLhAAAADgEAAA8AAABkcnMvZG93bnJldi54bWxMj0FP&#10;wzAMhe9I/IfISFzQlrZjWylNJ4Q0TRwZ48DNbU1T0Tilybbu35NygZuf/fT8vXwzmk6caHCtZQXx&#10;PAJBXNm65UbB4W07S0E4j1xjZ5kUXMjBpri+yjGr7Zlf6bT3jQgh7DJUoL3vMyldpcmgm9ueONw+&#10;7WDQBzk0sh7wHMJNJ5MoWkmDLYcPGnt61lR97Y9GwWr7TZfFsryzS53gzo4ffvf+otTtzfj0CMLT&#10;6P/MMOEHdCgCU2mPXDvRBX0fJ8E6DWm6BjFZonQRgyh/dw9rkEUu/9cofgAAAP//AwBQSwECLQAU&#10;AAYACAAAACEAtoM4kv4AAADhAQAAEwAAAAAAAAAAAAAAAAAAAAAAW0NvbnRlbnRfVHlwZXNdLnht&#10;bFBLAQItABQABgAIAAAAIQA4/SH/1gAAAJQBAAALAAAAAAAAAAAAAAAAAC8BAABfcmVscy8ucmVs&#10;c1BLAQItABQABgAIAAAAIQC9X+9CIgIAAL0EAAAOAAAAAAAAAAAAAAAAAC4CAABkcnMvZTJvRG9j&#10;LnhtbFBLAQItABQABgAIAAAAIQDHmwEi4QAAAA4BAAAPAAAAAAAAAAAAAAAAAHwEAABkcnMvZG93&#10;bnJldi54bWxQSwUGAAAAAAQABADzAAAAigUAAAAA&#10;" path="m5981065,l,,,6095r5981065,l5981065,xe" fillcolor="#2d75b6" stroked="f">
               <v:path arrowok="t"/>
               <w10:wrap anchorx="page" anchory="page"/>
             </v:shape>
@@ -9777,7 +9638,7 @@
         </mc:Choice>
         <mc:Fallback>
           <w:pict>
-            <v:shape w14:anchorId="60BE0610" id="Graphic 1" o:spid="_x0000_s1026" style="position:absolute;margin-left:70.6pt;margin-top:47.3pt;width:470.95pt;height:.5pt;z-index:-15901696;visibility:visible;mso-wrap-style:square;mso-wrap-distance-left:0;mso-wrap-distance-top:0;mso-wrap-distance-right:0;mso-wrap-distance-bottom:0;mso-position-horizontal:absolute;mso-position-horizontal-relative:page;mso-position-vertical:absolute;mso-position-vertical-relative:page;v-text-anchor:top" coordsize="5981065,6350" o:gfxdata="UEsDBBQABgAIAAAAIQC2gziS/gAAAOEBAAATAAAAW0NvbnRlbnRfVHlwZXNdLnhtbJSRQU7DMBBF&#10;90jcwfIWJU67QAgl6YK0S0CoHGBkTxKLZGx5TGhvj5O2G0SRWNoz/78nu9wcxkFMGNg6quQqL6RA&#10;0s5Y6ir5vt9lD1JwBDIwOMJKHpHlpr69KfdHjyxSmriSfYz+USnWPY7AufNIadK6MEJMx9ApD/oD&#10;OlTrorhX2lFEilmcO2RdNtjC5xDF9pCuTyYBB5bi6bQ4syoJ3g9WQ0ymaiLzg5KdCXlKLjvcW893&#10;SUOqXwnz5DrgnHtJTxOsQfEKIT7DmDSUCaxw7Rqn8787ZsmRM9e2VmPeBN4uqYvTtW7jvijg9N/y&#10;JsXecLq0q+WD6m8AAAD//wMAUEsDBBQABgAIAAAAIQA4/SH/1gAAAJQBAAALAAAAX3JlbHMvLnJl&#10;bHOkkMFqwzAMhu+DvYPRfXGawxijTi+j0GvpHsDYimMaW0Yy2fr2M4PBMnrbUb/Q94l/f/hMi1qR&#10;JVI2sOt6UJgd+ZiDgffL8ekFlFSbvV0oo4EbChzGx4f9GRdb25HMsYhqlCwG5lrLq9biZkxWOiqY&#10;22YiTra2kYMu1l1tQD30/bPm3wwYN0x18gb45AdQl1tp5j/sFB2T0FQ7R0nTNEV3j6o9feQzro1i&#10;OWA14Fm+Q8a1a8+Bvu/d/dMb2JY5uiPbhG/ktn4cqGU/er3pcvwCAAD//wMAUEsDBBQABgAIAAAA&#10;IQDzb1bbIAIAAL0EAAAOAAAAZHJzL2Uyb0RvYy54bWysVMFu2zAMvQ/YPwi6L3YyJGuNOMXWoMOA&#10;oivQDDsrshwbk0VNVOLk70fJkWtspw27SJT5RD0+kl7fnTvNTsphC6bk81nOmTISqtYcSv5t9/Du&#10;hjP0wlRCg1Elvyjkd5u3b9a9LdQCGtCVcoyCGCx6W/LGe1tkGcpGdQJnYJUhZw2uE56O7pBVTvQU&#10;vdPZIs9XWQ+usg6kQqSv28HJNzF+XSvpv9Y1Ks90yYmbj6uL6z6s2WYtioMTtmnllYb4BxadaA09&#10;OobaCi/Y0bV/hOpa6QCh9jMJXQZ13UoVc6Bs5vlv2bw0wqqYC4mDdpQJ/19Y+XR6sc8uUEf7CPIH&#10;kiJZb7EYPeGAV8y5dl3AEnF2jipeRhXV2TNJH5e3N/N8teRMkm/1fhlFzkSR7soj+s8KYhxxekQ/&#10;1KBKlmiSJc8mmY4qGWqoYw09Z1RDxxnVcD/U0Aof7gVywWT9hEhz5RGcHZzUDiLMhxRGtikRYvqK&#10;0WaKpQaaoJIv7TbGGzCr/HYVeFGw5E77AJs++1fgpGYKJzWgGl4KeccnRy3o+anaCLqtHlqtQ/ro&#10;Dvt77dhJkKyL7Yflp8R4AoudMBQ/tMEeqsuzYz3NS8nx51E4xZn+Yqghw3AlwyVjnwzn9T3EEYzK&#10;O/S783fhLLNkltxT7zxBandRpLYg/gEwYMNNAx+PHuo29EzkNjC6HmhGYv7XeQ5DOD1H1OtfZ/ML&#10;AAD//wMAUEsDBBQABgAIAAAAIQD8N6R73gAAAAoBAAAPAAAAZHJzL2Rvd25yZXYueG1sTI/BTsMw&#10;DIbvSLxDZCQuiKXt1mqUphNCmiaODDhwSxvTVDROabKte3u8Exx/+9Pvz9VmdoM44hR6TwrSRQIC&#10;qfWmp07B+9v2fg0iRE1GD55QwRkDbOrrq0qXxp/oFY/72AkuoVBqBTbGsZQytBadDgs/IvHuy09O&#10;R45TJ82kT1zuBpklSSGd7okvWD3is8X2e39wCortD56XeXPnc5vpnZ8/4+7jRanbm/npEUTEOf7B&#10;cNFndajZqfEHMkEMnFdpxqiCh1UB4gIk62UKouFJXoCsK/n/hfoXAAD//wMAUEsBAi0AFAAGAAgA&#10;AAAhALaDOJL+AAAA4QEAABMAAAAAAAAAAAAAAAAAAAAAAFtDb250ZW50X1R5cGVzXS54bWxQSwEC&#10;LQAUAAYACAAAACEAOP0h/9YAAACUAQAACwAAAAAAAAAAAAAAAAAvAQAAX3JlbHMvLnJlbHNQSwEC&#10;LQAUAAYACAAAACEA829W2yACAAC9BAAADgAAAAAAAAAAAAAAAAAuAgAAZHJzL2Uyb0RvYy54bWxQ&#10;SwECLQAUAAYACAAAACEA/Deke94AAAAKAQAADwAAAAAAAAAAAAAAAAB6BAAAZHJzL2Rvd25yZXYu&#10;eG1sUEsFBgAAAAAEAAQA8wAAAIUFAAAAAA==&#10;" path="m5981065,l,,,6096r5981065,l5981065,xe" fillcolor="#2d75b6" stroked="f">
+            <v:shape w14:anchorId="10DE95AF" id="Graphic 1" o:spid="_x0000_s1026" style="position:absolute;margin-left:70.6pt;margin-top:47.3pt;width:470.95pt;height:.5pt;z-index:-15901696;visibility:visible;mso-wrap-style:square;mso-wrap-distance-left:0;mso-wrap-distance-top:0;mso-wrap-distance-right:0;mso-wrap-distance-bottom:0;mso-position-horizontal:absolute;mso-position-horizontal-relative:page;mso-position-vertical:absolute;mso-position-vertical-relative:page;v-text-anchor:top" coordsize="5981065,6350" o:gfxdata="UEsDBBQABgAIAAAAIQC2gziS/gAAAOEBAAATAAAAW0NvbnRlbnRfVHlwZXNdLnhtbJSRQU7DMBBF&#10;90jcwfIWJU67QAgl6YK0S0CoHGBkTxKLZGx5TGhvj5O2G0SRWNoz/78nu9wcxkFMGNg6quQqL6RA&#10;0s5Y6ir5vt9lD1JwBDIwOMJKHpHlpr69KfdHjyxSmriSfYz+USnWPY7AufNIadK6MEJMx9ApD/oD&#10;OlTrorhX2lFEilmcO2RdNtjC5xDF9pCuTyYBB5bi6bQ4syoJ3g9WQ0ymaiLzg5KdCXlKLjvcW893&#10;SUOqXwnz5DrgnHtJTxOsQfEKIT7DmDSUCaxw7Rqn8787ZsmRM9e2VmPeBN4uqYvTtW7jvijg9N/y&#10;JsXecLq0q+WD6m8AAAD//wMAUEsDBBQABgAIAAAAIQA4/SH/1gAAAJQBAAALAAAAX3JlbHMvLnJl&#10;bHOkkMFqwzAMhu+DvYPRfXGawxijTi+j0GvpHsDYimMaW0Yy2fr2M4PBMnrbUb/Q94l/f/hMi1qR&#10;JVI2sOt6UJgd+ZiDgffL8ekFlFSbvV0oo4EbChzGx4f9GRdb25HMsYhqlCwG5lrLq9biZkxWOiqY&#10;22YiTra2kYMu1l1tQD30/bPm3wwYN0x18gb45AdQl1tp5j/sFB2T0FQ7R0nTNEV3j6o9feQzro1i&#10;OWA14Fm+Q8a1a8+Bvu/d/dMb2JY5uiPbhG/ktn4cqGU/er3pcvwCAAD//wMAUEsDBBQABgAIAAAA&#10;IQDzb1bbIAIAAL0EAAAOAAAAZHJzL2Uyb0RvYy54bWysVMFu2zAMvQ/YPwi6L3YyJGuNOMXWoMOA&#10;oivQDDsrshwbk0VNVOLk70fJkWtspw27SJT5RD0+kl7fnTvNTsphC6bk81nOmTISqtYcSv5t9/Du&#10;hjP0wlRCg1Elvyjkd5u3b9a9LdQCGtCVcoyCGCx6W/LGe1tkGcpGdQJnYJUhZw2uE56O7pBVTvQU&#10;vdPZIs9XWQ+usg6kQqSv28HJNzF+XSvpv9Y1Ks90yYmbj6uL6z6s2WYtioMTtmnllYb4BxadaA09&#10;OobaCi/Y0bV/hOpa6QCh9jMJXQZ13UoVc6Bs5vlv2bw0wqqYC4mDdpQJ/19Y+XR6sc8uUEf7CPIH&#10;kiJZb7EYPeGAV8y5dl3AEnF2jipeRhXV2TNJH5e3N/N8teRMkm/1fhlFzkSR7soj+s8KYhxxekQ/&#10;1KBKlmiSJc8mmY4qGWqoYw09Z1RDxxnVcD/U0Aof7gVywWT9hEhz5RGcHZzUDiLMhxRGtikRYvqK&#10;0WaKpQaaoJIv7TbGGzCr/HYVeFGw5E77AJs++1fgpGYKJzWgGl4KeccnRy3o+anaCLqtHlqtQ/ro&#10;Dvt77dhJkKyL7Yflp8R4AoudMBQ/tMEeqsuzYz3NS8nx51E4xZn+Yqghw3AlwyVjnwzn9T3EEYzK&#10;O/S783fhLLNkltxT7zxBandRpLYg/gEwYMNNAx+PHuo29EzkNjC6HmhGYv7XeQ5DOD1H1OtfZ/ML&#10;AAD//wMAUEsDBBQABgAIAAAAIQD8N6R73gAAAAoBAAAPAAAAZHJzL2Rvd25yZXYueG1sTI/BTsMw&#10;DIbvSLxDZCQuiKXt1mqUphNCmiaODDhwSxvTVDROabKte3u8Exx/+9Pvz9VmdoM44hR6TwrSRQIC&#10;qfWmp07B+9v2fg0iRE1GD55QwRkDbOrrq0qXxp/oFY/72AkuoVBqBTbGsZQytBadDgs/IvHuy09O&#10;R45TJ82kT1zuBpklSSGd7okvWD3is8X2e39wCortD56XeXPnc5vpnZ8/4+7jRanbm/npEUTEOf7B&#10;cNFndajZqfEHMkEMnFdpxqiCh1UB4gIk62UKouFJXoCsK/n/hfoXAAD//wMAUEsBAi0AFAAGAAgA&#10;AAAhALaDOJL+AAAA4QEAABMAAAAAAAAAAAAAAAAAAAAAAFtDb250ZW50X1R5cGVzXS54bWxQSwEC&#10;LQAUAAYACAAAACEAOP0h/9YAAACUAQAACwAAAAAAAAAAAAAAAAAvAQAAX3JlbHMvLnJlbHNQSwEC&#10;LQAUAAYACAAAACEA829W2yACAAC9BAAADgAAAAAAAAAAAAAAAAAuAgAAZHJzL2Uyb0RvYy54bWxQ&#10;SwECLQAUAAYACAAAACEA/Deke94AAAAKAQAADwAAAAAAAAAAAAAAAAB6BAAAZHJzL2Rvd25yZXYu&#10;eG1sUEsFBgAAAAAEAAQA8wAAAIUFAAAAAA==&#10;" path="m5981065,l,,,6096r5981065,l5981065,xe" fillcolor="#2d75b6" stroked="f">
               <v:path arrowok="t"/>
               <w10:wrap anchorx="page" anchory="page"/>
             </v:shape>
@@ -11042,6 +10903,7 @@
   <w:style w:type="character" w:default="1" w:styleId="DefaultParagraphFont">
     <w:name w:val="Default Paragraph Font"/>
     <w:uiPriority w:val="1"/>
+    <w:semiHidden/>
     <w:unhideWhenUsed/>
   </w:style>
   <w:style w:type="table" w:default="1" w:styleId="TableNormal">

</xml_diff>

<commit_message>
Docs: Improve Chapter 1 of SRS Document
</commit_message>
<xml_diff>
--- a/documentation/srs/1-introduction/srs_ch1_introduction.docx
+++ b/documentation/srs/1-introduction/srs_ch1_introduction.docx
@@ -1864,83 +1864,226 @@
         </w:rPr>
         <w:t xml:space="preserve"> </w:t>
       </w:r>
+      <w:r>
+        <w:t>animals</w:t>
+      </w:r>
+      <w:r>
+        <w:rPr>
+          <w:spacing w:val="-14"/>
+        </w:rPr>
+        <w:t xml:space="preserve"> </w:t>
+      </w:r>
+      <w:r>
+        <w:t>that</w:t>
+      </w:r>
+      <w:r>
+        <w:t xml:space="preserve"> are</w:t>
+      </w:r>
+      <w:r>
+        <w:rPr>
+          <w:spacing w:val="-13"/>
+        </w:rPr>
+        <w:t xml:space="preserve"> </w:t>
+      </w:r>
+      <w:r>
+        <w:t>liv</w:t>
+      </w:r>
+      <w:r>
+        <w:t>ing</w:t>
+      </w:r>
+      <w:r>
+        <w:rPr>
+          <w:spacing w:val="-15"/>
+        </w:rPr>
+        <w:t xml:space="preserve"> </w:t>
+      </w:r>
+      <w:r>
+        <w:t>naturally</w:t>
+      </w:r>
+      <w:r>
+        <w:rPr>
+          <w:spacing w:val="-14"/>
+        </w:rPr>
+        <w:t xml:space="preserve"> </w:t>
+      </w:r>
+      <w:r>
+        <w:t>in</w:t>
+      </w:r>
+      <w:r>
+        <w:rPr>
+          <w:spacing w:val="-15"/>
+        </w:rPr>
+        <w:t xml:space="preserve"> </w:t>
+      </w:r>
+      <w:r>
+        <w:t>forests,</w:t>
+      </w:r>
+      <w:r>
+        <w:rPr>
+          <w:spacing w:val="-13"/>
+        </w:rPr>
+        <w:t xml:space="preserve"> </w:t>
+      </w:r>
+      <w:r>
+        <w:t>mountains,</w:t>
+      </w:r>
+      <w:r>
+        <w:rPr>
+          <w:spacing w:val="-14"/>
+        </w:rPr>
+        <w:t xml:space="preserve"> </w:t>
+      </w:r>
+      <w:r>
+        <w:t>deserts</w:t>
+      </w:r>
+      <w:r>
+        <w:t>, local forms</w:t>
+      </w:r>
+      <w:r>
+        <w:rPr>
+          <w:spacing w:val="-14"/>
+        </w:rPr>
+        <w:t xml:space="preserve"> </w:t>
+      </w:r>
+      <w:r>
+        <w:t>and</w:t>
+      </w:r>
+      <w:r>
+        <w:rPr>
+          <w:spacing w:val="-15"/>
+        </w:rPr>
+        <w:t xml:space="preserve"> </w:t>
+      </w:r>
+      <w:r>
+        <w:t>in</w:t>
+      </w:r>
+      <w:r>
+        <w:rPr>
+          <w:spacing w:val="-15"/>
+        </w:rPr>
+        <w:t xml:space="preserve"> </w:t>
+      </w:r>
+      <w:r>
+        <w:t>other</w:t>
+      </w:r>
+      <w:r>
+        <w:rPr>
+          <w:spacing w:val="-14"/>
+        </w:rPr>
+        <w:t xml:space="preserve"> </w:t>
+      </w:r>
+      <w:r>
+        <w:t>environments</w:t>
+      </w:r>
+      <w:r>
+        <w:t xml:space="preserve"> like elephants, lions, wolves, </w:t>
+      </w:r>
       <w:proofErr w:type="gramStart"/>
       <w:r>
-        <w:t>animal</w:t>
+        <w:t>dogs</w:t>
       </w:r>
       <w:proofErr w:type="gramEnd"/>
       <w:r>
-        <w:rPr>
-          <w:spacing w:val="-14"/>
-        </w:rPr>
-        <w:t xml:space="preserve"> </w:t>
-      </w:r>
-      <w:r>
-        <w:t>that</w:t>
-      </w:r>
-      <w:r>
-        <w:rPr>
-          <w:spacing w:val="-13"/>
-        </w:rPr>
-        <w:t xml:space="preserve"> </w:t>
-      </w:r>
-      <w:r>
-        <w:t>live</w:t>
+        <w:t xml:space="preserve"> </w:t>
+      </w:r>
+      <w:r>
+        <w:t>cows etc</w:t>
+      </w:r>
+      <w:r>
+        <w:t xml:space="preserve">. </w:t>
+      </w:r>
+      <w:r>
+        <w:t>Those</w:t>
+      </w:r>
+      <w:r>
+        <w:t xml:space="preserve"> animals are very important because they </w:t>
+      </w:r>
+      <w:proofErr w:type="gramStart"/>
+      <w:r>
+        <w:t>help</w:t>
       </w:r>
       <w:r>
         <w:t>s</w:t>
       </w:r>
-      <w:r>
-        <w:rPr>
-          <w:spacing w:val="-15"/>
-        </w:rPr>
-        <w:t xml:space="preserve"> </w:t>
-      </w:r>
-      <w:r>
-        <w:t>naturally</w:t>
-      </w:r>
-      <w:r>
-        <w:rPr>
-          <w:spacing w:val="-14"/>
-        </w:rPr>
-        <w:t xml:space="preserve"> </w:t>
-      </w:r>
-      <w:r>
-        <w:t>in</w:t>
-      </w:r>
-      <w:r>
-        <w:rPr>
-          <w:spacing w:val="-15"/>
-        </w:rPr>
-        <w:t xml:space="preserve"> </w:t>
-      </w:r>
-      <w:r>
-        <w:t>forests,</w:t>
-      </w:r>
-      <w:r>
-        <w:rPr>
-          <w:spacing w:val="-13"/>
-        </w:rPr>
-        <w:t xml:space="preserve"> </w:t>
-      </w:r>
-      <w:r>
-        <w:t>mountains,</w:t>
-      </w:r>
-      <w:r>
-        <w:rPr>
-          <w:spacing w:val="-14"/>
-        </w:rPr>
-        <w:t xml:space="preserve"> </w:t>
-      </w:r>
-      <w:r>
-        <w:t>deserts</w:t>
-      </w:r>
-      <w:r>
-        <w:t>, local forms</w:t>
-      </w:r>
-      <w:r>
-        <w:rPr>
-          <w:spacing w:val="-14"/>
+      <w:proofErr w:type="gramEnd"/>
+      <w:r>
+        <w:t xml:space="preserve"> to</w:t>
+      </w:r>
+      <w:r>
+        <w:t xml:space="preserve"> </w:t>
+      </w:r>
+      <w:r>
+        <w:t>maintain</w:t>
+      </w:r>
+      <w:r>
+        <w:t xml:space="preserve"> the</w:t>
+      </w:r>
+      <w:r>
+        <w:rPr>
+          <w:spacing w:val="-2"/>
+        </w:rPr>
+        <w:t xml:space="preserve"> </w:t>
+      </w:r>
+      <w:r>
+        <w:t>balance of</w:t>
+      </w:r>
+      <w:r>
+        <w:rPr>
+          <w:spacing w:val="-3"/>
+        </w:rPr>
+        <w:t xml:space="preserve"> </w:t>
+      </w:r>
+      <w:r>
+        <w:t>nature.</w:t>
+      </w:r>
+      <w:r>
+        <w:t xml:space="preserve"> like</w:t>
+      </w:r>
+      <w:r>
+        <w:t xml:space="preserve"> </w:t>
+      </w:r>
+      <w:r>
+        <w:t>predators</w:t>
+      </w:r>
+      <w:r>
+        <w:t xml:space="preserve"> </w:t>
+      </w:r>
+      <w:r>
+        <w:t>like as</w:t>
+      </w:r>
+      <w:r>
+        <w:rPr>
+          <w:spacing w:val="-2"/>
+        </w:rPr>
+        <w:t xml:space="preserve"> </w:t>
+      </w:r>
+      <w:r>
+        <w:t>wolves control</w:t>
+      </w:r>
+      <w:r>
+        <w:t>s</w:t>
+      </w:r>
+      <w:r>
+        <w:rPr>
+          <w:spacing w:val="-3"/>
+        </w:rPr>
+        <w:t xml:space="preserve"> </w:t>
+      </w:r>
+      <w:r>
+        <w:t>the population of other</w:t>
+      </w:r>
+      <w:r>
+        <w:rPr>
+          <w:spacing w:val="-8"/>
+        </w:rPr>
+        <w:t xml:space="preserve"> </w:t>
+      </w:r>
+      <w:r>
+        <w:t>animals,</w:t>
+      </w:r>
+      <w:r>
+        <w:rPr>
+          <w:spacing w:val="-7"/>
         </w:rPr>
         <w:t xml:space="preserve"> </w:t>
       </w:r>
@@ -1949,413 +2092,335 @@
       </w:r>
       <w:r>
         <w:rPr>
-          <w:spacing w:val="-15"/>
-        </w:rPr>
-        <w:t xml:space="preserve"> </w:t>
-      </w:r>
-      <w:r>
-        <w:t>in</w:t>
-      </w:r>
-      <w:r>
-        <w:rPr>
-          <w:spacing w:val="-15"/>
-        </w:rPr>
-        <w:t xml:space="preserve"> </w:t>
-      </w:r>
-      <w:r>
-        <w:t>other</w:t>
-      </w:r>
-      <w:r>
-        <w:rPr>
-          <w:spacing w:val="-14"/>
+          <w:spacing w:val="-11"/>
+        </w:rPr>
+        <w:t xml:space="preserve"> </w:t>
+      </w:r>
+      <w:r>
+        <w:t>the</w:t>
+      </w:r>
+      <w:r>
+        <w:rPr>
+          <w:spacing w:val="-9"/>
+        </w:rPr>
+        <w:t xml:space="preserve"> </w:t>
+      </w:r>
+      <w:r>
+        <w:t>birds</w:t>
+      </w:r>
+      <w:r>
+        <w:rPr>
+          <w:spacing w:val="-9"/>
         </w:rPr>
         <w:t xml:space="preserve"> </w:t>
       </w:r>
       <w:proofErr w:type="gramStart"/>
       <w:r>
-        <w:t>environment</w:t>
+        <w:t>help</w:t>
+      </w:r>
+      <w:r>
+        <w:t>s</w:t>
       </w:r>
       <w:proofErr w:type="gramEnd"/>
       <w:r>
-        <w:t xml:space="preserve"> like elephants, lions, wolves, </w:t>
+        <w:rPr>
+          <w:spacing w:val="-9"/>
+        </w:rPr>
+        <w:t xml:space="preserve"> </w:t>
       </w:r>
       <w:proofErr w:type="gramStart"/>
       <w:r>
-        <w:t>dogs</w:t>
+        <w:t>plant</w:t>
+      </w:r>
+      <w:r>
+        <w:rPr>
+          <w:spacing w:val="-11"/>
+        </w:rPr>
+        <w:t xml:space="preserve"> </w:t>
+      </w:r>
+      <w:r>
+        <w:t>to</w:t>
+      </w:r>
+      <w:r>
+        <w:rPr>
+          <w:spacing w:val="-9"/>
+        </w:rPr>
+        <w:t xml:space="preserve"> </w:t>
+      </w:r>
+      <w:r>
+        <w:t>grow</w:t>
       </w:r>
       <w:proofErr w:type="gramEnd"/>
       <w:r>
-        <w:t xml:space="preserve"> </w:t>
-      </w:r>
-      <w:r>
-        <w:t>cows etc</w:t>
-      </w:r>
-      <w:r>
-        <w:t>. These animals are very important because they help to</w:t>
+        <w:rPr>
+          <w:spacing w:val="-9"/>
+        </w:rPr>
+        <w:t xml:space="preserve"> </w:t>
+      </w:r>
+      <w:r>
+        <w:t>by</w:t>
+      </w:r>
+      <w:r>
+        <w:rPr>
+          <w:spacing w:val="-8"/>
+        </w:rPr>
+        <w:t xml:space="preserve"> </w:t>
+      </w:r>
+      <w:r>
+        <w:t>spreading</w:t>
+      </w:r>
+      <w:r>
+        <w:rPr>
+          <w:spacing w:val="-9"/>
+        </w:rPr>
+        <w:t xml:space="preserve"> </w:t>
+      </w:r>
+      <w:r>
+        <w:t>seeds</w:t>
+      </w:r>
+      <w:r>
+        <w:rPr>
+          <w:spacing w:val="-9"/>
+        </w:rPr>
+        <w:t xml:space="preserve"> </w:t>
+      </w:r>
+      <w:r>
+        <w:t>and</w:t>
+      </w:r>
+      <w:r>
+        <w:rPr>
+          <w:spacing w:val="-9"/>
+        </w:rPr>
+        <w:t xml:space="preserve"> </w:t>
+      </w:r>
+      <w:r>
+        <w:t>pollinating</w:t>
+      </w:r>
+      <w:r>
+        <w:rPr>
+          <w:spacing w:val="-9"/>
+        </w:rPr>
+        <w:t xml:space="preserve"> </w:t>
+      </w:r>
+      <w:r>
+        <w:t>flowers.</w:t>
       </w:r>
       <w:r>
         <w:t xml:space="preserve"> </w:t>
       </w:r>
       <w:proofErr w:type="gramStart"/>
       <w:r>
-        <w:t>the</w:t>
-      </w:r>
-      <w:r>
-        <w:t xml:space="preserve"> maintain</w:t>
+        <w:t>much</w:t>
       </w:r>
       <w:proofErr w:type="gramEnd"/>
       <w:r>
-        <w:t xml:space="preserve"> the</w:t>
-      </w:r>
-      <w:r>
-        <w:rPr>
-          <w:spacing w:val="-2"/>
-        </w:rPr>
-        <w:t xml:space="preserve"> </w:t>
-      </w:r>
-      <w:r>
-        <w:t>balance of</w:t>
-      </w:r>
-      <w:r>
-        <w:rPr>
-          <w:spacing w:val="-3"/>
-        </w:rPr>
-        <w:t xml:space="preserve"> </w:t>
-      </w:r>
-      <w:r>
-        <w:t>nature. For</w:t>
-      </w:r>
-      <w:r>
-        <w:rPr>
-          <w:spacing w:val="-1"/>
-        </w:rPr>
-        <w:t xml:space="preserve"> </w:t>
-      </w:r>
-      <w:r>
-        <w:t xml:space="preserve">example: </w:t>
+        <w:t xml:space="preserve"> information about wildlife is collected around the world. This information includes Animal, population number, Movement</w:t>
+      </w:r>
+      <w:r>
+        <w:t>s</w:t>
+      </w:r>
+      <w:r>
+        <w:t xml:space="preserve"> and migration</w:t>
+      </w:r>
+      <w:r>
+        <w:t>s</w:t>
+      </w:r>
+      <w:r>
+        <w:t xml:space="preserve"> routes, Animal</w:t>
+      </w:r>
+      <w:r>
+        <w:t>’s</w:t>
+      </w:r>
+      <w:r>
+        <w:t xml:space="preserve"> behavior</w:t>
+      </w:r>
+      <w:r>
+        <w:t xml:space="preserve">. </w:t>
+      </w:r>
+      <w:r>
+        <w:t>DNA and genetic information</w:t>
+      </w:r>
+      <w:r>
+        <w:t xml:space="preserve">. </w:t>
+      </w:r>
+      <w:r>
+        <w:t>Health and disease records. However,</w:t>
+      </w:r>
+      <w:r>
+        <w:t xml:space="preserve"> and There will be real time simulations real time movements its health notification etc.</w:t>
+      </w:r>
+      <w:r>
+        <w:t xml:space="preserve"> the data is stored in many different places. Different organizations, universities,</w:t>
+      </w:r>
+      <w:r>
+        <w:t xml:space="preserve"> </w:t>
+      </w:r>
+      <w:r>
+        <w:t>researchers, and</w:t>
+      </w:r>
+      <w:r>
+        <w:t xml:space="preserve"> other</w:t>
+      </w:r>
+      <w:r>
+        <w:t xml:space="preserve"> government departments</w:t>
+      </w:r>
+      <w:r>
+        <w:t xml:space="preserve"> can easily collect</w:t>
+      </w:r>
+      <w:r>
+        <w:t xml:space="preserve"> data separately.</w:t>
+      </w:r>
+      <w:r>
+        <w:t xml:space="preserve"> and</w:t>
+      </w:r>
+      <w:r>
+        <w:rPr>
+          <w:spacing w:val="-5"/>
+        </w:rPr>
+        <w:t xml:space="preserve"> </w:t>
+      </w:r>
+      <w:r>
+        <w:t>There</w:t>
+      </w:r>
+      <w:r>
+        <w:rPr>
+          <w:spacing w:val="-6"/>
+        </w:rPr>
+        <w:t xml:space="preserve"> </w:t>
+      </w:r>
+      <w:r>
+        <w:t>is</w:t>
+      </w:r>
+      <w:r>
+        <w:rPr>
+          <w:spacing w:val="-6"/>
+        </w:rPr>
+        <w:t xml:space="preserve"> </w:t>
+      </w:r>
+      <w:r>
+        <w:t>no</w:t>
+      </w:r>
+      <w:r>
+        <w:rPr>
+          <w:spacing w:val="-7"/>
+        </w:rPr>
+        <w:t xml:space="preserve"> </w:t>
+      </w:r>
+      <w:r>
+        <w:t>single</w:t>
+      </w:r>
+      <w:r>
+        <w:rPr>
+          <w:spacing w:val="-6"/>
+        </w:rPr>
+        <w:t xml:space="preserve"> </w:t>
+      </w:r>
+      <w:r>
+        <w:t>system</w:t>
+      </w:r>
+      <w:r>
+        <w:rPr>
+          <w:spacing w:val="-8"/>
+        </w:rPr>
+        <w:t xml:space="preserve"> </w:t>
+      </w:r>
+      <w:r>
+        <w:t>where</w:t>
+      </w:r>
+      <w:r>
+        <w:rPr>
+          <w:spacing w:val="-6"/>
+        </w:rPr>
+        <w:t xml:space="preserve"> </w:t>
+      </w:r>
+      <w:r>
+        <w:t>all</w:t>
+      </w:r>
+      <w:r>
+        <w:rPr>
+          <w:spacing w:val="-7"/>
+        </w:rPr>
+        <w:t xml:space="preserve"> </w:t>
+      </w:r>
+      <w:r>
+        <w:t>wildlife</w:t>
+      </w:r>
+      <w:r>
+        <w:rPr>
+          <w:spacing w:val="-6"/>
+        </w:rPr>
+        <w:t xml:space="preserve"> </w:t>
+      </w:r>
+      <w:r>
+        <w:t>information</w:t>
+      </w:r>
+      <w:r>
+        <w:rPr>
+          <w:spacing w:val="-7"/>
+        </w:rPr>
+        <w:t xml:space="preserve"> </w:t>
+      </w:r>
+      <w:r>
+        <w:t>can</w:t>
+      </w:r>
+      <w:r>
+        <w:rPr>
+          <w:spacing w:val="-7"/>
+        </w:rPr>
+        <w:t xml:space="preserve"> </w:t>
+      </w:r>
+      <w:r>
+        <w:t>be</w:t>
+      </w:r>
+      <w:r>
+        <w:rPr>
+          <w:spacing w:val="-7"/>
+        </w:rPr>
+        <w:t xml:space="preserve"> </w:t>
+      </w:r>
+      <w:r>
+        <w:t>found.</w:t>
+      </w:r>
+      <w:r>
+        <w:rPr>
+          <w:spacing w:val="-5"/>
+        </w:rPr>
+        <w:t xml:space="preserve"> </w:t>
+      </w:r>
+      <w:r>
+        <w:t>In</w:t>
+      </w:r>
+      <w:r>
+        <w:rPr>
+          <w:spacing w:val="-6"/>
+        </w:rPr>
+        <w:t xml:space="preserve"> </w:t>
+      </w:r>
+      <w:r>
+        <w:t>Pakistan</w:t>
+      </w:r>
+      <w:r>
+        <w:rPr>
+          <w:spacing w:val="-7"/>
+        </w:rPr>
+        <w:t xml:space="preserve"> </w:t>
+      </w:r>
+      <w:r>
+        <w:t xml:space="preserve">and many other countries, wildlife data is usually stored in reports, spreadsheets, notebooks, and paper records. Because of this, it </w:t>
       </w:r>
       <w:proofErr w:type="gramStart"/>
       <w:r>
-        <w:t>predator</w:t>
+        <w:t>become</w:t>
       </w:r>
       <w:proofErr w:type="gramEnd"/>
       <w:r>
-        <w:t xml:space="preserve"> </w:t>
-      </w:r>
-      <w:r>
-        <w:t>such as</w:t>
-      </w:r>
-      <w:r>
-        <w:rPr>
-          <w:spacing w:val="-2"/>
-        </w:rPr>
-        <w:t xml:space="preserve"> </w:t>
-      </w:r>
-      <w:r>
-        <w:t>wolves control</w:t>
-      </w:r>
-      <w:r>
-        <w:rPr>
-          <w:spacing w:val="-3"/>
-        </w:rPr>
-        <w:t xml:space="preserve"> </w:t>
-      </w:r>
-      <w:r>
-        <w:t>the population of other</w:t>
-      </w:r>
-      <w:r>
-        <w:rPr>
-          <w:spacing w:val="-8"/>
-        </w:rPr>
-        <w:t xml:space="preserve"> </w:t>
-      </w:r>
-      <w:r>
-        <w:t>animals,</w:t>
-      </w:r>
-      <w:r>
-        <w:rPr>
-          <w:spacing w:val="-7"/>
-        </w:rPr>
-        <w:t xml:space="preserve"> </w:t>
-      </w:r>
-      <w:r>
-        <w:t>and</w:t>
-      </w:r>
-      <w:r>
-        <w:rPr>
-          <w:spacing w:val="-11"/>
-        </w:rPr>
-        <w:t xml:space="preserve"> </w:t>
-      </w:r>
-      <w:r>
-        <w:t>the</w:t>
-      </w:r>
-      <w:r>
-        <w:rPr>
-          <w:spacing w:val="-9"/>
-        </w:rPr>
-        <w:t xml:space="preserve"> </w:t>
-      </w:r>
-      <w:r>
-        <w:t>birds</w:t>
-      </w:r>
-      <w:r>
-        <w:rPr>
-          <w:spacing w:val="-9"/>
-        </w:rPr>
-        <w:t xml:space="preserve"> </w:t>
-      </w:r>
-      <w:r>
-        <w:t>help</w:t>
-      </w:r>
-      <w:r>
-        <w:rPr>
-          <w:spacing w:val="-9"/>
-        </w:rPr>
-        <w:t xml:space="preserve"> </w:t>
-      </w:r>
-      <w:r>
-        <w:t>plants</w:t>
-      </w:r>
-      <w:r>
-        <w:rPr>
-          <w:spacing w:val="-11"/>
-        </w:rPr>
-        <w:t xml:space="preserve"> </w:t>
-      </w:r>
-      <w:r>
-        <w:t>to</w:t>
-      </w:r>
-      <w:r>
-        <w:rPr>
-          <w:spacing w:val="-9"/>
-        </w:rPr>
-        <w:t xml:space="preserve"> </w:t>
-      </w:r>
-      <w:r>
-        <w:t>grow</w:t>
-      </w:r>
-      <w:r>
-        <w:rPr>
-          <w:spacing w:val="-9"/>
-        </w:rPr>
-        <w:t xml:space="preserve"> </w:t>
-      </w:r>
-      <w:r>
-        <w:t>by</w:t>
-      </w:r>
-      <w:r>
-        <w:rPr>
-          <w:spacing w:val="-8"/>
-        </w:rPr>
-        <w:t xml:space="preserve"> </w:t>
-      </w:r>
-      <w:r>
-        <w:t>spreading</w:t>
-      </w:r>
-      <w:r>
-        <w:rPr>
-          <w:spacing w:val="-9"/>
-        </w:rPr>
-        <w:t xml:space="preserve"> </w:t>
-      </w:r>
-      <w:r>
-        <w:t>seeds</w:t>
-      </w:r>
-      <w:r>
-        <w:rPr>
-          <w:spacing w:val="-9"/>
-        </w:rPr>
-        <w:t xml:space="preserve"> </w:t>
-      </w:r>
-      <w:r>
-        <w:t>and</w:t>
-      </w:r>
-      <w:r>
-        <w:rPr>
-          <w:spacing w:val="-9"/>
-        </w:rPr>
-        <w:t xml:space="preserve"> </w:t>
-      </w:r>
-      <w:r>
-        <w:t>pollinating</w:t>
-      </w:r>
-      <w:r>
-        <w:rPr>
-          <w:spacing w:val="-9"/>
-        </w:rPr>
-        <w:t xml:space="preserve"> </w:t>
-      </w:r>
-      <w:r>
-        <w:t>flowers.</w:t>
-      </w:r>
-      <w:r>
-        <w:rPr>
-          <w:spacing w:val="-7"/>
-        </w:rPr>
-        <w:t xml:space="preserve"> </w:t>
-      </w:r>
-      <w:r>
-        <w:t>Now, much information about wildlife is collected around the world. This information includes Animal, population number, Movement</w:t>
-      </w:r>
-      <w:r>
-        <w:t>s</w:t>
-      </w:r>
-      <w:r>
-        <w:t xml:space="preserve"> and migration</w:t>
-      </w:r>
-      <w:r>
-        <w:t>s</w:t>
-      </w:r>
-      <w:r>
-        <w:t xml:space="preserve"> routes, Animal</w:t>
-      </w:r>
-      <w:r>
-        <w:t>’s</w:t>
-      </w:r>
-      <w:r>
-        <w:t xml:space="preserve"> behavior, DNA and genetic information, Health and disease records. However,</w:t>
-      </w:r>
-      <w:r>
-        <w:t xml:space="preserve"> and There will be real time simulations real time movements its health notification etc.</w:t>
-      </w:r>
-      <w:r>
-        <w:t xml:space="preserve"> the data is stored in many different places. Different organizations, universities, researchers, and government departments collect data separately.</w:t>
-      </w:r>
-      <w:r>
-        <w:rPr>
-          <w:spacing w:val="-5"/>
-        </w:rPr>
-        <w:t xml:space="preserve"> </w:t>
-      </w:r>
-      <w:r>
-        <w:t>There</w:t>
-      </w:r>
-      <w:r>
-        <w:rPr>
-          <w:spacing w:val="-6"/>
-        </w:rPr>
-        <w:t xml:space="preserve"> </w:t>
-      </w:r>
-      <w:r>
-        <w:t>is</w:t>
-      </w:r>
-      <w:r>
-        <w:rPr>
-          <w:spacing w:val="-6"/>
-        </w:rPr>
-        <w:t xml:space="preserve"> </w:t>
-      </w:r>
-      <w:r>
-        <w:t>no</w:t>
-      </w:r>
-      <w:r>
-        <w:rPr>
-          <w:spacing w:val="-7"/>
-        </w:rPr>
-        <w:t xml:space="preserve"> </w:t>
-      </w:r>
-      <w:r>
-        <w:t>single</w:t>
-      </w:r>
-      <w:r>
-        <w:rPr>
-          <w:spacing w:val="-6"/>
-        </w:rPr>
-        <w:t xml:space="preserve"> </w:t>
-      </w:r>
-      <w:r>
-        <w:t>system</w:t>
-      </w:r>
-      <w:r>
-        <w:rPr>
-          <w:spacing w:val="-8"/>
-        </w:rPr>
-        <w:t xml:space="preserve"> </w:t>
-      </w:r>
-      <w:r>
-        <w:t>where</w:t>
-      </w:r>
-      <w:r>
-        <w:rPr>
-          <w:spacing w:val="-6"/>
-        </w:rPr>
-        <w:t xml:space="preserve"> </w:t>
-      </w:r>
-      <w:r>
-        <w:t>all</w:t>
-      </w:r>
-      <w:r>
-        <w:rPr>
-          <w:spacing w:val="-7"/>
-        </w:rPr>
-        <w:t xml:space="preserve"> </w:t>
-      </w:r>
-      <w:r>
-        <w:t>wildlife</w:t>
-      </w:r>
-      <w:r>
-        <w:rPr>
-          <w:spacing w:val="-6"/>
-        </w:rPr>
-        <w:t xml:space="preserve"> </w:t>
-      </w:r>
-      <w:r>
-        <w:t>information</w:t>
-      </w:r>
-      <w:r>
-        <w:rPr>
-          <w:spacing w:val="-7"/>
-        </w:rPr>
-        <w:t xml:space="preserve"> </w:t>
-      </w:r>
-      <w:r>
-        <w:t>can</w:t>
-      </w:r>
-      <w:r>
-        <w:rPr>
-          <w:spacing w:val="-7"/>
-        </w:rPr>
-        <w:t xml:space="preserve"> </w:t>
-      </w:r>
-      <w:r>
-        <w:t>be</w:t>
-      </w:r>
-      <w:r>
-        <w:rPr>
-          <w:spacing w:val="-7"/>
-        </w:rPr>
-        <w:t xml:space="preserve"> </w:t>
-      </w:r>
-      <w:r>
-        <w:t>found.</w:t>
-      </w:r>
-      <w:r>
-        <w:rPr>
-          <w:spacing w:val="-5"/>
-        </w:rPr>
-        <w:t xml:space="preserve"> </w:t>
-      </w:r>
-      <w:r>
-        <w:t>In</w:t>
-      </w:r>
-      <w:r>
-        <w:rPr>
-          <w:spacing w:val="-6"/>
-        </w:rPr>
-        <w:t xml:space="preserve"> </w:t>
-      </w:r>
-      <w:r>
-        <w:t>Pakistan</w:t>
-      </w:r>
-      <w:r>
-        <w:rPr>
-          <w:spacing w:val="-7"/>
-        </w:rPr>
-        <w:t xml:space="preserve"> </w:t>
-      </w:r>
-      <w:r>
-        <w:t>and many other countries, wildlife data is usually stored in reports, spreadsheets, notebooks, and paper records. Because of this, it becomes difficult for researchers, Doctors, and government agencies to access and use the information.</w:t>
+        <w:t xml:space="preserve"> difficult for researchers, Doctors, and government </w:t>
+      </w:r>
+      <w:r>
+        <w:t xml:space="preserve">and other </w:t>
+      </w:r>
+      <w:r>
+        <w:t>agencies to access and use the information.</w:t>
       </w:r>
     </w:p>
     <w:p>
@@ -2366,7 +2431,35 @@
         <w:jc w:val="both"/>
       </w:pPr>
       <w:r>
-        <w:t>To solve this problem, Our System the Wildlife Information System (WIS) is proposed. WIS is a centralized system that stores all wildlife data in one organized database. Users can easily access and share information through an API, making wildlife research and conservation more efficient.</w:t>
+        <w:t xml:space="preserve">Our </w:t>
+      </w:r>
+      <w:proofErr w:type="gramStart"/>
+      <w:r>
+        <w:t>System</w:t>
+      </w:r>
+      <w:proofErr w:type="gramEnd"/>
+      <w:r>
+        <w:t xml:space="preserve"> the Wildlife Information System (WIS) is proposed</w:t>
+      </w:r>
+      <w:r>
+        <w:t xml:space="preserve"> for solving this problem</w:t>
+      </w:r>
+      <w:r>
+        <w:t>. WIS is a centralized system that</w:t>
+      </w:r>
+      <w:r>
+        <w:t xml:space="preserve"> can</w:t>
+      </w:r>
+      <w:r>
+        <w:t xml:space="preserve"> </w:t>
+      </w:r>
+      <w:proofErr w:type="gramStart"/>
+      <w:r>
+        <w:t>stores</w:t>
+      </w:r>
+      <w:proofErr w:type="gramEnd"/>
+      <w:r>
+        <w:t xml:space="preserve"> all wildlife data in one organized database. Users can easily access and share information through an API, making wildlife research and conservation more efficient.</w:t>
       </w:r>
       <w:r>
         <w:t xml:space="preserve"> And shows the real time simulation of animals and health records. </w:t>
@@ -2442,10 +2535,7 @@
       </w:r>
       <w:proofErr w:type="gramEnd"/>
       <w:r>
-        <w:t xml:space="preserve"> </w:t>
-      </w:r>
-      <w:r>
-        <w:t>wildlife</w:t>
+        <w:t xml:space="preserve"> wildlife</w:t>
       </w:r>
       <w:r>
         <w:rPr>
@@ -9302,7 +9392,7 @@
         </mc:Choice>
         <mc:Fallback>
           <w:pict>
-            <v:shape w14:anchorId="2B8B5074" id="Graphic 3" o:spid="_x0000_s1026" style="position:absolute;margin-left:70.6pt;margin-top:744.35pt;width:470.95pt;height:.5pt;z-index:-15900672;visibility:visible;mso-wrap-style:square;mso-wrap-distance-left:0;mso-wrap-distance-top:0;mso-wrap-distance-right:0;mso-wrap-distance-bottom:0;mso-position-horizontal:absolute;mso-position-horizontal-relative:page;mso-position-vertical:absolute;mso-position-vertical-relative:page;v-text-anchor:top" coordsize="5981065,6350" o:gfxdata="UEsDBBQABgAIAAAAIQC2gziS/gAAAOEBAAATAAAAW0NvbnRlbnRfVHlwZXNdLnhtbJSRQU7DMBBF&#10;90jcwfIWJU67QAgl6YK0S0CoHGBkTxKLZGx5TGhvj5O2G0SRWNoz/78nu9wcxkFMGNg6quQqL6RA&#10;0s5Y6ir5vt9lD1JwBDIwOMJKHpHlpr69KfdHjyxSmriSfYz+USnWPY7AufNIadK6MEJMx9ApD/oD&#10;OlTrorhX2lFEilmcO2RdNtjC5xDF9pCuTyYBB5bi6bQ4syoJ3g9WQ0ymaiLzg5KdCXlKLjvcW893&#10;SUOqXwnz5DrgnHtJTxOsQfEKIT7DmDSUCaxw7Rqn8787ZsmRM9e2VmPeBN4uqYvTtW7jvijg9N/y&#10;JsXecLq0q+WD6m8AAAD//wMAUEsDBBQABgAIAAAAIQA4/SH/1gAAAJQBAAALAAAAX3JlbHMvLnJl&#10;bHOkkMFqwzAMhu+DvYPRfXGawxijTi+j0GvpHsDYimMaW0Yy2fr2M4PBMnrbUb/Q94l/f/hMi1qR&#10;JVI2sOt6UJgd+ZiDgffL8ekFlFSbvV0oo4EbChzGx4f9GRdb25HMsYhqlCwG5lrLq9biZkxWOiqY&#10;22YiTra2kYMu1l1tQD30/bPm3wwYN0x18gb45AdQl1tp5j/sFB2T0FQ7R0nTNEV3j6o9feQzro1i&#10;OWA14Fm+Q8a1a8+Bvu/d/dMb2JY5uiPbhG/ktn4cqGU/er3pcvwCAAD//wMAUEsDBBQABgAIAAAA&#10;IQC9X+9CIgIAAL0EAAAOAAAAZHJzL2Uyb0RvYy54bWysVMFu2zAMvQ/YPwi6L3YyJGuNOMXWoMOA&#10;oivQDDsrshwbk01NVGLn70fJlmtspw27SJT5RD0+kt7e9Y1mF2Wxhjbny0XKmWolFHV7yvm3w8O7&#10;G87QibYQGlqV86tCfrd7+2bbmUytoAJdKMsoSItZZ3JeOWeyJEFZqUbgAoxqyVmCbYSjoz0lhRUd&#10;RW90skrTTdKBLYwFqRDp635w8l2IX5ZKuq9licoxnXPi5sJqw3r0a7LbiuxkhalqOdIQ/8CiEXVL&#10;j06h9sIJdrb1H6GaWlpAKN1CQpNAWdZShRwom2X6WzYvlTAq5ELioJlkwv8XVj5dXsyz9dTRPIL8&#10;gaRI0hnMJo8/4IjpS9t4LBFnfVDxOqmoesckfVzf3izTzZozSb7N+3UQORFZvCvP6D4rCHHE5RHd&#10;UIMiWqKKluzbaFqqpK+hDjV0nFENLWdUw+NQQyOcv+fJeZN1MyLVyMM7G7ioAwSY8ylMbGMixPQV&#10;o9s5lhpohoq+uJsQb8Bs0tu150XBojvuA2z+7F+Bo5oxnNSAanjJ5x2enLSg5+dqI+i6eKi19umj&#10;PR3vtWUXQbKu9h/WnzYj4xksdMJQfN8GRyiuz5Z1NC85x59nYRVn+ktLDemHKxo2GsdoWKfvIYxg&#10;UN6iO/TfhTXMkJlzR73zBLHdRRbbgvh7wID1N1v4eHZQ1r5nAreB0XigGQn5j/Psh3B+DqjXv87u&#10;FwAAAP//AwBQSwMEFAAGAAgAAAAhAMebASLhAAAADgEAAA8AAABkcnMvZG93bnJldi54bWxMj0FP&#10;wzAMhe9I/IfISFzQlrZjWylNJ4Q0TRwZ48DNbU1T0Tilybbu35NygZuf/fT8vXwzmk6caHCtZQXx&#10;PAJBXNm65UbB4W07S0E4j1xjZ5kUXMjBpri+yjGr7Zlf6bT3jQgh7DJUoL3vMyldpcmgm9ueONw+&#10;7WDQBzk0sh7wHMJNJ5MoWkmDLYcPGnt61lR97Y9GwWr7TZfFsryzS53gzo4ffvf+otTtzfj0CMLT&#10;6P/MMOEHdCgCU2mPXDvRBX0fJ8E6DWm6BjFZonQRgyh/dw9rkEUu/9cofgAAAP//AwBQSwECLQAU&#10;AAYACAAAACEAtoM4kv4AAADhAQAAEwAAAAAAAAAAAAAAAAAAAAAAW0NvbnRlbnRfVHlwZXNdLnht&#10;bFBLAQItABQABgAIAAAAIQA4/SH/1gAAAJQBAAALAAAAAAAAAAAAAAAAAC8BAABfcmVscy8ucmVs&#10;c1BLAQItABQABgAIAAAAIQC9X+9CIgIAAL0EAAAOAAAAAAAAAAAAAAAAAC4CAABkcnMvZTJvRG9j&#10;LnhtbFBLAQItABQABgAIAAAAIQDHmwEi4QAAAA4BAAAPAAAAAAAAAAAAAAAAAHwEAABkcnMvZG93&#10;bnJldi54bWxQSwUGAAAAAAQABADzAAAAigUAAAAA&#10;" path="m5981065,l,,,6095r5981065,l5981065,xe" fillcolor="#2d75b6" stroked="f">
+            <v:shape w14:anchorId="10B731AE" id="Graphic 3" o:spid="_x0000_s1026" style="position:absolute;margin-left:70.6pt;margin-top:744.35pt;width:470.95pt;height:.5pt;z-index:-15900672;visibility:visible;mso-wrap-style:square;mso-wrap-distance-left:0;mso-wrap-distance-top:0;mso-wrap-distance-right:0;mso-wrap-distance-bottom:0;mso-position-horizontal:absolute;mso-position-horizontal-relative:page;mso-position-vertical:absolute;mso-position-vertical-relative:page;v-text-anchor:top" coordsize="5981065,6350" o:gfxdata="UEsDBBQABgAIAAAAIQC2gziS/gAAAOEBAAATAAAAW0NvbnRlbnRfVHlwZXNdLnhtbJSRQU7DMBBF&#10;90jcwfIWJU67QAgl6YK0S0CoHGBkTxKLZGx5TGhvj5O2G0SRWNoz/78nu9wcxkFMGNg6quQqL6RA&#10;0s5Y6ir5vt9lD1JwBDIwOMJKHpHlpr69KfdHjyxSmriSfYz+USnWPY7AufNIadK6MEJMx9ApD/oD&#10;OlTrorhX2lFEilmcO2RdNtjC5xDF9pCuTyYBB5bi6bQ4syoJ3g9WQ0ymaiLzg5KdCXlKLjvcW893&#10;SUOqXwnz5DrgnHtJTxOsQfEKIT7DmDSUCaxw7Rqn8787ZsmRM9e2VmPeBN4uqYvTtW7jvijg9N/y&#10;JsXecLq0q+WD6m8AAAD//wMAUEsDBBQABgAIAAAAIQA4/SH/1gAAAJQBAAALAAAAX3JlbHMvLnJl&#10;bHOkkMFqwzAMhu+DvYPRfXGawxijTi+j0GvpHsDYimMaW0Yy2fr2M4PBMnrbUb/Q94l/f/hMi1qR&#10;JVI2sOt6UJgd+ZiDgffL8ekFlFSbvV0oo4EbChzGx4f9GRdb25HMsYhqlCwG5lrLq9biZkxWOiqY&#10;22YiTra2kYMu1l1tQD30/bPm3wwYN0x18gb45AdQl1tp5j/sFB2T0FQ7R0nTNEV3j6o9feQzro1i&#10;OWA14Fm+Q8a1a8+Bvu/d/dMb2JY5uiPbhG/ktn4cqGU/er3pcvwCAAD//wMAUEsDBBQABgAIAAAA&#10;IQC9X+9CIgIAAL0EAAAOAAAAZHJzL2Uyb0RvYy54bWysVMFu2zAMvQ/YPwi6L3YyJGuNOMXWoMOA&#10;oivQDDsrshwbk01NVGLn70fJlmtspw27SJT5RD0+kt7e9Y1mF2Wxhjbny0XKmWolFHV7yvm3w8O7&#10;G87QibYQGlqV86tCfrd7+2bbmUytoAJdKMsoSItZZ3JeOWeyJEFZqUbgAoxqyVmCbYSjoz0lhRUd&#10;RW90skrTTdKBLYwFqRDp635w8l2IX5ZKuq9licoxnXPi5sJqw3r0a7LbiuxkhalqOdIQ/8CiEXVL&#10;j06h9sIJdrb1H6GaWlpAKN1CQpNAWdZShRwom2X6WzYvlTAq5ELioJlkwv8XVj5dXsyz9dTRPIL8&#10;gaRI0hnMJo8/4IjpS9t4LBFnfVDxOqmoesckfVzf3izTzZozSb7N+3UQORFZvCvP6D4rCHHE5RHd&#10;UIMiWqKKluzbaFqqpK+hDjV0nFENLWdUw+NQQyOcv+fJeZN1MyLVyMM7G7ioAwSY8ylMbGMixPQV&#10;o9s5lhpohoq+uJsQb8Bs0tu150XBojvuA2z+7F+Bo5oxnNSAanjJ5x2enLSg5+dqI+i6eKi19umj&#10;PR3vtWUXQbKu9h/WnzYj4xksdMJQfN8GRyiuz5Z1NC85x59nYRVn+ktLDemHKxo2GsdoWKfvIYxg&#10;UN6iO/TfhTXMkJlzR73zBLHdRRbbgvh7wID1N1v4eHZQ1r5nAreB0XigGQn5j/Psh3B+DqjXv87u&#10;FwAAAP//AwBQSwMEFAAGAAgAAAAhAMebASLhAAAADgEAAA8AAABkcnMvZG93bnJldi54bWxMj0FP&#10;wzAMhe9I/IfISFzQlrZjWylNJ4Q0TRwZ48DNbU1T0Tilybbu35NygZuf/fT8vXwzmk6caHCtZQXx&#10;PAJBXNm65UbB4W07S0E4j1xjZ5kUXMjBpri+yjGr7Zlf6bT3jQgh7DJUoL3vMyldpcmgm9ueONw+&#10;7WDQBzk0sh7wHMJNJ5MoWkmDLYcPGnt61lR97Y9GwWr7TZfFsryzS53gzo4ffvf+otTtzfj0CMLT&#10;6P/MMOEHdCgCU2mPXDvRBX0fJ8E6DWm6BjFZonQRgyh/dw9rkEUu/9cofgAAAP//AwBQSwECLQAU&#10;AAYACAAAACEAtoM4kv4AAADhAQAAEwAAAAAAAAAAAAAAAAAAAAAAW0NvbnRlbnRfVHlwZXNdLnht&#10;bFBLAQItABQABgAIAAAAIQA4/SH/1gAAAJQBAAALAAAAAAAAAAAAAAAAAC8BAABfcmVscy8ucmVs&#10;c1BLAQItABQABgAIAAAAIQC9X+9CIgIAAL0EAAAOAAAAAAAAAAAAAAAAAC4CAABkcnMvZTJvRG9j&#10;LnhtbFBLAQItABQABgAIAAAAIQDHmwEi4QAAAA4BAAAPAAAAAAAAAAAAAAAAAHwEAABkcnMvZG93&#10;bnJldi54bWxQSwUGAAAAAAQABADzAAAAigUAAAAA&#10;" path="m5981065,l,,,6095r5981065,l5981065,xe" fillcolor="#2d75b6" stroked="f">
               <v:path arrowok="t"/>
               <w10:wrap anchorx="page" anchory="page"/>
             </v:shape>
@@ -9638,7 +9728,7 @@
         </mc:Choice>
         <mc:Fallback>
           <w:pict>
-            <v:shape w14:anchorId="10DE95AF" id="Graphic 1" o:spid="_x0000_s1026" style="position:absolute;margin-left:70.6pt;margin-top:47.3pt;width:470.95pt;height:.5pt;z-index:-15901696;visibility:visible;mso-wrap-style:square;mso-wrap-distance-left:0;mso-wrap-distance-top:0;mso-wrap-distance-right:0;mso-wrap-distance-bottom:0;mso-position-horizontal:absolute;mso-position-horizontal-relative:page;mso-position-vertical:absolute;mso-position-vertical-relative:page;v-text-anchor:top" coordsize="5981065,6350" o:gfxdata="UEsDBBQABgAIAAAAIQC2gziS/gAAAOEBAAATAAAAW0NvbnRlbnRfVHlwZXNdLnhtbJSRQU7DMBBF&#10;90jcwfIWJU67QAgl6YK0S0CoHGBkTxKLZGx5TGhvj5O2G0SRWNoz/78nu9wcxkFMGNg6quQqL6RA&#10;0s5Y6ir5vt9lD1JwBDIwOMJKHpHlpr69KfdHjyxSmriSfYz+USnWPY7AufNIadK6MEJMx9ApD/oD&#10;OlTrorhX2lFEilmcO2RdNtjC5xDF9pCuTyYBB5bi6bQ4syoJ3g9WQ0ymaiLzg5KdCXlKLjvcW893&#10;SUOqXwnz5DrgnHtJTxOsQfEKIT7DmDSUCaxw7Rqn8787ZsmRM9e2VmPeBN4uqYvTtW7jvijg9N/y&#10;JsXecLq0q+WD6m8AAAD//wMAUEsDBBQABgAIAAAAIQA4/SH/1gAAAJQBAAALAAAAX3JlbHMvLnJl&#10;bHOkkMFqwzAMhu+DvYPRfXGawxijTi+j0GvpHsDYimMaW0Yy2fr2M4PBMnrbUb/Q94l/f/hMi1qR&#10;JVI2sOt6UJgd+ZiDgffL8ekFlFSbvV0oo4EbChzGx4f9GRdb25HMsYhqlCwG5lrLq9biZkxWOiqY&#10;22YiTra2kYMu1l1tQD30/bPm3wwYN0x18gb45AdQl1tp5j/sFB2T0FQ7R0nTNEV3j6o9feQzro1i&#10;OWA14Fm+Q8a1a8+Bvu/d/dMb2JY5uiPbhG/ktn4cqGU/er3pcvwCAAD//wMAUEsDBBQABgAIAAAA&#10;IQDzb1bbIAIAAL0EAAAOAAAAZHJzL2Uyb0RvYy54bWysVMFu2zAMvQ/YPwi6L3YyJGuNOMXWoMOA&#10;oivQDDsrshwbk0VNVOLk70fJkWtspw27SJT5RD0+kl7fnTvNTsphC6bk81nOmTISqtYcSv5t9/Du&#10;hjP0wlRCg1Elvyjkd5u3b9a9LdQCGtCVcoyCGCx6W/LGe1tkGcpGdQJnYJUhZw2uE56O7pBVTvQU&#10;vdPZIs9XWQ+usg6kQqSv28HJNzF+XSvpv9Y1Ks90yYmbj6uL6z6s2WYtioMTtmnllYb4BxadaA09&#10;OobaCi/Y0bV/hOpa6QCh9jMJXQZ13UoVc6Bs5vlv2bw0wqqYC4mDdpQJ/19Y+XR6sc8uUEf7CPIH&#10;kiJZb7EYPeGAV8y5dl3AEnF2jipeRhXV2TNJH5e3N/N8teRMkm/1fhlFzkSR7soj+s8KYhxxekQ/&#10;1KBKlmiSJc8mmY4qGWqoYw09Z1RDxxnVcD/U0Aof7gVywWT9hEhz5RGcHZzUDiLMhxRGtikRYvqK&#10;0WaKpQaaoJIv7TbGGzCr/HYVeFGw5E77AJs++1fgpGYKJzWgGl4KeccnRy3o+anaCLqtHlqtQ/ro&#10;Dvt77dhJkKyL7Yflp8R4AoudMBQ/tMEeqsuzYz3NS8nx51E4xZn+Yqghw3AlwyVjnwzn9T3EEYzK&#10;O/S783fhLLNkltxT7zxBandRpLYg/gEwYMNNAx+PHuo29EzkNjC6HmhGYv7XeQ5DOD1H1OtfZ/ML&#10;AAD//wMAUEsDBBQABgAIAAAAIQD8N6R73gAAAAoBAAAPAAAAZHJzL2Rvd25yZXYueG1sTI/BTsMw&#10;DIbvSLxDZCQuiKXt1mqUphNCmiaODDhwSxvTVDROabKte3u8Exx/+9Pvz9VmdoM44hR6TwrSRQIC&#10;qfWmp07B+9v2fg0iRE1GD55QwRkDbOrrq0qXxp/oFY/72AkuoVBqBTbGsZQytBadDgs/IvHuy09O&#10;R45TJ82kT1zuBpklSSGd7okvWD3is8X2e39wCortD56XeXPnc5vpnZ8/4+7jRanbm/npEUTEOf7B&#10;cNFndajZqfEHMkEMnFdpxqiCh1UB4gIk62UKouFJXoCsK/n/hfoXAAD//wMAUEsBAi0AFAAGAAgA&#10;AAAhALaDOJL+AAAA4QEAABMAAAAAAAAAAAAAAAAAAAAAAFtDb250ZW50X1R5cGVzXS54bWxQSwEC&#10;LQAUAAYACAAAACEAOP0h/9YAAACUAQAACwAAAAAAAAAAAAAAAAAvAQAAX3JlbHMvLnJlbHNQSwEC&#10;LQAUAAYACAAAACEA829W2yACAAC9BAAADgAAAAAAAAAAAAAAAAAuAgAAZHJzL2Uyb0RvYy54bWxQ&#10;SwECLQAUAAYACAAAACEA/Deke94AAAAKAQAADwAAAAAAAAAAAAAAAAB6BAAAZHJzL2Rvd25yZXYu&#10;eG1sUEsFBgAAAAAEAAQA8wAAAIUFAAAAAA==&#10;" path="m5981065,l,,,6096r5981065,l5981065,xe" fillcolor="#2d75b6" stroked="f">
+            <v:shape w14:anchorId="5A497DD7" id="Graphic 1" o:spid="_x0000_s1026" style="position:absolute;margin-left:70.6pt;margin-top:47.3pt;width:470.95pt;height:.5pt;z-index:-15901696;visibility:visible;mso-wrap-style:square;mso-wrap-distance-left:0;mso-wrap-distance-top:0;mso-wrap-distance-right:0;mso-wrap-distance-bottom:0;mso-position-horizontal:absolute;mso-position-horizontal-relative:page;mso-position-vertical:absolute;mso-position-vertical-relative:page;v-text-anchor:top" coordsize="5981065,6350" o:gfxdata="UEsDBBQABgAIAAAAIQC2gziS/gAAAOEBAAATAAAAW0NvbnRlbnRfVHlwZXNdLnhtbJSRQU7DMBBF&#10;90jcwfIWJU67QAgl6YK0S0CoHGBkTxKLZGx5TGhvj5O2G0SRWNoz/78nu9wcxkFMGNg6quQqL6RA&#10;0s5Y6ir5vt9lD1JwBDIwOMJKHpHlpr69KfdHjyxSmriSfYz+USnWPY7AufNIadK6MEJMx9ApD/oD&#10;OlTrorhX2lFEilmcO2RdNtjC5xDF9pCuTyYBB5bi6bQ4syoJ3g9WQ0ymaiLzg5KdCXlKLjvcW893&#10;SUOqXwnz5DrgnHtJTxOsQfEKIT7DmDSUCaxw7Rqn8787ZsmRM9e2VmPeBN4uqYvTtW7jvijg9N/y&#10;JsXecLq0q+WD6m8AAAD//wMAUEsDBBQABgAIAAAAIQA4/SH/1gAAAJQBAAALAAAAX3JlbHMvLnJl&#10;bHOkkMFqwzAMhu+DvYPRfXGawxijTi+j0GvpHsDYimMaW0Yy2fr2M4PBMnrbUb/Q94l/f/hMi1qR&#10;JVI2sOt6UJgd+ZiDgffL8ekFlFSbvV0oo4EbChzGx4f9GRdb25HMsYhqlCwG5lrLq9biZkxWOiqY&#10;22YiTra2kYMu1l1tQD30/bPm3wwYN0x18gb45AdQl1tp5j/sFB2T0FQ7R0nTNEV3j6o9feQzro1i&#10;OWA14Fm+Q8a1a8+Bvu/d/dMb2JY5uiPbhG/ktn4cqGU/er3pcvwCAAD//wMAUEsDBBQABgAIAAAA&#10;IQDzb1bbIAIAAL0EAAAOAAAAZHJzL2Uyb0RvYy54bWysVMFu2zAMvQ/YPwi6L3YyJGuNOMXWoMOA&#10;oivQDDsrshwbk0VNVOLk70fJkWtspw27SJT5RD0+kl7fnTvNTsphC6bk81nOmTISqtYcSv5t9/Du&#10;hjP0wlRCg1Elvyjkd5u3b9a9LdQCGtCVcoyCGCx6W/LGe1tkGcpGdQJnYJUhZw2uE56O7pBVTvQU&#10;vdPZIs9XWQ+usg6kQqSv28HJNzF+XSvpv9Y1Ks90yYmbj6uL6z6s2WYtioMTtmnllYb4BxadaA09&#10;OobaCi/Y0bV/hOpa6QCh9jMJXQZ13UoVc6Bs5vlv2bw0wqqYC4mDdpQJ/19Y+XR6sc8uUEf7CPIH&#10;kiJZb7EYPeGAV8y5dl3AEnF2jipeRhXV2TNJH5e3N/N8teRMkm/1fhlFzkSR7soj+s8KYhxxekQ/&#10;1KBKlmiSJc8mmY4qGWqoYw09Z1RDxxnVcD/U0Aof7gVywWT9hEhz5RGcHZzUDiLMhxRGtikRYvqK&#10;0WaKpQaaoJIv7TbGGzCr/HYVeFGw5E77AJs++1fgpGYKJzWgGl4KeccnRy3o+anaCLqtHlqtQ/ro&#10;Dvt77dhJkKyL7Yflp8R4AoudMBQ/tMEeqsuzYz3NS8nx51E4xZn+Yqghw3AlwyVjnwzn9T3EEYzK&#10;O/S783fhLLNkltxT7zxBandRpLYg/gEwYMNNAx+PHuo29EzkNjC6HmhGYv7XeQ5DOD1H1OtfZ/ML&#10;AAD//wMAUEsDBBQABgAIAAAAIQD8N6R73gAAAAoBAAAPAAAAZHJzL2Rvd25yZXYueG1sTI/BTsMw&#10;DIbvSLxDZCQuiKXt1mqUphNCmiaODDhwSxvTVDROabKte3u8Exx/+9Pvz9VmdoM44hR6TwrSRQIC&#10;qfWmp07B+9v2fg0iRE1GD55QwRkDbOrrq0qXxp/oFY/72AkuoVBqBTbGsZQytBadDgs/IvHuy09O&#10;R45TJ82kT1zuBpklSSGd7okvWD3is8X2e39wCortD56XeXPnc5vpnZ8/4+7jRanbm/npEUTEOf7B&#10;cNFndajZqfEHMkEMnFdpxqiCh1UB4gIk62UKouFJXoCsK/n/hfoXAAD//wMAUEsBAi0AFAAGAAgA&#10;AAAhALaDOJL+AAAA4QEAABMAAAAAAAAAAAAAAAAAAAAAAFtDb250ZW50X1R5cGVzXS54bWxQSwEC&#10;LQAUAAYACAAAACEAOP0h/9YAAACUAQAACwAAAAAAAAAAAAAAAAAvAQAAX3JlbHMvLnJlbHNQSwEC&#10;LQAUAAYACAAAACEA829W2yACAAC9BAAADgAAAAAAAAAAAAAAAAAuAgAAZHJzL2Uyb0RvYy54bWxQ&#10;SwECLQAUAAYACAAAACEA/Deke94AAAAKAQAADwAAAAAAAAAAAAAAAAB6BAAAZHJzL2Rvd25yZXYu&#10;eG1sUEsFBgAAAAAEAAQA8wAAAIUFAAAAAA==&#10;" path="m5981065,l,,,6096r5981065,l5981065,xe" fillcolor="#2d75b6" stroked="f">
               <v:path arrowok="t"/>
               <w10:wrap anchorx="page" anchory="page"/>
             </v:shape>

</xml_diff>

<commit_message>
Docs: Complete Chapter 1 after improvement
</commit_message>
<xml_diff>
--- a/documentation/srs/1-introduction/srs_ch1_introduction.docx
+++ b/documentation/srs/1-introduction/srs_ch1_introduction.docx
@@ -2681,8 +2681,28 @@
         <w:spacing w:before="39"/>
         <w:ind w:right="719" w:firstLine="0"/>
       </w:pPr>
-      <w:r>
-        <w:t>Research universities collect data during research or field trips and store it in local</w:t>
+      <w:proofErr w:type="gramStart"/>
+      <w:r>
+        <w:t>Research</w:t>
+      </w:r>
+      <w:r>
+        <w:t>ing</w:t>
+      </w:r>
+      <w:proofErr w:type="gramEnd"/>
+      <w:r>
+        <w:t xml:space="preserve"> universities collect</w:t>
+      </w:r>
+      <w:r>
+        <w:t xml:space="preserve"> the</w:t>
+      </w:r>
+      <w:r>
+        <w:t xml:space="preserve"> data during research or field trips and store </w:t>
+      </w:r>
+      <w:r>
+        <w:t xml:space="preserve">or save </w:t>
+      </w:r>
+      <w:r>
+        <w:t>it in local</w:t>
       </w:r>
       <w:r>
         <w:rPr>
@@ -2705,8 +2725,12 @@
           <w:tab w:val="left" w:pos="1754"/>
         </w:tabs>
         <w:spacing w:before="41"/>
-        <w:ind w:right="719" w:firstLine="0"/>
-      </w:pPr>
+        <w:ind w:right="720" w:firstLine="0"/>
+        <w:contextualSpacing/>
+      </w:pPr>
+      <w:r>
+        <w:t xml:space="preserve">Other organizations like </w:t>
+      </w:r>
       <w:r>
         <w:t>International</w:t>
       </w:r>
@@ -2716,17 +2740,19 @@
         </w:rPr>
         <w:t xml:space="preserve"> </w:t>
       </w:r>
-      <w:r>
-        <w:t>conservation</w:t>
-      </w:r>
+      <w:proofErr w:type="gramStart"/>
       <w:r>
         <w:rPr>
           <w:spacing w:val="40"/>
         </w:rPr>
-        <w:t xml:space="preserve"> </w:t>
-      </w:r>
-      <w:r>
-        <w:t>organizations</w:t>
+        <w:t>as ”</w:t>
+      </w:r>
+      <w:r>
+        <w:t>WWF</w:t>
+      </w:r>
+      <w:proofErr w:type="gramEnd"/>
+      <w:r>
+        <w:t>”</w:t>
       </w:r>
       <w:r>
         <w:rPr>
@@ -2735,7 +2761,7 @@
         <w:t xml:space="preserve"> </w:t>
       </w:r>
       <w:r>
-        <w:t>like</w:t>
+        <w:t>and</w:t>
       </w:r>
       <w:r>
         <w:rPr>
@@ -2744,25 +2770,16 @@
         <w:t xml:space="preserve"> </w:t>
       </w:r>
       <w:r>
-        <w:t>WWF</w:t>
-      </w:r>
-      <w:r>
         <w:rPr>
           <w:spacing w:val="40"/>
         </w:rPr>
-        <w:t xml:space="preserve"> </w:t>
-      </w:r>
-      <w:r>
-        <w:t>and</w:t>
-      </w:r>
-      <w:r>
-        <w:rPr>
-          <w:spacing w:val="40"/>
-        </w:rPr>
-        <w:t xml:space="preserve"> </w:t>
+        <w:t>“</w:t>
       </w:r>
       <w:r>
         <w:t>IUCN</w:t>
+      </w:r>
+      <w:r>
+        <w:t>”</w:t>
       </w:r>
       <w:r>
         <w:rPr>
@@ -2797,7 +2814,57 @@
         <w:ind w:right="719" w:firstLine="0"/>
       </w:pPr>
       <w:r>
-        <w:t>Some IoT based systems track animal movement using GPS collars, but this data is kept private and not shared in public platforms.</w:t>
+        <w:t xml:space="preserve">And </w:t>
+      </w:r>
+      <w:r>
+        <w:t xml:space="preserve">Some IoT based systems </w:t>
+      </w:r>
+      <w:r>
+        <w:t xml:space="preserve">which </w:t>
+      </w:r>
+      <w:proofErr w:type="gramStart"/>
+      <w:r>
+        <w:t>track</w:t>
+      </w:r>
+      <w:r>
+        <w:t>s</w:t>
+      </w:r>
+      <w:proofErr w:type="gramEnd"/>
+      <w:r>
+        <w:t xml:space="preserve"> animal movement using GPS collars, but th</w:t>
+      </w:r>
+      <w:r>
+        <w:t>at</w:t>
+      </w:r>
+      <w:r>
+        <w:t xml:space="preserve"> </w:t>
+      </w:r>
+      <w:proofErr w:type="gramStart"/>
+      <w:r>
+        <w:t>data  kept</w:t>
+      </w:r>
+      <w:proofErr w:type="gramEnd"/>
+      <w:r>
+        <w:t xml:space="preserve"> private and</w:t>
+      </w:r>
+      <w:r>
+        <w:t xml:space="preserve"> which </w:t>
+      </w:r>
+      <w:proofErr w:type="gramStart"/>
+      <w:r>
+        <w:t>did</w:t>
+      </w:r>
+      <w:proofErr w:type="gramEnd"/>
+      <w:r>
+        <w:t xml:space="preserve"> not </w:t>
+      </w:r>
+      <w:proofErr w:type="gramStart"/>
+      <w:r>
+        <w:t>shared</w:t>
+      </w:r>
+      <w:proofErr w:type="gramEnd"/>
+      <w:r>
+        <w:t xml:space="preserve"> in public platforms.</w:t>
       </w:r>
     </w:p>
     <w:p>
@@ -5924,7 +5991,7 @@
         <w:t xml:space="preserve"> </w:t>
       </w:r>
       <w:r>
-        <w:t>using</w:t>
+        <w:t>with</w:t>
       </w:r>
       <w:r>
         <w:rPr>
@@ -5950,9 +6017,11 @@
         </w:rPr>
         <w:t xml:space="preserve"> </w:t>
       </w:r>
+      <w:proofErr w:type="gramStart"/>
       <w:r>
         <w:t>approach</w:t>
       </w:r>
+      <w:proofErr w:type="gramEnd"/>
       <w:r>
         <w:rPr>
           <w:spacing w:val="-3"/>
@@ -5960,7 +6029,11 @@
         <w:t xml:space="preserve"> </w:t>
       </w:r>
       <w:r>
-        <w:t>with</w:t>
+        <w:t xml:space="preserve">and everything </w:t>
+      </w:r>
+      <w:proofErr w:type="gramStart"/>
+      <w:r>
+        <w:t xml:space="preserve">is </w:t>
       </w:r>
       <w:r>
         <w:rPr>
@@ -5971,6 +6044,7 @@
       <w:r>
         <w:t>clearly</w:t>
       </w:r>
+      <w:proofErr w:type="gramEnd"/>
       <w:r>
         <w:rPr>
           <w:spacing w:val="-2"/>
@@ -5985,6 +6059,12 @@
           <w:spacing w:val="-3"/>
         </w:rPr>
         <w:t xml:space="preserve"> </w:t>
+      </w:r>
+      <w:r>
+        <w:rPr>
+          <w:spacing w:val="-3"/>
+        </w:rPr>
+        <w:t xml:space="preserve">in </w:t>
       </w:r>
       <w:r>
         <w:t>phases, responsibilities, and timelines.</w:t>
@@ -6762,6 +6842,13 @@
               </w:rPr>
               <w:t>review</w:t>
             </w:r>
+            <w:r>
+              <w:rPr>
+                <w:spacing w:val="-2"/>
+                <w:sz w:val="20"/>
+              </w:rPr>
+              <w:t>/Testing</w:t>
+            </w:r>
           </w:p>
         </w:tc>
         <w:tc>
@@ -6817,7 +6904,36 @@
         <w:ind w:left="360" w:right="826"/>
       </w:pPr>
       <w:r>
-        <w:t>The</w:t>
+        <w:t xml:space="preserve">We will use </w:t>
+      </w:r>
+      <w:proofErr w:type="gramStart"/>
+      <w:r>
+        <w:t>the tools</w:t>
+      </w:r>
+      <w:proofErr w:type="gramEnd"/>
+      <w:r>
+        <w:t xml:space="preserve"> like </w:t>
+      </w:r>
+      <w:r>
+        <w:t>GitHub</w:t>
+      </w:r>
+      <w:r>
+        <w:rPr>
+          <w:spacing w:val="-5"/>
+        </w:rPr>
+        <w:t xml:space="preserve"> </w:t>
+      </w:r>
+      <w:r>
+        <w:t>for</w:t>
+      </w:r>
+      <w:r>
+        <w:rPr>
+          <w:spacing w:val="-2"/>
+        </w:rPr>
+        <w:t xml:space="preserve"> </w:t>
+      </w:r>
+      <w:r>
+        <w:t>version</w:t>
       </w:r>
       <w:r>
         <w:rPr>
@@ -6826,7 +6942,57 @@
         <w:t xml:space="preserve"> </w:t>
       </w:r>
       <w:r>
-        <w:t>Tools</w:t>
+        <w:t>control,</w:t>
+      </w:r>
+      <w:r>
+        <w:rPr>
+          <w:spacing w:val="-4"/>
+        </w:rPr>
+        <w:t xml:space="preserve"> </w:t>
+      </w:r>
+      <w:r>
+        <w:t>WhatsApp</w:t>
+      </w:r>
+      <w:r>
+        <w:rPr>
+          <w:spacing w:val="-3"/>
+        </w:rPr>
+        <w:t xml:space="preserve"> </w:t>
+      </w:r>
+      <w:r>
+        <w:t>and</w:t>
+      </w:r>
+      <w:r>
+        <w:rPr>
+          <w:spacing w:val="-3"/>
+        </w:rPr>
+        <w:t xml:space="preserve"> </w:t>
+      </w:r>
+      <w:r>
+        <w:t xml:space="preserve">Physical </w:t>
+      </w:r>
+      <w:r>
+        <w:t xml:space="preserve">or online </w:t>
+      </w:r>
+      <w:proofErr w:type="gramStart"/>
+      <w:r>
+        <w:t>meeting</w:t>
+      </w:r>
+      <w:proofErr w:type="gramEnd"/>
+      <w:r>
+        <w:t xml:space="preserve"> </w:t>
+      </w:r>
+      <w:r>
+        <w:t>for</w:t>
+      </w:r>
+      <w:r>
+        <w:rPr>
+          <w:spacing w:val="-4"/>
+        </w:rPr>
+        <w:t xml:space="preserve"> </w:t>
+      </w:r>
+      <w:r>
+        <w:t>team</w:t>
       </w:r>
       <w:r>
         <w:rPr>
@@ -6835,105 +7001,25 @@
         <w:t xml:space="preserve"> </w:t>
       </w:r>
       <w:r>
-        <w:t>used:</w:t>
-      </w:r>
-      <w:r>
-        <w:rPr>
-          <w:spacing w:val="-4"/>
-        </w:rPr>
-        <w:t xml:space="preserve"> </w:t>
-      </w:r>
-      <w:r>
-        <w:t>GitHub</w:t>
-      </w:r>
-      <w:r>
-        <w:rPr>
-          <w:spacing w:val="-5"/>
-        </w:rPr>
-        <w:t xml:space="preserve"> </w:t>
-      </w:r>
-      <w:r>
-        <w:t>for</w:t>
+        <w:t xml:space="preserve">communication, and Google Docs for shared documentation. Weekly meetings every Saturday to </w:t>
+      </w:r>
+      <w:r>
+        <w:t>check</w:t>
+      </w:r>
+      <w:r>
+        <w:t xml:space="preserve"> </w:t>
       </w:r>
       <w:r>
         <w:rPr>
           <w:spacing w:val="-2"/>
         </w:rPr>
-        <w:t xml:space="preserve"> </w:t>
-      </w:r>
-      <w:r>
-        <w:t>version</w:t>
-      </w:r>
-      <w:r>
-        <w:rPr>
-          <w:spacing w:val="-3"/>
-        </w:rPr>
-        <w:t xml:space="preserve"> </w:t>
-      </w:r>
-      <w:r>
-        <w:t>control,</w:t>
-      </w:r>
-      <w:r>
-        <w:rPr>
-          <w:spacing w:val="-4"/>
-        </w:rPr>
-        <w:t xml:space="preserve"> </w:t>
-      </w:r>
-      <w:r>
-        <w:t>WhatsApp</w:t>
-      </w:r>
-      <w:r>
-        <w:rPr>
-          <w:spacing w:val="-3"/>
-        </w:rPr>
-        <w:t xml:space="preserve"> </w:t>
-      </w:r>
-      <w:r>
-        <w:t>and</w:t>
-      </w:r>
-      <w:r>
-        <w:rPr>
-          <w:spacing w:val="-3"/>
-        </w:rPr>
-        <w:t xml:space="preserve"> </w:t>
-      </w:r>
-      <w:r>
-        <w:t xml:space="preserve">Physical </w:t>
-      </w:r>
-      <w:proofErr w:type="gramStart"/>
-      <w:r>
-        <w:t>meeting</w:t>
-      </w:r>
-      <w:proofErr w:type="gramEnd"/>
-      <w:r>
-        <w:t xml:space="preserve"> </w:t>
-      </w:r>
-      <w:r>
-        <w:t>for</w:t>
-      </w:r>
-      <w:r>
-        <w:rPr>
-          <w:spacing w:val="-4"/>
-        </w:rPr>
-        <w:t xml:space="preserve"> </w:t>
-      </w:r>
-      <w:r>
-        <w:t>team</w:t>
+        <w:t>progress.</w:t>
       </w:r>
       <w:r>
         <w:rPr>
           <w:spacing w:val="-2"/>
         </w:rPr>
-        <w:t xml:space="preserve"> </w:t>
-      </w:r>
-      <w:r>
-        <w:t xml:space="preserve">communication, and Google Docs for shared documentation. Weekly meetings every Saturday to review </w:t>
-      </w:r>
-      <w:r>
-        <w:rPr>
-          <w:spacing w:val="-2"/>
-        </w:rPr>
-        <w:t>progress.</w:t>
+        <w:t xml:space="preserve"> And discuss. </w:t>
       </w:r>
     </w:p>
     <w:p>
@@ -7113,20 +7199,6 @@
               </w:rPr>
               <w:t>Backend</w:t>
             </w:r>
-            <w:r>
-              <w:rPr>
-                <w:spacing w:val="-11"/>
-                <w:sz w:val="20"/>
-              </w:rPr>
-              <w:t xml:space="preserve"> </w:t>
-            </w:r>
-            <w:r>
-              <w:rPr>
-                <w:spacing w:val="-2"/>
-                <w:sz w:val="20"/>
-              </w:rPr>
-              <w:t>Framework</w:t>
-            </w:r>
           </w:p>
         </w:tc>
         <w:tc>
@@ -7151,7 +7223,7 @@
               <w:rPr>
                 <w:sz w:val="20"/>
               </w:rPr>
-              <w:t>Node.js</w:t>
+              <w:t>Nodejs</w:t>
             </w:r>
             <w:r>
               <w:rPr>
@@ -7173,479 +7245,13 @@
               </w:rPr>
               <w:t xml:space="preserve"> </w:t>
             </w:r>
+            <w:proofErr w:type="spellStart"/>
             <w:r>
               <w:rPr>
                 <w:spacing w:val="-2"/>
                 <w:sz w:val="20"/>
               </w:rPr>
-              <w:t>Express.js</w:t>
-            </w:r>
-          </w:p>
-        </w:tc>
-      </w:tr>
-      <w:tr>
-        <w:trPr>
-          <w:trHeight w:val="330"/>
-        </w:trPr>
-        <w:tc>
-          <w:tcPr>
-            <w:tcW w:w="3601" w:type="dxa"/>
-            <w:tcBorders>
-              <w:top w:val="single" w:sz="8" w:space="0" w:color="CCCCCC"/>
-              <w:left w:val="single" w:sz="8" w:space="0" w:color="CCCCCC"/>
-              <w:bottom w:val="single" w:sz="8" w:space="0" w:color="CCCCCC"/>
-              <w:right w:val="single" w:sz="8" w:space="0" w:color="CCCCCC"/>
-            </w:tcBorders>
-            <w:shd w:val="clear" w:color="auto" w:fill="EFF4F8"/>
-          </w:tcPr>
-          <w:p>
-            <w:pPr>
-              <w:pStyle w:val="TableParagraph"/>
-              <w:spacing w:before="40"/>
-              <w:rPr>
-                <w:sz w:val="20"/>
-              </w:rPr>
-            </w:pPr>
-            <w:r>
-              <w:rPr>
-                <w:spacing w:val="-2"/>
-                <w:sz w:val="20"/>
-              </w:rPr>
-              <w:t>Database</w:t>
-            </w:r>
-          </w:p>
-        </w:tc>
-        <w:tc>
-          <w:tcPr>
-            <w:tcW w:w="5761" w:type="dxa"/>
-            <w:tcBorders>
-              <w:top w:val="single" w:sz="8" w:space="0" w:color="CCCCCC"/>
-              <w:left w:val="single" w:sz="8" w:space="0" w:color="CCCCCC"/>
-              <w:bottom w:val="single" w:sz="8" w:space="0" w:color="CCCCCC"/>
-              <w:right w:val="single" w:sz="8" w:space="0" w:color="CCCCCC"/>
-            </w:tcBorders>
-            <w:shd w:val="clear" w:color="auto" w:fill="EFF4F8"/>
-          </w:tcPr>
-          <w:p>
-            <w:pPr>
-              <w:pStyle w:val="TableParagraph"/>
-              <w:spacing w:before="40"/>
-              <w:ind w:left="99"/>
-              <w:rPr>
-                <w:sz w:val="20"/>
-              </w:rPr>
-            </w:pPr>
-            <w:r>
-              <w:rPr>
-                <w:sz w:val="20"/>
-              </w:rPr>
-              <w:t>PostgreSQL</w:t>
-            </w:r>
-            <w:r>
-              <w:rPr>
-                <w:spacing w:val="-12"/>
-                <w:sz w:val="20"/>
-              </w:rPr>
-              <w:t xml:space="preserve"> </w:t>
-            </w:r>
-            <w:r>
-              <w:rPr>
-                <w:sz w:val="20"/>
-              </w:rPr>
-              <w:t>(relational,</w:t>
-            </w:r>
-            <w:r>
-              <w:rPr>
-                <w:spacing w:val="-9"/>
-                <w:sz w:val="20"/>
-              </w:rPr>
-              <w:t xml:space="preserve"> </w:t>
-            </w:r>
-            <w:r>
-              <w:rPr>
-                <w:sz w:val="20"/>
-              </w:rPr>
-              <w:t>for</w:t>
-            </w:r>
-            <w:r>
-              <w:rPr>
-                <w:spacing w:val="-9"/>
-                <w:sz w:val="20"/>
-              </w:rPr>
-              <w:t xml:space="preserve"> </w:t>
-            </w:r>
-            <w:r>
-              <w:rPr>
-                <w:sz w:val="20"/>
-              </w:rPr>
-              <w:t>structured</w:t>
-            </w:r>
-            <w:r>
-              <w:rPr>
-                <w:spacing w:val="-11"/>
-                <w:sz w:val="20"/>
-              </w:rPr>
-              <w:t xml:space="preserve"> </w:t>
-            </w:r>
-            <w:r>
-              <w:rPr>
-                <w:spacing w:val="-2"/>
-                <w:sz w:val="20"/>
-              </w:rPr>
-              <w:t>data)</w:t>
-            </w:r>
-          </w:p>
-        </w:tc>
-      </w:tr>
-      <w:tr>
-        <w:trPr>
-          <w:trHeight w:val="330"/>
-        </w:trPr>
-        <w:tc>
-          <w:tcPr>
-            <w:tcW w:w="3601" w:type="dxa"/>
-            <w:tcBorders>
-              <w:top w:val="single" w:sz="8" w:space="0" w:color="CCCCCC"/>
-              <w:left w:val="single" w:sz="8" w:space="0" w:color="CCCCCC"/>
-              <w:bottom w:val="single" w:sz="8" w:space="0" w:color="CCCCCC"/>
-              <w:right w:val="single" w:sz="8" w:space="0" w:color="CCCCCC"/>
-            </w:tcBorders>
-          </w:tcPr>
-          <w:p>
-            <w:pPr>
-              <w:pStyle w:val="TableParagraph"/>
-              <w:spacing w:before="40"/>
-              <w:rPr>
-                <w:sz w:val="20"/>
-              </w:rPr>
-            </w:pPr>
-            <w:r>
-              <w:rPr>
-                <w:sz w:val="20"/>
-              </w:rPr>
-              <w:t>API</w:t>
-            </w:r>
-            <w:r>
-              <w:rPr>
-                <w:spacing w:val="-7"/>
-                <w:sz w:val="20"/>
-              </w:rPr>
-              <w:t xml:space="preserve"> </w:t>
-            </w:r>
-            <w:r>
-              <w:rPr>
-                <w:spacing w:val="-4"/>
-                <w:sz w:val="20"/>
-              </w:rPr>
-              <w:t>Type</w:t>
-            </w:r>
-          </w:p>
-        </w:tc>
-        <w:tc>
-          <w:tcPr>
-            <w:tcW w:w="5761" w:type="dxa"/>
-            <w:tcBorders>
-              <w:top w:val="single" w:sz="8" w:space="0" w:color="CCCCCC"/>
-              <w:left w:val="single" w:sz="8" w:space="0" w:color="CCCCCC"/>
-              <w:bottom w:val="single" w:sz="8" w:space="0" w:color="CCCCCC"/>
-              <w:right w:val="single" w:sz="8" w:space="0" w:color="CCCCCC"/>
-            </w:tcBorders>
-          </w:tcPr>
-          <w:p>
-            <w:pPr>
-              <w:pStyle w:val="TableParagraph"/>
-              <w:spacing w:before="40"/>
-              <w:ind w:left="99"/>
-              <w:rPr>
-                <w:sz w:val="20"/>
-              </w:rPr>
-            </w:pPr>
-            <w:r>
-              <w:rPr>
-                <w:sz w:val="20"/>
-              </w:rPr>
-              <w:t>RESTful</w:t>
-            </w:r>
-            <w:r>
-              <w:rPr>
-                <w:spacing w:val="-6"/>
-                <w:sz w:val="20"/>
-              </w:rPr>
-              <w:t xml:space="preserve"> </w:t>
-            </w:r>
-            <w:r>
-              <w:rPr>
-                <w:sz w:val="20"/>
-              </w:rPr>
-              <w:t>API</w:t>
-            </w:r>
-            <w:r>
-              <w:rPr>
-                <w:spacing w:val="-7"/>
-                <w:sz w:val="20"/>
-              </w:rPr>
-              <w:t xml:space="preserve"> </w:t>
-            </w:r>
-            <w:r>
-              <w:rPr>
-                <w:sz w:val="20"/>
-              </w:rPr>
-              <w:t>(JSON</w:t>
-            </w:r>
-            <w:r>
-              <w:rPr>
-                <w:spacing w:val="-7"/>
-                <w:sz w:val="20"/>
-              </w:rPr>
-              <w:t xml:space="preserve"> </w:t>
-            </w:r>
-            <w:r>
-              <w:rPr>
-                <w:spacing w:val="-2"/>
-                <w:sz w:val="20"/>
-              </w:rPr>
-              <w:t>responses)</w:t>
-            </w:r>
-          </w:p>
-        </w:tc>
-      </w:tr>
-      <w:tr>
-        <w:trPr>
-          <w:trHeight w:val="327"/>
-        </w:trPr>
-        <w:tc>
-          <w:tcPr>
-            <w:tcW w:w="3601" w:type="dxa"/>
-            <w:tcBorders>
-              <w:top w:val="single" w:sz="8" w:space="0" w:color="CCCCCC"/>
-              <w:left w:val="single" w:sz="8" w:space="0" w:color="CCCCCC"/>
-              <w:bottom w:val="single" w:sz="8" w:space="0" w:color="CCCCCC"/>
-              <w:right w:val="single" w:sz="8" w:space="0" w:color="CCCCCC"/>
-            </w:tcBorders>
-            <w:shd w:val="clear" w:color="auto" w:fill="EFF4F8"/>
-          </w:tcPr>
-          <w:p>
-            <w:pPr>
-              <w:pStyle w:val="TableParagraph"/>
-              <w:spacing w:before="37"/>
-              <w:rPr>
-                <w:sz w:val="20"/>
-              </w:rPr>
-            </w:pPr>
-            <w:r>
-              <w:rPr>
-                <w:spacing w:val="-2"/>
-                <w:sz w:val="20"/>
-              </w:rPr>
-              <w:t>Authentication</w:t>
-            </w:r>
-          </w:p>
-        </w:tc>
-        <w:tc>
-          <w:tcPr>
-            <w:tcW w:w="5761" w:type="dxa"/>
-            <w:tcBorders>
-              <w:top w:val="single" w:sz="8" w:space="0" w:color="CCCCCC"/>
-              <w:left w:val="single" w:sz="8" w:space="0" w:color="CCCCCC"/>
-              <w:bottom w:val="single" w:sz="8" w:space="0" w:color="CCCCCC"/>
-              <w:right w:val="single" w:sz="8" w:space="0" w:color="CCCCCC"/>
-            </w:tcBorders>
-            <w:shd w:val="clear" w:color="auto" w:fill="EFF4F8"/>
-          </w:tcPr>
-          <w:p>
-            <w:pPr>
-              <w:pStyle w:val="TableParagraph"/>
-              <w:spacing w:before="37"/>
-              <w:ind w:left="99"/>
-              <w:rPr>
-                <w:sz w:val="20"/>
-              </w:rPr>
-            </w:pPr>
-            <w:r>
-              <w:rPr>
-                <w:sz w:val="20"/>
-              </w:rPr>
-              <w:t>JWT</w:t>
-            </w:r>
-            <w:r>
-              <w:rPr>
-                <w:spacing w:val="-5"/>
-                <w:sz w:val="20"/>
-              </w:rPr>
-              <w:t xml:space="preserve"> </w:t>
-            </w:r>
-            <w:r>
-              <w:rPr>
-                <w:sz w:val="20"/>
-              </w:rPr>
-              <w:t>(JSON</w:t>
-            </w:r>
-            <w:r>
-              <w:rPr>
-                <w:spacing w:val="-6"/>
-                <w:sz w:val="20"/>
-              </w:rPr>
-              <w:t xml:space="preserve"> </w:t>
-            </w:r>
-            <w:r>
-              <w:rPr>
-                <w:sz w:val="20"/>
-              </w:rPr>
-              <w:t>Web</w:t>
-            </w:r>
-            <w:r>
-              <w:rPr>
-                <w:spacing w:val="-7"/>
-                <w:sz w:val="20"/>
-              </w:rPr>
-              <w:t xml:space="preserve"> </w:t>
-            </w:r>
-            <w:r>
-              <w:rPr>
-                <w:spacing w:val="-2"/>
-                <w:sz w:val="20"/>
-              </w:rPr>
-              <w:t>Tokens)</w:t>
-            </w:r>
-          </w:p>
-        </w:tc>
-      </w:tr>
-      <w:tr>
-        <w:trPr>
-          <w:trHeight w:val="330"/>
-        </w:trPr>
-        <w:tc>
-          <w:tcPr>
-            <w:tcW w:w="3601" w:type="dxa"/>
-            <w:tcBorders>
-              <w:top w:val="single" w:sz="8" w:space="0" w:color="CCCCCC"/>
-              <w:left w:val="single" w:sz="8" w:space="0" w:color="CCCCCC"/>
-              <w:bottom w:val="single" w:sz="8" w:space="0" w:color="CCCCCC"/>
-              <w:right w:val="single" w:sz="8" w:space="0" w:color="CCCCCC"/>
-            </w:tcBorders>
-          </w:tcPr>
-          <w:p>
-            <w:pPr>
-              <w:pStyle w:val="TableParagraph"/>
-              <w:spacing w:before="40"/>
-              <w:rPr>
-                <w:sz w:val="20"/>
-              </w:rPr>
-            </w:pPr>
-            <w:r>
-              <w:rPr>
-                <w:sz w:val="20"/>
-              </w:rPr>
-              <w:t>Frontend</w:t>
-            </w:r>
-            <w:r>
-              <w:rPr>
-                <w:spacing w:val="-14"/>
-                <w:sz w:val="20"/>
-              </w:rPr>
-              <w:t xml:space="preserve"> </w:t>
-            </w:r>
-            <w:r>
-              <w:rPr>
-                <w:spacing w:val="-2"/>
-                <w:sz w:val="20"/>
-              </w:rPr>
-              <w:t>(basic)</w:t>
-            </w:r>
-          </w:p>
-        </w:tc>
-        <w:tc>
-          <w:tcPr>
-            <w:tcW w:w="5761" w:type="dxa"/>
-            <w:tcBorders>
-              <w:top w:val="single" w:sz="8" w:space="0" w:color="CCCCCC"/>
-              <w:left w:val="single" w:sz="8" w:space="0" w:color="CCCCCC"/>
-              <w:bottom w:val="single" w:sz="8" w:space="0" w:color="CCCCCC"/>
-              <w:right w:val="single" w:sz="8" w:space="0" w:color="CCCCCC"/>
-            </w:tcBorders>
-          </w:tcPr>
-          <w:p>
-            <w:pPr>
-              <w:pStyle w:val="TableParagraph"/>
-              <w:spacing w:before="40"/>
-              <w:ind w:left="99"/>
-              <w:rPr>
-                <w:sz w:val="20"/>
-              </w:rPr>
-            </w:pPr>
-            <w:r>
-              <w:rPr>
-                <w:sz w:val="20"/>
-              </w:rPr>
-              <w:t>HTML,</w:t>
-            </w:r>
-            <w:r>
-              <w:rPr>
-                <w:spacing w:val="-7"/>
-                <w:sz w:val="20"/>
-              </w:rPr>
-              <w:t xml:space="preserve"> </w:t>
-            </w:r>
-            <w:r>
-              <w:rPr>
-                <w:sz w:val="20"/>
-              </w:rPr>
-              <w:t>CSS</w:t>
-            </w:r>
-            <w:r>
-              <w:rPr>
-                <w:sz w:val="20"/>
-              </w:rPr>
-              <w:t>(</w:t>
-            </w:r>
-            <w:proofErr w:type="spellStart"/>
-            <w:r>
-              <w:rPr>
-                <w:sz w:val="20"/>
-              </w:rPr>
-              <w:t>Tailwindcss</w:t>
-            </w:r>
-            <w:proofErr w:type="spellEnd"/>
-            <w:r>
-              <w:rPr>
-                <w:sz w:val="20"/>
-              </w:rPr>
-              <w:t>)</w:t>
-            </w:r>
-            <w:r>
-              <w:rPr>
-                <w:sz w:val="20"/>
-              </w:rPr>
-              <w:t>,</w:t>
-            </w:r>
-            <w:r>
-              <w:rPr>
-                <w:spacing w:val="-7"/>
-                <w:sz w:val="20"/>
-              </w:rPr>
-              <w:t xml:space="preserve"> </w:t>
-            </w:r>
-            <w:r>
-              <w:rPr>
-                <w:spacing w:val="-2"/>
-                <w:sz w:val="20"/>
-              </w:rPr>
-              <w:t>JavaScript</w:t>
-            </w:r>
-            <w:r>
-              <w:rPr>
-                <w:spacing w:val="-2"/>
-                <w:sz w:val="20"/>
-              </w:rPr>
-              <w:t xml:space="preserve">, </w:t>
-            </w:r>
-            <w:proofErr w:type="spellStart"/>
-            <w:r>
-              <w:rPr>
-                <w:spacing w:val="-2"/>
-                <w:sz w:val="20"/>
-              </w:rPr>
-              <w:t>Reactjs</w:t>
+              <w:t>Expressjs</w:t>
             </w:r>
             <w:proofErr w:type="spellEnd"/>
           </w:p>
@@ -7676,23 +7282,10 @@
             </w:pPr>
             <w:r>
               <w:rPr>
-                <w:sz w:val="20"/>
-              </w:rPr>
-              <w:t>Version</w:t>
-            </w:r>
-            <w:r>
-              <w:rPr>
-                <w:spacing w:val="-9"/>
-                <w:sz w:val="20"/>
-              </w:rPr>
-              <w:t xml:space="preserve"> </w:t>
-            </w:r>
-            <w:r>
-              <w:rPr>
                 <w:spacing w:val="-2"/>
                 <w:sz w:val="20"/>
               </w:rPr>
-              <w:t>Control</w:t>
+              <w:t>Database</w:t>
             </w:r>
           </w:p>
         </w:tc>
@@ -7720,34 +7313,7 @@
               <w:rPr>
                 <w:sz w:val="20"/>
               </w:rPr>
-              <w:t>Git</w:t>
-            </w:r>
-            <w:r>
-              <w:rPr>
-                <w:spacing w:val="-4"/>
-                <w:sz w:val="20"/>
-              </w:rPr>
-              <w:t xml:space="preserve"> </w:t>
-            </w:r>
-            <w:r>
-              <w:rPr>
-                <w:sz w:val="20"/>
-              </w:rPr>
-              <w:t>/</w:t>
-            </w:r>
-            <w:r>
-              <w:rPr>
-                <w:spacing w:val="-4"/>
-                <w:sz w:val="20"/>
-              </w:rPr>
-              <w:t xml:space="preserve"> </w:t>
-            </w:r>
-            <w:r>
-              <w:rPr>
-                <w:spacing w:val="-2"/>
-                <w:sz w:val="20"/>
-              </w:rPr>
-              <w:t>GitHub</w:t>
+              <w:t>PostgreSQL</w:t>
             </w:r>
           </w:p>
         </w:tc>
@@ -7778,21 +7344,21 @@
               <w:rPr>
                 <w:sz w:val="20"/>
               </w:rPr>
-              <w:t>Hosting</w:t>
-            </w:r>
-            <w:r>
-              <w:rPr>
-                <w:spacing w:val="-10"/>
+              <w:t>API</w:t>
+            </w:r>
+            <w:r>
+              <w:rPr>
+                <w:spacing w:val="-7"/>
                 <w:sz w:val="20"/>
               </w:rPr>
               <w:t xml:space="preserve"> </w:t>
             </w:r>
             <w:r>
               <w:rPr>
-                <w:spacing w:val="-2"/>
-                <w:sz w:val="20"/>
-              </w:rPr>
-              <w:t>(future)</w:t>
+                <w:spacing w:val="-4"/>
+                <w:sz w:val="20"/>
+              </w:rPr>
+              <w:t>Type</w:t>
             </w:r>
           </w:p>
         </w:tc>
@@ -7819,7 +7385,7 @@
               <w:rPr>
                 <w:sz w:val="20"/>
               </w:rPr>
-              <w:t>Cloud</w:t>
+              <w:t>RESTful</w:t>
             </w:r>
             <w:r>
               <w:rPr>
@@ -7832,11 +7398,11 @@
               <w:rPr>
                 <w:sz w:val="20"/>
               </w:rPr>
-              <w:t>(AWS</w:t>
-            </w:r>
-            <w:r>
-              <w:rPr>
-                <w:spacing w:val="-4"/>
+              <w:t>API</w:t>
+            </w:r>
+            <w:r>
+              <w:rPr>
+                <w:spacing w:val="-7"/>
                 <w:sz w:val="20"/>
               </w:rPr>
               <w:t xml:space="preserve"> </w:t>
@@ -7845,7 +7411,95 @@
               <w:rPr>
                 <w:sz w:val="20"/>
               </w:rPr>
-              <w:t>or</w:t>
+              <w:t>(JSON</w:t>
+            </w:r>
+            <w:r>
+              <w:rPr>
+                <w:spacing w:val="-7"/>
+                <w:sz w:val="20"/>
+              </w:rPr>
+              <w:t xml:space="preserve"> </w:t>
+            </w:r>
+            <w:r>
+              <w:rPr>
+                <w:spacing w:val="-2"/>
+                <w:sz w:val="20"/>
+              </w:rPr>
+              <w:t>responses)</w:t>
+            </w:r>
+          </w:p>
+        </w:tc>
+      </w:tr>
+      <w:tr>
+        <w:trPr>
+          <w:trHeight w:val="327"/>
+        </w:trPr>
+        <w:tc>
+          <w:tcPr>
+            <w:tcW w:w="3601" w:type="dxa"/>
+            <w:tcBorders>
+              <w:top w:val="single" w:sz="8" w:space="0" w:color="CCCCCC"/>
+              <w:left w:val="single" w:sz="8" w:space="0" w:color="CCCCCC"/>
+              <w:bottom w:val="single" w:sz="8" w:space="0" w:color="CCCCCC"/>
+              <w:right w:val="single" w:sz="8" w:space="0" w:color="CCCCCC"/>
+            </w:tcBorders>
+            <w:shd w:val="clear" w:color="auto" w:fill="EFF4F8"/>
+          </w:tcPr>
+          <w:p>
+            <w:pPr>
+              <w:pStyle w:val="TableParagraph"/>
+              <w:spacing w:before="37"/>
+              <w:rPr>
+                <w:sz w:val="20"/>
+              </w:rPr>
+            </w:pPr>
+            <w:r>
+              <w:rPr>
+                <w:spacing w:val="-2"/>
+                <w:sz w:val="20"/>
+              </w:rPr>
+              <w:t>Authentication</w:t>
+            </w:r>
+          </w:p>
+        </w:tc>
+        <w:tc>
+          <w:tcPr>
+            <w:tcW w:w="5761" w:type="dxa"/>
+            <w:tcBorders>
+              <w:top w:val="single" w:sz="8" w:space="0" w:color="CCCCCC"/>
+              <w:left w:val="single" w:sz="8" w:space="0" w:color="CCCCCC"/>
+              <w:bottom w:val="single" w:sz="8" w:space="0" w:color="CCCCCC"/>
+              <w:right w:val="single" w:sz="8" w:space="0" w:color="CCCCCC"/>
+            </w:tcBorders>
+            <w:shd w:val="clear" w:color="auto" w:fill="EFF4F8"/>
+          </w:tcPr>
+          <w:p>
+            <w:pPr>
+              <w:pStyle w:val="TableParagraph"/>
+              <w:spacing w:before="37"/>
+              <w:ind w:left="99"/>
+              <w:rPr>
+                <w:sz w:val="20"/>
+              </w:rPr>
+            </w:pPr>
+            <w:r>
+              <w:rPr>
+                <w:sz w:val="20"/>
+              </w:rPr>
+              <w:t>JWT</w:t>
+            </w:r>
+            <w:r>
+              <w:rPr>
+                <w:spacing w:val="-5"/>
+                <w:sz w:val="20"/>
+              </w:rPr>
+              <w:t xml:space="preserve"> </w:t>
+            </w:r>
+            <w:r>
+              <w:rPr>
+                <w:sz w:val="20"/>
+              </w:rPr>
+              <w:t>(JSON</w:t>
             </w:r>
             <w:r>
               <w:rPr>
@@ -7854,22 +7508,167 @@
               </w:rPr>
               <w:t xml:space="preserve"> </w:t>
             </w:r>
+            <w:r>
+              <w:rPr>
+                <w:sz w:val="20"/>
+              </w:rPr>
+              <w:t>Web</w:t>
+            </w:r>
+            <w:r>
+              <w:rPr>
+                <w:spacing w:val="-7"/>
+                <w:sz w:val="20"/>
+              </w:rPr>
+              <w:t xml:space="preserve"> </w:t>
+            </w:r>
+            <w:r>
+              <w:rPr>
+                <w:spacing w:val="-2"/>
+                <w:sz w:val="20"/>
+              </w:rPr>
+              <w:t>Tokens)</w:t>
+            </w:r>
+          </w:p>
+        </w:tc>
+      </w:tr>
+      <w:tr>
+        <w:trPr>
+          <w:trHeight w:val="330"/>
+        </w:trPr>
+        <w:tc>
+          <w:tcPr>
+            <w:tcW w:w="3601" w:type="dxa"/>
+            <w:tcBorders>
+              <w:top w:val="single" w:sz="8" w:space="0" w:color="CCCCCC"/>
+              <w:left w:val="single" w:sz="8" w:space="0" w:color="CCCCCC"/>
+              <w:bottom w:val="single" w:sz="8" w:space="0" w:color="CCCCCC"/>
+              <w:right w:val="single" w:sz="8" w:space="0" w:color="CCCCCC"/>
+            </w:tcBorders>
+          </w:tcPr>
+          <w:p>
+            <w:pPr>
+              <w:pStyle w:val="TableParagraph"/>
+              <w:spacing w:before="40"/>
+              <w:rPr>
+                <w:sz w:val="20"/>
+              </w:rPr>
+            </w:pPr>
+            <w:r>
+              <w:rPr>
+                <w:sz w:val="20"/>
+              </w:rPr>
+              <w:t>Frontend</w:t>
+            </w:r>
+            <w:r>
+              <w:rPr>
+                <w:spacing w:val="-14"/>
+                <w:sz w:val="20"/>
+              </w:rPr>
+              <w:t xml:space="preserve"> </w:t>
+            </w:r>
+            <w:r>
+              <w:rPr>
+                <w:spacing w:val="-2"/>
+                <w:sz w:val="20"/>
+              </w:rPr>
+              <w:t>(basic)</w:t>
+            </w:r>
+          </w:p>
+        </w:tc>
+        <w:tc>
+          <w:tcPr>
+            <w:tcW w:w="5761" w:type="dxa"/>
+            <w:tcBorders>
+              <w:top w:val="single" w:sz="8" w:space="0" w:color="CCCCCC"/>
+              <w:left w:val="single" w:sz="8" w:space="0" w:color="CCCCCC"/>
+              <w:bottom w:val="single" w:sz="8" w:space="0" w:color="CCCCCC"/>
+              <w:right w:val="single" w:sz="8" w:space="0" w:color="CCCCCC"/>
+            </w:tcBorders>
+          </w:tcPr>
+          <w:p>
+            <w:pPr>
+              <w:pStyle w:val="TableParagraph"/>
+              <w:spacing w:before="40"/>
+              <w:ind w:left="99"/>
+              <w:rPr>
+                <w:sz w:val="20"/>
+              </w:rPr>
+            </w:pPr>
+            <w:r>
+              <w:rPr>
+                <w:sz w:val="20"/>
+              </w:rPr>
+              <w:t>HTML,</w:t>
+            </w:r>
+            <w:r>
+              <w:rPr>
+                <w:spacing w:val="-7"/>
+                <w:sz w:val="20"/>
+              </w:rPr>
+              <w:t xml:space="preserve"> </w:t>
+            </w:r>
+            <w:r>
+              <w:rPr>
+                <w:sz w:val="20"/>
+              </w:rPr>
+              <w:t>CSS</w:t>
+            </w:r>
+            <w:r>
+              <w:rPr>
+                <w:sz w:val="20"/>
+              </w:rPr>
+              <w:t>(</w:t>
+            </w:r>
             <w:proofErr w:type="spellStart"/>
             <w:r>
               <w:rPr>
+                <w:sz w:val="20"/>
+              </w:rPr>
+              <w:t>Tailwindcss</w:t>
+            </w:r>
+            <w:proofErr w:type="spellEnd"/>
+            <w:r>
+              <w:rPr>
+                <w:sz w:val="20"/>
+              </w:rPr>
+              <w:t>)</w:t>
+            </w:r>
+            <w:r>
+              <w:rPr>
+                <w:sz w:val="20"/>
+              </w:rPr>
+              <w:t>,</w:t>
+            </w:r>
+            <w:r>
+              <w:rPr>
+                <w:spacing w:val="-7"/>
+                <w:sz w:val="20"/>
+              </w:rPr>
+              <w:t xml:space="preserve"> </w:t>
+            </w:r>
+            <w:r>
+              <w:rPr>
                 <w:spacing w:val="-2"/>
                 <w:sz w:val="20"/>
               </w:rPr>
-              <w:t>DigitalOcean</w:t>
+              <w:t>JavaScript</w:t>
+            </w:r>
+            <w:r>
+              <w:rPr>
+                <w:spacing w:val="-2"/>
+                <w:sz w:val="20"/>
+              </w:rPr>
+              <w:t xml:space="preserve">, </w:t>
+            </w:r>
+            <w:proofErr w:type="spellStart"/>
+            <w:r>
+              <w:rPr>
+                <w:spacing w:val="-2"/>
+                <w:sz w:val="20"/>
+              </w:rPr>
+              <w:t>Reactjs</w:t>
             </w:r>
             <w:proofErr w:type="spellEnd"/>
-            <w:r>
-              <w:rPr>
-                <w:spacing w:val="-2"/>
-                <w:sz w:val="20"/>
-              </w:rPr>
-              <w:t>)</w:t>
-            </w:r>
           </w:p>
         </w:tc>
       </w:tr>
@@ -7900,11 +7699,11 @@
               <w:rPr>
                 <w:sz w:val="20"/>
               </w:rPr>
-              <w:t>Data</w:t>
-            </w:r>
-            <w:r>
-              <w:rPr>
-                <w:spacing w:val="-10"/>
+              <w:t>Version</w:t>
+            </w:r>
+            <w:r>
+              <w:rPr>
+                <w:spacing w:val="-9"/>
                 <w:sz w:val="20"/>
               </w:rPr>
               <w:t xml:space="preserve"> </w:t>
@@ -7914,7 +7713,7 @@
                 <w:spacing w:val="-2"/>
                 <w:sz w:val="20"/>
               </w:rPr>
-              <w:t>Format</w:t>
+              <w:t>Control</w:t>
             </w:r>
           </w:p>
         </w:tc>
@@ -7942,6 +7741,228 @@
               <w:rPr>
                 <w:sz w:val="20"/>
               </w:rPr>
+              <w:t>Git</w:t>
+            </w:r>
+            <w:r>
+              <w:rPr>
+                <w:spacing w:val="-4"/>
+                <w:sz w:val="20"/>
+              </w:rPr>
+              <w:t xml:space="preserve"> </w:t>
+            </w:r>
+            <w:r>
+              <w:rPr>
+                <w:sz w:val="20"/>
+              </w:rPr>
+              <w:t>/</w:t>
+            </w:r>
+            <w:r>
+              <w:rPr>
+                <w:spacing w:val="-4"/>
+                <w:sz w:val="20"/>
+              </w:rPr>
+              <w:t xml:space="preserve"> </w:t>
+            </w:r>
+            <w:r>
+              <w:rPr>
+                <w:spacing w:val="-2"/>
+                <w:sz w:val="20"/>
+              </w:rPr>
+              <w:t>GitHub</w:t>
+            </w:r>
+          </w:p>
+        </w:tc>
+      </w:tr>
+      <w:tr>
+        <w:trPr>
+          <w:trHeight w:val="330"/>
+        </w:trPr>
+        <w:tc>
+          <w:tcPr>
+            <w:tcW w:w="3601" w:type="dxa"/>
+            <w:tcBorders>
+              <w:top w:val="single" w:sz="8" w:space="0" w:color="CCCCCC"/>
+              <w:left w:val="single" w:sz="8" w:space="0" w:color="CCCCCC"/>
+              <w:bottom w:val="single" w:sz="8" w:space="0" w:color="CCCCCC"/>
+              <w:right w:val="single" w:sz="8" w:space="0" w:color="CCCCCC"/>
+            </w:tcBorders>
+          </w:tcPr>
+          <w:p>
+            <w:pPr>
+              <w:pStyle w:val="TableParagraph"/>
+              <w:spacing w:before="40"/>
+              <w:rPr>
+                <w:sz w:val="20"/>
+              </w:rPr>
+            </w:pPr>
+            <w:r>
+              <w:rPr>
+                <w:sz w:val="20"/>
+              </w:rPr>
+              <w:t>Hosting</w:t>
+            </w:r>
+            <w:r>
+              <w:rPr>
+                <w:spacing w:val="-10"/>
+                <w:sz w:val="20"/>
+              </w:rPr>
+              <w:t xml:space="preserve"> </w:t>
+            </w:r>
+            <w:r>
+              <w:rPr>
+                <w:spacing w:val="-2"/>
+                <w:sz w:val="20"/>
+              </w:rPr>
+              <w:t>(future)</w:t>
+            </w:r>
+          </w:p>
+        </w:tc>
+        <w:tc>
+          <w:tcPr>
+            <w:tcW w:w="5761" w:type="dxa"/>
+            <w:tcBorders>
+              <w:top w:val="single" w:sz="8" w:space="0" w:color="CCCCCC"/>
+              <w:left w:val="single" w:sz="8" w:space="0" w:color="CCCCCC"/>
+              <w:bottom w:val="single" w:sz="8" w:space="0" w:color="CCCCCC"/>
+              <w:right w:val="single" w:sz="8" w:space="0" w:color="CCCCCC"/>
+            </w:tcBorders>
+          </w:tcPr>
+          <w:p>
+            <w:pPr>
+              <w:pStyle w:val="TableParagraph"/>
+              <w:spacing w:before="40"/>
+              <w:ind w:left="99"/>
+              <w:rPr>
+                <w:sz w:val="20"/>
+              </w:rPr>
+            </w:pPr>
+            <w:r>
+              <w:rPr>
+                <w:sz w:val="20"/>
+              </w:rPr>
+              <w:t>Cloud</w:t>
+            </w:r>
+            <w:r>
+              <w:rPr>
+                <w:spacing w:val="-6"/>
+                <w:sz w:val="20"/>
+              </w:rPr>
+              <w:t xml:space="preserve"> </w:t>
+            </w:r>
+            <w:r>
+              <w:rPr>
+                <w:sz w:val="20"/>
+              </w:rPr>
+              <w:t>(AWS</w:t>
+            </w:r>
+            <w:r>
+              <w:rPr>
+                <w:spacing w:val="-4"/>
+                <w:sz w:val="20"/>
+              </w:rPr>
+              <w:t xml:space="preserve"> </w:t>
+            </w:r>
+            <w:r>
+              <w:rPr>
+                <w:sz w:val="20"/>
+              </w:rPr>
+              <w:t>or</w:t>
+            </w:r>
+            <w:r>
+              <w:rPr>
+                <w:spacing w:val="-6"/>
+                <w:sz w:val="20"/>
+              </w:rPr>
+              <w:t xml:space="preserve"> </w:t>
+            </w:r>
+            <w:proofErr w:type="spellStart"/>
+            <w:r>
+              <w:rPr>
+                <w:spacing w:val="-2"/>
+                <w:sz w:val="20"/>
+              </w:rPr>
+              <w:t>DigitalOcean</w:t>
+            </w:r>
+            <w:proofErr w:type="spellEnd"/>
+            <w:r>
+              <w:rPr>
+                <w:spacing w:val="-2"/>
+                <w:sz w:val="20"/>
+              </w:rPr>
+              <w:t>)</w:t>
+            </w:r>
+          </w:p>
+        </w:tc>
+      </w:tr>
+      <w:tr>
+        <w:trPr>
+          <w:trHeight w:val="330"/>
+        </w:trPr>
+        <w:tc>
+          <w:tcPr>
+            <w:tcW w:w="3601" w:type="dxa"/>
+            <w:tcBorders>
+              <w:top w:val="single" w:sz="8" w:space="0" w:color="CCCCCC"/>
+              <w:left w:val="single" w:sz="8" w:space="0" w:color="CCCCCC"/>
+              <w:bottom w:val="single" w:sz="8" w:space="0" w:color="CCCCCC"/>
+              <w:right w:val="single" w:sz="8" w:space="0" w:color="CCCCCC"/>
+            </w:tcBorders>
+            <w:shd w:val="clear" w:color="auto" w:fill="EFF4F8"/>
+          </w:tcPr>
+          <w:p>
+            <w:pPr>
+              <w:pStyle w:val="TableParagraph"/>
+              <w:spacing w:before="40"/>
+              <w:rPr>
+                <w:sz w:val="20"/>
+              </w:rPr>
+            </w:pPr>
+            <w:r>
+              <w:rPr>
+                <w:sz w:val="20"/>
+              </w:rPr>
+              <w:t>Data</w:t>
+            </w:r>
+            <w:r>
+              <w:rPr>
+                <w:spacing w:val="-10"/>
+                <w:sz w:val="20"/>
+              </w:rPr>
+              <w:t xml:space="preserve"> </w:t>
+            </w:r>
+            <w:r>
+              <w:rPr>
+                <w:spacing w:val="-2"/>
+                <w:sz w:val="20"/>
+              </w:rPr>
+              <w:t>Format</w:t>
+            </w:r>
+          </w:p>
+        </w:tc>
+        <w:tc>
+          <w:tcPr>
+            <w:tcW w:w="5761" w:type="dxa"/>
+            <w:tcBorders>
+              <w:top w:val="single" w:sz="8" w:space="0" w:color="CCCCCC"/>
+              <w:left w:val="single" w:sz="8" w:space="0" w:color="CCCCCC"/>
+              <w:bottom w:val="single" w:sz="8" w:space="0" w:color="CCCCCC"/>
+              <w:right w:val="single" w:sz="8" w:space="0" w:color="CCCCCC"/>
+            </w:tcBorders>
+            <w:shd w:val="clear" w:color="auto" w:fill="EFF4F8"/>
+          </w:tcPr>
+          <w:p>
+            <w:pPr>
+              <w:pStyle w:val="TableParagraph"/>
+              <w:spacing w:before="40"/>
+              <w:ind w:left="99"/>
+              <w:rPr>
+                <w:sz w:val="20"/>
+              </w:rPr>
+            </w:pPr>
+            <w:r>
+              <w:rPr>
+                <w:sz w:val="20"/>
+              </w:rPr>
               <w:t>JSON</w:t>
             </w:r>
             <w:r>
@@ -8191,6 +8212,10 @@
     <w:p>
       <w:pPr>
         <w:pStyle w:val="Heading5"/>
+        <w:rPr>
+          <w:b w:val="0"/>
+          <w:bCs w:val="0"/>
+        </w:rPr>
       </w:pPr>
       <w:r>
         <w:t>Secondary</w:t>
@@ -8205,310 +8230,518 @@
         <w:rPr>
           <w:spacing w:val="-2"/>
         </w:rPr>
-        <w:t>Goals:</w:t>
-      </w:r>
-    </w:p>
-    <w:p>
-      <w:pPr>
-        <w:pStyle w:val="ListParagraph"/>
-        <w:numPr>
-          <w:ilvl w:val="2"/>
-          <w:numId w:val="2"/>
-        </w:numPr>
-        <w:tabs>
-          <w:tab w:val="left" w:pos="1404"/>
-        </w:tabs>
-        <w:spacing w:before="78"/>
-        <w:ind w:left="1404" w:hanging="324"/>
-      </w:pPr>
-      <w:r>
+        <w:t>Goal:</w:t>
+      </w:r>
+      <w:r>
+        <w:rPr>
+          <w:spacing w:val="-2"/>
+        </w:rPr>
+        <w:t xml:space="preserve"> </w:t>
+      </w:r>
+      <w:r>
+        <w:rPr>
+          <w:b w:val="0"/>
+          <w:bCs w:val="0"/>
+        </w:rPr>
         <w:t>Encourage</w:t>
       </w:r>
       <w:r>
         <w:rPr>
+          <w:b w:val="0"/>
+          <w:bCs w:val="0"/>
           <w:spacing w:val="-11"/>
         </w:rPr>
         <w:t xml:space="preserve"> </w:t>
       </w:r>
       <w:r>
+        <w:rPr>
+          <w:b w:val="0"/>
+          <w:bCs w:val="0"/>
+        </w:rPr>
         <w:t>data</w:t>
       </w:r>
       <w:r>
         <w:rPr>
+          <w:b w:val="0"/>
+          <w:bCs w:val="0"/>
           <w:spacing w:val="-7"/>
         </w:rPr>
         <w:t xml:space="preserve"> </w:t>
       </w:r>
       <w:r>
+        <w:rPr>
+          <w:b w:val="0"/>
+          <w:bCs w:val="0"/>
+        </w:rPr>
         <w:t>sharing</w:t>
       </w:r>
       <w:r>
         <w:rPr>
+          <w:b w:val="0"/>
+          <w:bCs w:val="0"/>
           <w:spacing w:val="-8"/>
         </w:rPr>
         <w:t xml:space="preserve"> </w:t>
       </w:r>
       <w:r>
+        <w:rPr>
+          <w:b w:val="0"/>
+          <w:bCs w:val="0"/>
+        </w:rPr>
         <w:t>among</w:t>
       </w:r>
       <w:r>
         <w:rPr>
+          <w:b w:val="0"/>
+          <w:bCs w:val="0"/>
           <w:spacing w:val="-8"/>
         </w:rPr>
         <w:t xml:space="preserve"> </w:t>
       </w:r>
       <w:r>
+        <w:rPr>
+          <w:b w:val="0"/>
+          <w:bCs w:val="0"/>
+        </w:rPr>
         <w:t>wildlife</w:t>
       </w:r>
       <w:r>
         <w:rPr>
+          <w:b w:val="0"/>
+          <w:bCs w:val="0"/>
           <w:spacing w:val="-7"/>
         </w:rPr>
         <w:t xml:space="preserve"> </w:t>
       </w:r>
       <w:r>
         <w:rPr>
+          <w:b w:val="0"/>
+          <w:bCs w:val="0"/>
           <w:spacing w:val="-2"/>
         </w:rPr>
         <w:t>organizations.</w:t>
       </w:r>
-    </w:p>
-    <w:p>
-      <w:pPr>
-        <w:pStyle w:val="ListParagraph"/>
-        <w:numPr>
-          <w:ilvl w:val="2"/>
-          <w:numId w:val="2"/>
-        </w:numPr>
-        <w:tabs>
-          <w:tab w:val="left" w:pos="1404"/>
-        </w:tabs>
-        <w:spacing w:before="40"/>
-        <w:ind w:left="1404" w:hanging="324"/>
-      </w:pPr>
-      <w:r>
-        <w:t>Provide</w:t>
-      </w:r>
-      <w:r>
-        <w:rPr>
+      <w:r>
+        <w:rPr>
+          <w:b w:val="0"/>
+          <w:bCs w:val="0"/>
+          <w:spacing w:val="-2"/>
+        </w:rPr>
+        <w:t xml:space="preserve"> and we will also p</w:t>
+      </w:r>
+      <w:r>
+        <w:rPr>
+          <w:b w:val="0"/>
+          <w:bCs w:val="0"/>
+        </w:rPr>
+        <w:t>rovide</w:t>
+      </w:r>
+      <w:r>
+        <w:rPr>
+          <w:b w:val="0"/>
+          <w:bCs w:val="0"/>
           <w:spacing w:val="-10"/>
         </w:rPr>
         <w:t xml:space="preserve"> </w:t>
       </w:r>
       <w:r>
+        <w:rPr>
+          <w:b w:val="0"/>
+          <w:bCs w:val="0"/>
+        </w:rPr>
         <w:t>a</w:t>
       </w:r>
       <w:r>
         <w:rPr>
+          <w:b w:val="0"/>
+          <w:bCs w:val="0"/>
           <w:spacing w:val="-7"/>
         </w:rPr>
         <w:t xml:space="preserve"> </w:t>
       </w:r>
       <w:r>
+        <w:rPr>
+          <w:b w:val="0"/>
+          <w:bCs w:val="0"/>
+        </w:rPr>
         <w:t>platform</w:t>
       </w:r>
       <w:r>
         <w:rPr>
+          <w:b w:val="0"/>
+          <w:bCs w:val="0"/>
           <w:spacing w:val="-7"/>
         </w:rPr>
         <w:t xml:space="preserve"> </w:t>
       </w:r>
       <w:r>
+        <w:rPr>
+          <w:b w:val="0"/>
+          <w:bCs w:val="0"/>
+        </w:rPr>
         <w:t>that</w:t>
       </w:r>
       <w:r>
         <w:rPr>
+          <w:b w:val="0"/>
+          <w:bCs w:val="0"/>
           <w:spacing w:val="-5"/>
         </w:rPr>
         <w:t xml:space="preserve"> </w:t>
       </w:r>
       <w:r>
+        <w:rPr>
+          <w:b w:val="0"/>
+          <w:bCs w:val="0"/>
+        </w:rPr>
         <w:t>supports</w:t>
       </w:r>
       <w:r>
         <w:rPr>
+          <w:b w:val="0"/>
+          <w:bCs w:val="0"/>
           <w:spacing w:val="-8"/>
         </w:rPr>
         <w:t xml:space="preserve"> </w:t>
       </w:r>
       <w:r>
+        <w:rPr>
+          <w:b w:val="0"/>
+          <w:bCs w:val="0"/>
+        </w:rPr>
         <w:t>conservation</w:t>
       </w:r>
       <w:r>
         <w:rPr>
+          <w:b w:val="0"/>
+          <w:bCs w:val="0"/>
           <w:spacing w:val="-6"/>
         </w:rPr>
         <w:t xml:space="preserve"> </w:t>
       </w:r>
       <w:r>
+        <w:rPr>
+          <w:b w:val="0"/>
+          <w:bCs w:val="0"/>
+        </w:rPr>
         <w:t>and</w:t>
       </w:r>
       <w:r>
         <w:rPr>
+          <w:b w:val="0"/>
+          <w:bCs w:val="0"/>
           <w:spacing w:val="-8"/>
         </w:rPr>
         <w:t xml:space="preserve"> </w:t>
       </w:r>
       <w:r>
+        <w:rPr>
+          <w:b w:val="0"/>
+          <w:bCs w:val="0"/>
+        </w:rPr>
         <w:t>research</w:t>
       </w:r>
       <w:r>
         <w:rPr>
+          <w:b w:val="0"/>
+          <w:bCs w:val="0"/>
           <w:spacing w:val="-8"/>
         </w:rPr>
         <w:t xml:space="preserve"> </w:t>
       </w:r>
       <w:r>
+        <w:rPr>
+          <w:b w:val="0"/>
+          <w:bCs w:val="0"/>
+        </w:rPr>
         <w:t>decision</w:t>
       </w:r>
       <w:r>
         <w:rPr>
+          <w:b w:val="0"/>
+          <w:bCs w:val="0"/>
           <w:spacing w:val="-7"/>
         </w:rPr>
         <w:t xml:space="preserve"> </w:t>
       </w:r>
       <w:r>
         <w:rPr>
+          <w:b w:val="0"/>
+          <w:bCs w:val="0"/>
           <w:spacing w:val="-2"/>
         </w:rPr>
-        <w:t>making.</w:t>
-      </w:r>
-    </w:p>
-    <w:p>
-      <w:pPr>
-        <w:pStyle w:val="ListParagraph"/>
-        <w:numPr>
-          <w:ilvl w:val="2"/>
-          <w:numId w:val="2"/>
-        </w:numPr>
-        <w:tabs>
-          <w:tab w:val="left" w:pos="1404"/>
-        </w:tabs>
-        <w:spacing w:before="40"/>
-        <w:ind w:left="1404" w:hanging="324"/>
-      </w:pPr>
-      <w:r>
-        <w:t>Build</w:t>
-      </w:r>
-      <w:r>
-        <w:rPr>
+        <w:t>making</w:t>
+      </w:r>
+      <w:r>
+        <w:rPr>
+          <w:b w:val="0"/>
+          <w:bCs w:val="0"/>
+          <w:spacing w:val="-2"/>
+        </w:rPr>
+        <w:t xml:space="preserve"> easily</w:t>
+      </w:r>
+      <w:r>
+        <w:rPr>
+          <w:b w:val="0"/>
+          <w:bCs w:val="0"/>
+          <w:spacing w:val="-2"/>
+        </w:rPr>
+        <w:t>.</w:t>
+      </w:r>
+      <w:r>
+        <w:rPr>
+          <w:b w:val="0"/>
+          <w:bCs w:val="0"/>
+          <w:spacing w:val="-2"/>
+        </w:rPr>
+        <w:t xml:space="preserve"> </w:t>
+      </w:r>
+      <w:proofErr w:type="gramStart"/>
+      <w:r>
+        <w:rPr>
+          <w:b w:val="0"/>
+          <w:bCs w:val="0"/>
+          <w:spacing w:val="-2"/>
+        </w:rPr>
+        <w:t>Also</w:t>
+      </w:r>
+      <w:proofErr w:type="gramEnd"/>
+      <w:r>
+        <w:rPr>
+          <w:b w:val="0"/>
+          <w:bCs w:val="0"/>
+          <w:spacing w:val="-2"/>
+        </w:rPr>
+        <w:t xml:space="preserve"> we will implement and b</w:t>
+      </w:r>
+      <w:r>
+        <w:rPr>
+          <w:b w:val="0"/>
+          <w:bCs w:val="0"/>
+        </w:rPr>
+        <w:t>uild</w:t>
+      </w:r>
+      <w:r>
+        <w:rPr>
+          <w:b w:val="0"/>
+          <w:bCs w:val="0"/>
           <w:spacing w:val="-7"/>
         </w:rPr>
         <w:t xml:space="preserve"> </w:t>
       </w:r>
       <w:r>
+        <w:rPr>
+          <w:b w:val="0"/>
+          <w:bCs w:val="0"/>
+        </w:rPr>
         <w:t>a</w:t>
       </w:r>
       <w:r>
         <w:rPr>
+          <w:b w:val="0"/>
+          <w:bCs w:val="0"/>
           <w:spacing w:val="-4"/>
         </w:rPr>
         <w:t xml:space="preserve"> </w:t>
       </w:r>
       <w:r>
+        <w:rPr>
+          <w:b w:val="0"/>
+          <w:bCs w:val="0"/>
+        </w:rPr>
         <w:t>scalable</w:t>
       </w:r>
       <w:r>
         <w:rPr>
+          <w:b w:val="0"/>
+          <w:bCs w:val="0"/>
           <w:spacing w:val="-6"/>
         </w:rPr>
         <w:t xml:space="preserve"> </w:t>
       </w:r>
       <w:r>
+        <w:rPr>
+          <w:b w:val="0"/>
+          <w:bCs w:val="0"/>
+        </w:rPr>
         <w:t>foundation</w:t>
       </w:r>
       <w:r>
         <w:rPr>
+          <w:b w:val="0"/>
+          <w:bCs w:val="0"/>
           <w:spacing w:val="-4"/>
         </w:rPr>
         <w:t xml:space="preserve"> </w:t>
       </w:r>
       <w:r>
+        <w:rPr>
+          <w:b w:val="0"/>
+          <w:bCs w:val="0"/>
+        </w:rPr>
         <w:t>that</w:t>
       </w:r>
       <w:r>
         <w:rPr>
+          <w:b w:val="0"/>
+          <w:bCs w:val="0"/>
           <w:spacing w:val="-6"/>
         </w:rPr>
         <w:t xml:space="preserve"> </w:t>
       </w:r>
       <w:r>
+        <w:rPr>
+          <w:b w:val="0"/>
+          <w:bCs w:val="0"/>
+        </w:rPr>
         <w:t>can</w:t>
       </w:r>
       <w:r>
         <w:rPr>
+          <w:b w:val="0"/>
+          <w:bCs w:val="0"/>
           <w:spacing w:val="-4"/>
         </w:rPr>
         <w:t xml:space="preserve"> </w:t>
       </w:r>
       <w:r>
+        <w:rPr>
+          <w:b w:val="0"/>
+          <w:bCs w:val="0"/>
+        </w:rPr>
         <w:t>grow</w:t>
       </w:r>
       <w:r>
         <w:rPr>
+          <w:b w:val="0"/>
+          <w:bCs w:val="0"/>
           <w:spacing w:val="-6"/>
         </w:rPr>
         <w:t xml:space="preserve"> </w:t>
       </w:r>
       <w:r>
+        <w:rPr>
+          <w:b w:val="0"/>
+          <w:bCs w:val="0"/>
+        </w:rPr>
         <w:t>with</w:t>
       </w:r>
       <w:r>
         <w:rPr>
+          <w:b w:val="0"/>
+          <w:bCs w:val="0"/>
           <w:spacing w:val="-6"/>
         </w:rPr>
         <w:t xml:space="preserve"> </w:t>
       </w:r>
       <w:r>
+        <w:rPr>
+          <w:b w:val="0"/>
+          <w:bCs w:val="0"/>
+        </w:rPr>
         <w:t>more</w:t>
       </w:r>
       <w:r>
         <w:rPr>
+          <w:b w:val="0"/>
+          <w:bCs w:val="0"/>
           <w:spacing w:val="-5"/>
         </w:rPr>
         <w:t xml:space="preserve"> </w:t>
       </w:r>
       <w:r>
+        <w:rPr>
+          <w:b w:val="0"/>
+          <w:bCs w:val="0"/>
+        </w:rPr>
         <w:t>data</w:t>
       </w:r>
       <w:r>
         <w:rPr>
+          <w:b w:val="0"/>
+          <w:bCs w:val="0"/>
           <w:spacing w:val="-4"/>
         </w:rPr>
         <w:t xml:space="preserve"> </w:t>
       </w:r>
       <w:r>
+        <w:rPr>
+          <w:b w:val="0"/>
+          <w:bCs w:val="0"/>
+        </w:rPr>
         <w:t>and</w:t>
       </w:r>
       <w:r>
         <w:rPr>
+          <w:b w:val="0"/>
+          <w:bCs w:val="0"/>
           <w:spacing w:val="-6"/>
         </w:rPr>
         <w:t xml:space="preserve"> </w:t>
       </w:r>
       <w:r>
+        <w:rPr>
+          <w:b w:val="0"/>
+          <w:bCs w:val="0"/>
+        </w:rPr>
         <w:t>users</w:t>
       </w:r>
       <w:r>
         <w:rPr>
+          <w:b w:val="0"/>
+          <w:bCs w:val="0"/>
           <w:spacing w:val="-4"/>
         </w:rPr>
         <w:t xml:space="preserve"> </w:t>
       </w:r>
       <w:r>
+        <w:rPr>
+          <w:b w:val="0"/>
+          <w:bCs w:val="0"/>
+        </w:rPr>
         <w:t>over</w:t>
       </w:r>
       <w:r>
         <w:rPr>
+          <w:b w:val="0"/>
+          <w:bCs w:val="0"/>
           <w:spacing w:val="-5"/>
         </w:rPr>
         <w:t xml:space="preserve"> </w:t>
       </w:r>
       <w:r>
         <w:rPr>
+          <w:b w:val="0"/>
+          <w:bCs w:val="0"/>
           <w:spacing w:val="-2"/>
         </w:rPr>
         <w:t>time.</w:t>
+      </w:r>
+      <w:r>
+        <w:rPr>
+          <w:b w:val="0"/>
+          <w:bCs w:val="0"/>
+          <w:spacing w:val="-2"/>
+        </w:rPr>
+        <w:t xml:space="preserve"> Which can handle more </w:t>
+      </w:r>
+      <w:proofErr w:type="gramStart"/>
+      <w:r>
+        <w:rPr>
+          <w:b w:val="0"/>
+          <w:bCs w:val="0"/>
+          <w:spacing w:val="-2"/>
+        </w:rPr>
+        <w:t>user</w:t>
+      </w:r>
+      <w:proofErr w:type="gramEnd"/>
+      <w:r>
+        <w:rPr>
+          <w:b w:val="0"/>
+          <w:bCs w:val="0"/>
+          <w:spacing w:val="-2"/>
+        </w:rPr>
+        <w:t xml:space="preserve"> at a time.</w:t>
       </w:r>
     </w:p>
     <w:p>
@@ -8579,31 +8812,115 @@
       <w:r>
         <w:tab/>
       </w:r>
-      <w:r>
-        <w:t>In this Project we will use DevOps practices for development, testing, integration and deployment. DevOps combines development and Operations to improve collaboration, automation</w:t>
-      </w:r>
       <w:proofErr w:type="gramStart"/>
       <w:r>
-        <w:t>, repetitive</w:t>
+        <w:t>we</w:t>
       </w:r>
       <w:proofErr w:type="gramEnd"/>
       <w:r>
-        <w:t xml:space="preserve"> tasks. And maintain software quality and ensure system reliability, Version control, automated testing, continuous integration and deployment practices will be used. To manage code </w:t>
+        <w:t xml:space="preserve"> will use DevOps practices for development, testing, integration and deployment. DevOps combines</w:t>
+      </w:r>
+      <w:r>
+        <w:t xml:space="preserve"> two </w:t>
       </w:r>
       <w:proofErr w:type="gramStart"/>
       <w:r>
+        <w:t>thing</w:t>
+      </w:r>
+      <w:proofErr w:type="gramEnd"/>
+      <w:r>
+        <w:t xml:space="preserve"> development and </w:t>
+      </w:r>
+      <w:r>
+        <w:t>o</w:t>
+      </w:r>
+      <w:r>
+        <w:t xml:space="preserve">perations </w:t>
+      </w:r>
+      <w:r>
+        <w:t>for</w:t>
+      </w:r>
+      <w:r>
+        <w:t xml:space="preserve"> </w:t>
+      </w:r>
+      <w:proofErr w:type="gramStart"/>
+      <w:r>
+        <w:t>improve</w:t>
+      </w:r>
+      <w:proofErr w:type="gramEnd"/>
+      <w:r>
+        <w:t xml:space="preserve"> collaboration, automation</w:t>
+      </w:r>
+      <w:r>
+        <w:t>, and repetitive tasks</w:t>
+      </w:r>
+      <w:r>
+        <w:t>. And</w:t>
+      </w:r>
+      <w:r>
+        <w:t xml:space="preserve"> for</w:t>
+      </w:r>
+      <w:r>
+        <w:t xml:space="preserve"> maintain </w:t>
+      </w:r>
+      <w:r>
+        <w:t xml:space="preserve">the </w:t>
+      </w:r>
+      <w:r>
+        <w:t xml:space="preserve">software quality and ensure system reliability, Version control, automated testing, continuous integration and deployment practices will be used. To manage code </w:t>
+      </w:r>
+      <w:proofErr w:type="gramStart"/>
+      <w:r>
         <w:t>changes</w:t>
       </w:r>
       <w:proofErr w:type="gramEnd"/>
       <w:r>
-        <w:t xml:space="preserve"> maintain stability. And We will use Model-View-Controller (MVC) architectural pattern to organize. </w:t>
+        <w:t xml:space="preserve"> maintain stability. </w:t>
+      </w:r>
+      <w:r>
+        <w:t>Also, w</w:t>
+      </w:r>
+      <w:r>
+        <w:t>e will use Model</w:t>
+      </w:r>
+      <w:r>
+        <w:t xml:space="preserve"> </w:t>
+      </w:r>
+      <w:r>
+        <w:t>View</w:t>
+      </w:r>
+      <w:r>
+        <w:t xml:space="preserve"> </w:t>
+      </w:r>
+      <w:r>
+        <w:t xml:space="preserve">Controller (MVC) architectural </w:t>
       </w:r>
       <w:proofErr w:type="gramStart"/>
       <w:r>
-        <w:t>Model</w:t>
+        <w:t>pattern</w:t>
       </w:r>
       <w:proofErr w:type="gramEnd"/>
       <w:r>
+        <w:t xml:space="preserve"> </w:t>
+      </w:r>
+      <w:r>
+        <w:t>for</w:t>
+      </w:r>
+      <w:r>
+        <w:t xml:space="preserve"> </w:t>
+      </w:r>
+      <w:proofErr w:type="gramStart"/>
+      <w:r>
+        <w:t>organize</w:t>
+      </w:r>
+      <w:proofErr w:type="gramEnd"/>
+      <w:r>
+        <w:t xml:space="preserve">. </w:t>
+      </w:r>
+      <w:r>
+        <w:t>Models</w:t>
+      </w:r>
+      <w:r>
         <w:t xml:space="preserve"> manage app data and business logic. The View will provide UI where user Interact. And the controller will handle user </w:t>
       </w:r>
       <w:proofErr w:type="gramStart"/>
@@ -8614,11 +8931,9 @@
       <w:r>
         <w:t xml:space="preserve"> and coordinate communication between the model and view. </w:t>
       </w:r>
-      <w:proofErr w:type="gramStart"/>
-      <w:r>
-        <w:t>The separate</w:t>
-      </w:r>
-      <w:proofErr w:type="gramEnd"/>
+      <w:r>
+        <w:t>Separate</w:t>
+      </w:r>
       <w:r>
         <w:t xml:space="preserve"> parts will make the system easier to develop, testing, and maintain and scaling/extend.</w:t>
       </w:r>
@@ -9392,7 +9707,7 @@
         </mc:Choice>
         <mc:Fallback>
           <w:pict>
-            <v:shape w14:anchorId="10B731AE" id="Graphic 3" o:spid="_x0000_s1026" style="position:absolute;margin-left:70.6pt;margin-top:744.35pt;width:470.95pt;height:.5pt;z-index:-15900672;visibility:visible;mso-wrap-style:square;mso-wrap-distance-left:0;mso-wrap-distance-top:0;mso-wrap-distance-right:0;mso-wrap-distance-bottom:0;mso-position-horizontal:absolute;mso-position-horizontal-relative:page;mso-position-vertical:absolute;mso-position-vertical-relative:page;v-text-anchor:top" coordsize="5981065,6350" o:gfxdata="UEsDBBQABgAIAAAAIQC2gziS/gAAAOEBAAATAAAAW0NvbnRlbnRfVHlwZXNdLnhtbJSRQU7DMBBF&#10;90jcwfIWJU67QAgl6YK0S0CoHGBkTxKLZGx5TGhvj5O2G0SRWNoz/78nu9wcxkFMGNg6quQqL6RA&#10;0s5Y6ir5vt9lD1JwBDIwOMJKHpHlpr69KfdHjyxSmriSfYz+USnWPY7AufNIadK6MEJMx9ApD/oD&#10;OlTrorhX2lFEilmcO2RdNtjC5xDF9pCuTyYBB5bi6bQ4syoJ3g9WQ0ymaiLzg5KdCXlKLjvcW893&#10;SUOqXwnz5DrgnHtJTxOsQfEKIT7DmDSUCaxw7Rqn8787ZsmRM9e2VmPeBN4uqYvTtW7jvijg9N/y&#10;JsXecLq0q+WD6m8AAAD//wMAUEsDBBQABgAIAAAAIQA4/SH/1gAAAJQBAAALAAAAX3JlbHMvLnJl&#10;bHOkkMFqwzAMhu+DvYPRfXGawxijTi+j0GvpHsDYimMaW0Yy2fr2M4PBMnrbUb/Q94l/f/hMi1qR&#10;JVI2sOt6UJgd+ZiDgffL8ekFlFSbvV0oo4EbChzGx4f9GRdb25HMsYhqlCwG5lrLq9biZkxWOiqY&#10;22YiTra2kYMu1l1tQD30/bPm3wwYN0x18gb45AdQl1tp5j/sFB2T0FQ7R0nTNEV3j6o9feQzro1i&#10;OWA14Fm+Q8a1a8+Bvu/d/dMb2JY5uiPbhG/ktn4cqGU/er3pcvwCAAD//wMAUEsDBBQABgAIAAAA&#10;IQC9X+9CIgIAAL0EAAAOAAAAZHJzL2Uyb0RvYy54bWysVMFu2zAMvQ/YPwi6L3YyJGuNOMXWoMOA&#10;oivQDDsrshwbk01NVGLn70fJlmtspw27SJT5RD0+kt7e9Y1mF2Wxhjbny0XKmWolFHV7yvm3w8O7&#10;G87QibYQGlqV86tCfrd7+2bbmUytoAJdKMsoSItZZ3JeOWeyJEFZqUbgAoxqyVmCbYSjoz0lhRUd&#10;RW90skrTTdKBLYwFqRDp635w8l2IX5ZKuq9licoxnXPi5sJqw3r0a7LbiuxkhalqOdIQ/8CiEXVL&#10;j06h9sIJdrb1H6GaWlpAKN1CQpNAWdZShRwom2X6WzYvlTAq5ELioJlkwv8XVj5dXsyz9dTRPIL8&#10;gaRI0hnMJo8/4IjpS9t4LBFnfVDxOqmoesckfVzf3izTzZozSb7N+3UQORFZvCvP6D4rCHHE5RHd&#10;UIMiWqKKluzbaFqqpK+hDjV0nFENLWdUw+NQQyOcv+fJeZN1MyLVyMM7G7ioAwSY8ylMbGMixPQV&#10;o9s5lhpohoq+uJsQb8Bs0tu150XBojvuA2z+7F+Bo5oxnNSAanjJ5x2enLSg5+dqI+i6eKi19umj&#10;PR3vtWUXQbKu9h/WnzYj4xksdMJQfN8GRyiuz5Z1NC85x59nYRVn+ktLDemHKxo2GsdoWKfvIYxg&#10;UN6iO/TfhTXMkJlzR73zBLHdRRbbgvh7wID1N1v4eHZQ1r5nAreB0XigGQn5j/Psh3B+DqjXv87u&#10;FwAAAP//AwBQSwMEFAAGAAgAAAAhAMebASLhAAAADgEAAA8AAABkcnMvZG93bnJldi54bWxMj0FP&#10;wzAMhe9I/IfISFzQlrZjWylNJ4Q0TRwZ48DNbU1T0Tilybbu35NygZuf/fT8vXwzmk6caHCtZQXx&#10;PAJBXNm65UbB4W07S0E4j1xjZ5kUXMjBpri+yjGr7Zlf6bT3jQgh7DJUoL3vMyldpcmgm9ueONw+&#10;7WDQBzk0sh7wHMJNJ5MoWkmDLYcPGnt61lR97Y9GwWr7TZfFsryzS53gzo4ffvf+otTtzfj0CMLT&#10;6P/MMOEHdCgCU2mPXDvRBX0fJ8E6DWm6BjFZonQRgyh/dw9rkEUu/9cofgAAAP//AwBQSwECLQAU&#10;AAYACAAAACEAtoM4kv4AAADhAQAAEwAAAAAAAAAAAAAAAAAAAAAAW0NvbnRlbnRfVHlwZXNdLnht&#10;bFBLAQItABQABgAIAAAAIQA4/SH/1gAAAJQBAAALAAAAAAAAAAAAAAAAAC8BAABfcmVscy8ucmVs&#10;c1BLAQItABQABgAIAAAAIQC9X+9CIgIAAL0EAAAOAAAAAAAAAAAAAAAAAC4CAABkcnMvZTJvRG9j&#10;LnhtbFBLAQItABQABgAIAAAAIQDHmwEi4QAAAA4BAAAPAAAAAAAAAAAAAAAAAHwEAABkcnMvZG93&#10;bnJldi54bWxQSwUGAAAAAAQABADzAAAAigUAAAAA&#10;" path="m5981065,l,,,6095r5981065,l5981065,xe" fillcolor="#2d75b6" stroked="f">
+            <v:shape w14:anchorId="74B7B2E6" id="Graphic 3" o:spid="_x0000_s1026" style="position:absolute;margin-left:70.6pt;margin-top:744.35pt;width:470.95pt;height:.5pt;z-index:-15900672;visibility:visible;mso-wrap-style:square;mso-wrap-distance-left:0;mso-wrap-distance-top:0;mso-wrap-distance-right:0;mso-wrap-distance-bottom:0;mso-position-horizontal:absolute;mso-position-horizontal-relative:page;mso-position-vertical:absolute;mso-position-vertical-relative:page;v-text-anchor:top" coordsize="5981065,6350" o:gfxdata="UEsDBBQABgAIAAAAIQC2gziS/gAAAOEBAAATAAAAW0NvbnRlbnRfVHlwZXNdLnhtbJSRQU7DMBBF&#10;90jcwfIWJU67QAgl6YK0S0CoHGBkTxKLZGx5TGhvj5O2G0SRWNoz/78nu9wcxkFMGNg6quQqL6RA&#10;0s5Y6ir5vt9lD1JwBDIwOMJKHpHlpr69KfdHjyxSmriSfYz+USnWPY7AufNIadK6MEJMx9ApD/oD&#10;OlTrorhX2lFEilmcO2RdNtjC5xDF9pCuTyYBB5bi6bQ4syoJ3g9WQ0ymaiLzg5KdCXlKLjvcW893&#10;SUOqXwnz5DrgnHtJTxOsQfEKIT7DmDSUCaxw7Rqn8787ZsmRM9e2VmPeBN4uqYvTtW7jvijg9N/y&#10;JsXecLq0q+WD6m8AAAD//wMAUEsDBBQABgAIAAAAIQA4/SH/1gAAAJQBAAALAAAAX3JlbHMvLnJl&#10;bHOkkMFqwzAMhu+DvYPRfXGawxijTi+j0GvpHsDYimMaW0Yy2fr2M4PBMnrbUb/Q94l/f/hMi1qR&#10;JVI2sOt6UJgd+ZiDgffL8ekFlFSbvV0oo4EbChzGx4f9GRdb25HMsYhqlCwG5lrLq9biZkxWOiqY&#10;22YiTra2kYMu1l1tQD30/bPm3wwYN0x18gb45AdQl1tp5j/sFB2T0FQ7R0nTNEV3j6o9feQzro1i&#10;OWA14Fm+Q8a1a8+Bvu/d/dMb2JY5uiPbhG/ktn4cqGU/er3pcvwCAAD//wMAUEsDBBQABgAIAAAA&#10;IQC9X+9CIgIAAL0EAAAOAAAAZHJzL2Uyb0RvYy54bWysVMFu2zAMvQ/YPwi6L3YyJGuNOMXWoMOA&#10;oivQDDsrshwbk01NVGLn70fJlmtspw27SJT5RD0+kt7e9Y1mF2Wxhjbny0XKmWolFHV7yvm3w8O7&#10;G87QibYQGlqV86tCfrd7+2bbmUytoAJdKMsoSItZZ3JeOWeyJEFZqUbgAoxqyVmCbYSjoz0lhRUd&#10;RW90skrTTdKBLYwFqRDp635w8l2IX5ZKuq9licoxnXPi5sJqw3r0a7LbiuxkhalqOdIQ/8CiEXVL&#10;j06h9sIJdrb1H6GaWlpAKN1CQpNAWdZShRwom2X6WzYvlTAq5ELioJlkwv8XVj5dXsyz9dTRPIL8&#10;gaRI0hnMJo8/4IjpS9t4LBFnfVDxOqmoesckfVzf3izTzZozSb7N+3UQORFZvCvP6D4rCHHE5RHd&#10;UIMiWqKKluzbaFqqpK+hDjV0nFENLWdUw+NQQyOcv+fJeZN1MyLVyMM7G7ioAwSY8ylMbGMixPQV&#10;o9s5lhpohoq+uJsQb8Bs0tu150XBojvuA2z+7F+Bo5oxnNSAanjJ5x2enLSg5+dqI+i6eKi19umj&#10;PR3vtWUXQbKu9h/WnzYj4xksdMJQfN8GRyiuz5Z1NC85x59nYRVn+ktLDemHKxo2GsdoWKfvIYxg&#10;UN6iO/TfhTXMkJlzR73zBLHdRRbbgvh7wID1N1v4eHZQ1r5nAreB0XigGQn5j/Psh3B+DqjXv87u&#10;FwAAAP//AwBQSwMEFAAGAAgAAAAhAMebASLhAAAADgEAAA8AAABkcnMvZG93bnJldi54bWxMj0FP&#10;wzAMhe9I/IfISFzQlrZjWylNJ4Q0TRwZ48DNbU1T0Tilybbu35NygZuf/fT8vXwzmk6caHCtZQXx&#10;PAJBXNm65UbB4W07S0E4j1xjZ5kUXMjBpri+yjGr7Zlf6bT3jQgh7DJUoL3vMyldpcmgm9ueONw+&#10;7WDQBzk0sh7wHMJNJ5MoWkmDLYcPGnt61lR97Y9GwWr7TZfFsryzS53gzo4ffvf+otTtzfj0CMLT&#10;6P/MMOEHdCgCU2mPXDvRBX0fJ8E6DWm6BjFZonQRgyh/dw9rkEUu/9cofgAAAP//AwBQSwECLQAU&#10;AAYACAAAACEAtoM4kv4AAADhAQAAEwAAAAAAAAAAAAAAAAAAAAAAW0NvbnRlbnRfVHlwZXNdLnht&#10;bFBLAQItABQABgAIAAAAIQA4/SH/1gAAAJQBAAALAAAAAAAAAAAAAAAAAC8BAABfcmVscy8ucmVs&#10;c1BLAQItABQABgAIAAAAIQC9X+9CIgIAAL0EAAAOAAAAAAAAAAAAAAAAAC4CAABkcnMvZTJvRG9j&#10;LnhtbFBLAQItABQABgAIAAAAIQDHmwEi4QAAAA4BAAAPAAAAAAAAAAAAAAAAAHwEAABkcnMvZG93&#10;bnJldi54bWxQSwUGAAAAAAQABADzAAAAigUAAAAA&#10;" path="m5981065,l,,,6095r5981065,l5981065,xe" fillcolor="#2d75b6" stroked="f">
               <v:path arrowok="t"/>
               <w10:wrap anchorx="page" anchory="page"/>
             </v:shape>
@@ -9728,7 +10043,7 @@
         </mc:Choice>
         <mc:Fallback>
           <w:pict>
-            <v:shape w14:anchorId="5A497DD7" id="Graphic 1" o:spid="_x0000_s1026" style="position:absolute;margin-left:70.6pt;margin-top:47.3pt;width:470.95pt;height:.5pt;z-index:-15901696;visibility:visible;mso-wrap-style:square;mso-wrap-distance-left:0;mso-wrap-distance-top:0;mso-wrap-distance-right:0;mso-wrap-distance-bottom:0;mso-position-horizontal:absolute;mso-position-horizontal-relative:page;mso-position-vertical:absolute;mso-position-vertical-relative:page;v-text-anchor:top" coordsize="5981065,6350" o:gfxdata="UEsDBBQABgAIAAAAIQC2gziS/gAAAOEBAAATAAAAW0NvbnRlbnRfVHlwZXNdLnhtbJSRQU7DMBBF&#10;90jcwfIWJU67QAgl6YK0S0CoHGBkTxKLZGx5TGhvj5O2G0SRWNoz/78nu9wcxkFMGNg6quQqL6RA&#10;0s5Y6ir5vt9lD1JwBDIwOMJKHpHlpr69KfdHjyxSmriSfYz+USnWPY7AufNIadK6MEJMx9ApD/oD&#10;OlTrorhX2lFEilmcO2RdNtjC5xDF9pCuTyYBB5bi6bQ4syoJ3g9WQ0ymaiLzg5KdCXlKLjvcW893&#10;SUOqXwnz5DrgnHtJTxOsQfEKIT7DmDSUCaxw7Rqn8787ZsmRM9e2VmPeBN4uqYvTtW7jvijg9N/y&#10;JsXecLq0q+WD6m8AAAD//wMAUEsDBBQABgAIAAAAIQA4/SH/1gAAAJQBAAALAAAAX3JlbHMvLnJl&#10;bHOkkMFqwzAMhu+DvYPRfXGawxijTi+j0GvpHsDYimMaW0Yy2fr2M4PBMnrbUb/Q94l/f/hMi1qR&#10;JVI2sOt6UJgd+ZiDgffL8ekFlFSbvV0oo4EbChzGx4f9GRdb25HMsYhqlCwG5lrLq9biZkxWOiqY&#10;22YiTra2kYMu1l1tQD30/bPm3wwYN0x18gb45AdQl1tp5j/sFB2T0FQ7R0nTNEV3j6o9feQzro1i&#10;OWA14Fm+Q8a1a8+Bvu/d/dMb2JY5uiPbhG/ktn4cqGU/er3pcvwCAAD//wMAUEsDBBQABgAIAAAA&#10;IQDzb1bbIAIAAL0EAAAOAAAAZHJzL2Uyb0RvYy54bWysVMFu2zAMvQ/YPwi6L3YyJGuNOMXWoMOA&#10;oivQDDsrshwbk0VNVOLk70fJkWtspw27SJT5RD0+kl7fnTvNTsphC6bk81nOmTISqtYcSv5t9/Du&#10;hjP0wlRCg1Elvyjkd5u3b9a9LdQCGtCVcoyCGCx6W/LGe1tkGcpGdQJnYJUhZw2uE56O7pBVTvQU&#10;vdPZIs9XWQ+usg6kQqSv28HJNzF+XSvpv9Y1Ks90yYmbj6uL6z6s2WYtioMTtmnllYb4BxadaA09&#10;OobaCi/Y0bV/hOpa6QCh9jMJXQZ13UoVc6Bs5vlv2bw0wqqYC4mDdpQJ/19Y+XR6sc8uUEf7CPIH&#10;kiJZb7EYPeGAV8y5dl3AEnF2jipeRhXV2TNJH5e3N/N8teRMkm/1fhlFzkSR7soj+s8KYhxxekQ/&#10;1KBKlmiSJc8mmY4qGWqoYw09Z1RDxxnVcD/U0Aof7gVywWT9hEhz5RGcHZzUDiLMhxRGtikRYvqK&#10;0WaKpQaaoJIv7TbGGzCr/HYVeFGw5E77AJs++1fgpGYKJzWgGl4KeccnRy3o+anaCLqtHlqtQ/ro&#10;Dvt77dhJkKyL7Yflp8R4AoudMBQ/tMEeqsuzYz3NS8nx51E4xZn+Yqghw3AlwyVjnwzn9T3EEYzK&#10;O/S783fhLLNkltxT7zxBandRpLYg/gEwYMNNAx+PHuo29EzkNjC6HmhGYv7XeQ5DOD1H1OtfZ/ML&#10;AAD//wMAUEsDBBQABgAIAAAAIQD8N6R73gAAAAoBAAAPAAAAZHJzL2Rvd25yZXYueG1sTI/BTsMw&#10;DIbvSLxDZCQuiKXt1mqUphNCmiaODDhwSxvTVDROabKte3u8Exx/+9Pvz9VmdoM44hR6TwrSRQIC&#10;qfWmp07B+9v2fg0iRE1GD55QwRkDbOrrq0qXxp/oFY/72AkuoVBqBTbGsZQytBadDgs/IvHuy09O&#10;R45TJ82kT1zuBpklSSGd7okvWD3is8X2e39wCortD56XeXPnc5vpnZ8/4+7jRanbm/npEUTEOf7B&#10;cNFndajZqfEHMkEMnFdpxqiCh1UB4gIk62UKouFJXoCsK/n/hfoXAAD//wMAUEsBAi0AFAAGAAgA&#10;AAAhALaDOJL+AAAA4QEAABMAAAAAAAAAAAAAAAAAAAAAAFtDb250ZW50X1R5cGVzXS54bWxQSwEC&#10;LQAUAAYACAAAACEAOP0h/9YAAACUAQAACwAAAAAAAAAAAAAAAAAvAQAAX3JlbHMvLnJlbHNQSwEC&#10;LQAUAAYACAAAACEA829W2yACAAC9BAAADgAAAAAAAAAAAAAAAAAuAgAAZHJzL2Uyb0RvYy54bWxQ&#10;SwECLQAUAAYACAAAACEA/Deke94AAAAKAQAADwAAAAAAAAAAAAAAAAB6BAAAZHJzL2Rvd25yZXYu&#10;eG1sUEsFBgAAAAAEAAQA8wAAAIUFAAAAAA==&#10;" path="m5981065,l,,,6096r5981065,l5981065,xe" fillcolor="#2d75b6" stroked="f">
+            <v:shape w14:anchorId="723EEC69" id="Graphic 1" o:spid="_x0000_s1026" style="position:absolute;margin-left:70.6pt;margin-top:47.3pt;width:470.95pt;height:.5pt;z-index:-15901696;visibility:visible;mso-wrap-style:square;mso-wrap-distance-left:0;mso-wrap-distance-top:0;mso-wrap-distance-right:0;mso-wrap-distance-bottom:0;mso-position-horizontal:absolute;mso-position-horizontal-relative:page;mso-position-vertical:absolute;mso-position-vertical-relative:page;v-text-anchor:top" coordsize="5981065,6350" o:gfxdata="UEsDBBQABgAIAAAAIQC2gziS/gAAAOEBAAATAAAAW0NvbnRlbnRfVHlwZXNdLnhtbJSRQU7DMBBF&#10;90jcwfIWJU67QAgl6YK0S0CoHGBkTxKLZGx5TGhvj5O2G0SRWNoz/78nu9wcxkFMGNg6quQqL6RA&#10;0s5Y6ir5vt9lD1JwBDIwOMJKHpHlpr69KfdHjyxSmriSfYz+USnWPY7AufNIadK6MEJMx9ApD/oD&#10;OlTrorhX2lFEilmcO2RdNtjC5xDF9pCuTyYBB5bi6bQ4syoJ3g9WQ0ymaiLzg5KdCXlKLjvcW893&#10;SUOqXwnz5DrgnHtJTxOsQfEKIT7DmDSUCaxw7Rqn8787ZsmRM9e2VmPeBN4uqYvTtW7jvijg9N/y&#10;JsXecLq0q+WD6m8AAAD//wMAUEsDBBQABgAIAAAAIQA4/SH/1gAAAJQBAAALAAAAX3JlbHMvLnJl&#10;bHOkkMFqwzAMhu+DvYPRfXGawxijTi+j0GvpHsDYimMaW0Yy2fr2M4PBMnrbUb/Q94l/f/hMi1qR&#10;JVI2sOt6UJgd+ZiDgffL8ekFlFSbvV0oo4EbChzGx4f9GRdb25HMsYhqlCwG5lrLq9biZkxWOiqY&#10;22YiTra2kYMu1l1tQD30/bPm3wwYN0x18gb45AdQl1tp5j/sFB2T0FQ7R0nTNEV3j6o9feQzro1i&#10;OWA14Fm+Q8a1a8+Bvu/d/dMb2JY5uiPbhG/ktn4cqGU/er3pcvwCAAD//wMAUEsDBBQABgAIAAAA&#10;IQDzb1bbIAIAAL0EAAAOAAAAZHJzL2Uyb0RvYy54bWysVMFu2zAMvQ/YPwi6L3YyJGuNOMXWoMOA&#10;oivQDDsrshwbk0VNVOLk70fJkWtspw27SJT5RD0+kl7fnTvNTsphC6bk81nOmTISqtYcSv5t9/Du&#10;hjP0wlRCg1Elvyjkd5u3b9a9LdQCGtCVcoyCGCx6W/LGe1tkGcpGdQJnYJUhZw2uE56O7pBVTvQU&#10;vdPZIs9XWQ+usg6kQqSv28HJNzF+XSvpv9Y1Ks90yYmbj6uL6z6s2WYtioMTtmnllYb4BxadaA09&#10;OobaCi/Y0bV/hOpa6QCh9jMJXQZ13UoVc6Bs5vlv2bw0wqqYC4mDdpQJ/19Y+XR6sc8uUEf7CPIH&#10;kiJZb7EYPeGAV8y5dl3AEnF2jipeRhXV2TNJH5e3N/N8teRMkm/1fhlFzkSR7soj+s8KYhxxekQ/&#10;1KBKlmiSJc8mmY4qGWqoYw09Z1RDxxnVcD/U0Aof7gVywWT9hEhz5RGcHZzUDiLMhxRGtikRYvqK&#10;0WaKpQaaoJIv7TbGGzCr/HYVeFGw5E77AJs++1fgpGYKJzWgGl4KeccnRy3o+anaCLqtHlqtQ/ro&#10;Dvt77dhJkKyL7Yflp8R4AoudMBQ/tMEeqsuzYz3NS8nx51E4xZn+Yqghw3AlwyVjnwzn9T3EEYzK&#10;O/S783fhLLNkltxT7zxBandRpLYg/gEwYMNNAx+PHuo29EzkNjC6HmhGYv7XeQ5DOD1H1OtfZ/ML&#10;AAD//wMAUEsDBBQABgAIAAAAIQD8N6R73gAAAAoBAAAPAAAAZHJzL2Rvd25yZXYueG1sTI/BTsMw&#10;DIbvSLxDZCQuiKXt1mqUphNCmiaODDhwSxvTVDROabKte3u8Exx/+9Pvz9VmdoM44hR6TwrSRQIC&#10;qfWmp07B+9v2fg0iRE1GD55QwRkDbOrrq0qXxp/oFY/72AkuoVBqBTbGsZQytBadDgs/IvHuy09O&#10;R45TJ82kT1zuBpklSSGd7okvWD3is8X2e39wCortD56XeXPnc5vpnZ8/4+7jRanbm/npEUTEOf7B&#10;cNFndajZqfEHMkEMnFdpxqiCh1UB4gIk62UKouFJXoCsK/n/hfoXAAD//wMAUEsBAi0AFAAGAAgA&#10;AAAhALaDOJL+AAAA4QEAABMAAAAAAAAAAAAAAAAAAAAAAFtDb250ZW50X1R5cGVzXS54bWxQSwEC&#10;LQAUAAYACAAAACEAOP0h/9YAAACUAQAACwAAAAAAAAAAAAAAAAAvAQAAX3JlbHMvLnJlbHNQSwEC&#10;LQAUAAYACAAAACEA829W2yACAAC9BAAADgAAAAAAAAAAAAAAAAAuAgAAZHJzL2Uyb0RvYy54bWxQ&#10;SwECLQAUAAYACAAAACEA/Deke94AAAAKAQAADwAAAAAAAAAAAAAAAAB6BAAAZHJzL2Rvd25yZXYu&#10;eG1sUEsFBgAAAAAEAAQA8wAAAIUFAAAAAA==&#10;" path="m5981065,l,,,6096r5981065,l5981065,xe" fillcolor="#2d75b6" stroked="f">
               <v:path arrowok="t"/>
               <w10:wrap anchorx="page" anchory="page"/>
             </v:shape>

</xml_diff>